<commit_message>
Fix print invoice solo and polite WhatsApp greetings
</commit_message>
<xml_diff>
--- a/MANUAL DE USUARIO - APP PUJOLS SERVICIOS.docx
+++ b/MANUAL DE USUARIO - APP PUJOLS SERVICIOS.docx
@@ -66,8 +66,8 @@
           <w:sz w:val="24"/>
           <w:szCs w:val="24"/>
         </w:rPr>
-        <w:pict w14:anchorId="113DEFC5">
-          <v:rect id="_x0000_i1276" style="width:468pt;height:.75pt" o:hralign="center" o:hrstd="t" o:hr="t" fillcolor="#a0a0a0" stroked="f"/>
+        <w:pict w14:anchorId="396F044B">
+          <v:rect id="_x0000_i1339" style="width:468pt;height:.75pt" o:hralign="center" o:hrstd="t" o:hr="t" fillcolor="#a0a0a0" stroked="f"/>
         </w:pict>
       </w:r>
     </w:p>
@@ -169,7 +169,7 @@
           <w:sz w:val="24"/>
           <w:szCs w:val="24"/>
         </w:rPr>
-        <w:t>Enlace de acceso directo:</w:t>
+        <w:t>Enlace Oficial Permanente en GitHub:</w:t>
       </w:r>
       <w:r>
         <w:rPr>
@@ -189,7 +189,29 @@
             <w:sz w:val="24"/>
             <w:szCs w:val="24"/>
           </w:rPr>
-          <w:t>https://983a20dd11af9e6b-148-255-195-56.serveousercontent.com</w:t>
+          <w:t>https://jho</w:t>
+        </w:r>
+        <w:r>
+          <w:rPr>
+            <w:rStyle w:val="Hipervnculo"/>
+            <w:rFonts w:ascii="Times New Roman" w:hAnsi="Times New Roman" w:cs="Times New Roman"/>
+            <w:b/>
+            <w:bCs/>
+            <w:sz w:val="24"/>
+            <w:szCs w:val="24"/>
+          </w:rPr>
+          <w:t>e</w:t>
+        </w:r>
+        <w:r>
+          <w:rPr>
+            <w:rStyle w:val="Hipervnculo"/>
+            <w:rFonts w:ascii="Times New Roman" w:hAnsi="Times New Roman" w:cs="Times New Roman"/>
+            <w:b/>
+            <w:bCs/>
+            <w:sz w:val="24"/>
+            <w:szCs w:val="24"/>
+          </w:rPr>
+          <w:t>lpeguero68-star.github.io/pujols-servicios/</w:t>
         </w:r>
       </w:hyperlink>
     </w:p>
@@ -248,8 +270,8 @@
           <w:sz w:val="24"/>
           <w:szCs w:val="24"/>
         </w:rPr>
-        <w:pict w14:anchorId="1024011B">
-          <v:rect id="_x0000_i1277" style="width:468pt;height:.75pt" o:hralign="center" o:hrstd="t" o:hr="t" fillcolor="#a0a0a0" stroked="f"/>
+        <w:pict w14:anchorId="73047F8B">
+          <v:rect id="_x0000_i1340" style="width:468pt;height:.75pt" o:hralign="center" o:hrstd="t" o:hr="t" fillcolor="#a0a0a0" stroked="f"/>
         </w:pict>
       </w:r>
     </w:p>
@@ -366,7 +388,7 @@
       <w:pPr>
         <w:numPr>
           <w:ilvl w:val="0"/>
-          <w:numId w:val="18"/>
+          <w:numId w:val="25"/>
         </w:numPr>
         <w:rPr>
           <w:rFonts w:ascii="Times New Roman" w:hAnsi="Times New Roman" w:cs="Times New Roman"/>
@@ -387,7 +409,7 @@
       <w:pPr>
         <w:numPr>
           <w:ilvl w:val="0"/>
-          <w:numId w:val="18"/>
+          <w:numId w:val="25"/>
         </w:numPr>
         <w:rPr>
           <w:rFonts w:ascii="Times New Roman" w:hAnsi="Times New Roman" w:cs="Times New Roman"/>
@@ -426,7 +448,7 @@
       <w:pPr>
         <w:numPr>
           <w:ilvl w:val="0"/>
-          <w:numId w:val="18"/>
+          <w:numId w:val="25"/>
         </w:numPr>
         <w:rPr>
           <w:rFonts w:ascii="Times New Roman" w:hAnsi="Times New Roman" w:cs="Times New Roman"/>
@@ -483,7 +505,7 @@
       <w:pPr>
         <w:numPr>
           <w:ilvl w:val="0"/>
-          <w:numId w:val="18"/>
+          <w:numId w:val="25"/>
         </w:numPr>
         <w:rPr>
           <w:rFonts w:ascii="Times New Roman" w:hAnsi="Times New Roman" w:cs="Times New Roman"/>
@@ -522,7 +544,7 @@
       <w:pPr>
         <w:numPr>
           <w:ilvl w:val="0"/>
-          <w:numId w:val="18"/>
+          <w:numId w:val="25"/>
         </w:numPr>
         <w:rPr>
           <w:rFonts w:ascii="Times New Roman" w:hAnsi="Times New Roman" w:cs="Times New Roman"/>
@@ -582,7 +604,7 @@
       <w:pPr>
         <w:numPr>
           <w:ilvl w:val="0"/>
-          <w:numId w:val="19"/>
+          <w:numId w:val="26"/>
         </w:numPr>
         <w:rPr>
           <w:rFonts w:ascii="Times New Roman" w:hAnsi="Times New Roman" w:cs="Times New Roman"/>
@@ -621,7 +643,7 @@
       <w:pPr>
         <w:numPr>
           <w:ilvl w:val="0"/>
-          <w:numId w:val="19"/>
+          <w:numId w:val="26"/>
         </w:numPr>
         <w:rPr>
           <w:rFonts w:ascii="Times New Roman" w:hAnsi="Times New Roman" w:cs="Times New Roman"/>
@@ -660,7 +682,7 @@
       <w:pPr>
         <w:numPr>
           <w:ilvl w:val="0"/>
-          <w:numId w:val="19"/>
+          <w:numId w:val="26"/>
         </w:numPr>
         <w:rPr>
           <w:rFonts w:ascii="Times New Roman" w:hAnsi="Times New Roman" w:cs="Times New Roman"/>
@@ -753,7 +775,7 @@
       <w:pPr>
         <w:numPr>
           <w:ilvl w:val="0"/>
-          <w:numId w:val="19"/>
+          <w:numId w:val="26"/>
         </w:numPr>
         <w:rPr>
           <w:rFonts w:ascii="Times New Roman" w:hAnsi="Times New Roman" w:cs="Times New Roman"/>
@@ -792,7 +814,7 @@
       <w:pPr>
         <w:numPr>
           <w:ilvl w:val="0"/>
-          <w:numId w:val="19"/>
+          <w:numId w:val="26"/>
         </w:numPr>
         <w:rPr>
           <w:rFonts w:ascii="Times New Roman" w:hAnsi="Times New Roman" w:cs="Times New Roman"/>
@@ -817,60 +839,222 @@
           <w:szCs w:val="24"/>
         </w:rPr>
       </w:pPr>
+      <w:r>
+        <w:rPr>
+          <w:rFonts w:ascii="Times New Roman" w:hAnsi="Times New Roman" w:cs="Times New Roman"/>
+          <w:sz w:val="24"/>
+          <w:szCs w:val="24"/>
+        </w:rPr>
+        <w:pict w14:anchorId="0E9DF095">
+          <v:rect id="_x0000_i1341" style="width:6in;height:.75pt" o:hralign="center" o:hrstd="t" o:hr="t" fillcolor="#a0a0a0" stroked="f"/>
+        </w:pict>
+      </w:r>
     </w:p>
     <w:p>
       <w:pPr>
         <w:rPr>
           <w:rFonts w:ascii="Times New Roman" w:hAnsi="Times New Roman" w:cs="Times New Roman"/>
-          <w:sz w:val="24"/>
-          <w:szCs w:val="24"/>
-        </w:rPr>
-      </w:pPr>
+          <w:b/>
+          <w:bCs/>
+          <w:sz w:val="24"/>
+          <w:szCs w:val="24"/>
+        </w:rPr>
+      </w:pPr>
+      <w:r>
+        <w:rPr>
+          <w:rFonts w:ascii="Segoe UI Emoji" w:hAnsi="Segoe UI Emoji" w:cs="Segoe UI Emoji"/>
+          <w:b/>
+          <w:bCs/>
+          <w:sz w:val="24"/>
+          <w:szCs w:val="24"/>
+        </w:rPr>
+        <w:t>⚙️</w:t>
+      </w:r>
+      <w:r>
+        <w:rPr>
+          <w:rFonts w:ascii="Times New Roman" w:hAnsi="Times New Roman" w:cs="Times New Roman"/>
+          <w:b/>
+          <w:bCs/>
+          <w:sz w:val="24"/>
+          <w:szCs w:val="24"/>
+        </w:rPr>
+        <w:t xml:space="preserve"> 3. Configuración Inicial (Correo Google y WhatsApp)</w:t>
+      </w:r>
     </w:p>
     <w:p>
       <w:pPr>
-        <w:rPr>
-          <w:rFonts w:ascii="Times New Roman" w:hAnsi="Times New Roman" w:cs="Times New Roman"/>
-          <w:sz w:val="24"/>
-          <w:szCs w:val="24"/>
-        </w:rPr>
-      </w:pPr>
+        <w:numPr>
+          <w:ilvl w:val="0"/>
+          <w:numId w:val="27"/>
+        </w:numPr>
+        <w:rPr>
+          <w:rFonts w:ascii="Times New Roman" w:hAnsi="Times New Roman" w:cs="Times New Roman"/>
+          <w:sz w:val="24"/>
+          <w:szCs w:val="24"/>
+        </w:rPr>
+      </w:pPr>
+      <w:r>
+        <w:rPr>
+          <w:rFonts w:ascii="Times New Roman" w:hAnsi="Times New Roman" w:cs="Times New Roman"/>
+          <w:sz w:val="24"/>
+          <w:szCs w:val="24"/>
+        </w:rPr>
+        <w:t xml:space="preserve">En el menú inferior o lateral, entra a </w:t>
+      </w:r>
+      <w:r>
+        <w:rPr>
+          <w:rFonts w:ascii="Times New Roman" w:hAnsi="Times New Roman" w:cs="Times New Roman"/>
+          <w:b/>
+          <w:bCs/>
+          <w:sz w:val="24"/>
+          <w:szCs w:val="24"/>
+        </w:rPr>
+        <w:t>Configuración</w:t>
+      </w:r>
+      <w:r>
+        <w:rPr>
+          <w:rFonts w:ascii="Times New Roman" w:hAnsi="Times New Roman" w:cs="Times New Roman"/>
+          <w:sz w:val="24"/>
+          <w:szCs w:val="24"/>
+        </w:rPr>
+        <w:t xml:space="preserve"> (icono de engranaje).</w:t>
+      </w:r>
     </w:p>
     <w:p>
       <w:pPr>
-        <w:rPr>
-          <w:rFonts w:ascii="Times New Roman" w:hAnsi="Times New Roman" w:cs="Times New Roman"/>
-          <w:sz w:val="24"/>
-          <w:szCs w:val="24"/>
-        </w:rPr>
-      </w:pPr>
+        <w:numPr>
+          <w:ilvl w:val="0"/>
+          <w:numId w:val="27"/>
+        </w:numPr>
+        <w:rPr>
+          <w:rFonts w:ascii="Times New Roman" w:hAnsi="Times New Roman" w:cs="Times New Roman"/>
+          <w:sz w:val="24"/>
+          <w:szCs w:val="24"/>
+        </w:rPr>
+      </w:pPr>
+      <w:r>
+        <w:rPr>
+          <w:rFonts w:ascii="Times New Roman" w:hAnsi="Times New Roman" w:cs="Times New Roman"/>
+          <w:sz w:val="24"/>
+          <w:szCs w:val="24"/>
+        </w:rPr>
+        <w:lastRenderedPageBreak/>
+        <w:t xml:space="preserve">En la sección </w:t>
+      </w:r>
+      <w:r>
+        <w:rPr>
+          <w:rFonts w:ascii="Times New Roman" w:hAnsi="Times New Roman" w:cs="Times New Roman"/>
+          <w:b/>
+          <w:bCs/>
+          <w:sz w:val="24"/>
+          <w:szCs w:val="24"/>
+        </w:rPr>
+        <w:t>Mi empresa</w:t>
+      </w:r>
+      <w:r>
+        <w:rPr>
+          <w:rFonts w:ascii="Times New Roman" w:hAnsi="Times New Roman" w:cs="Times New Roman"/>
+          <w:sz w:val="24"/>
+          <w:szCs w:val="24"/>
+        </w:rPr>
+        <w:t xml:space="preserve">, busca </w:t>
+      </w:r>
+      <w:r>
+        <w:rPr>
+          <w:rFonts w:ascii="Times New Roman" w:hAnsi="Times New Roman" w:cs="Times New Roman"/>
+          <w:b/>
+          <w:bCs/>
+          <w:sz w:val="24"/>
+          <w:szCs w:val="24"/>
+        </w:rPr>
+        <w:t xml:space="preserve">Google </w:t>
+      </w:r>
+      <w:proofErr w:type="spellStart"/>
+      <w:r>
+        <w:rPr>
+          <w:rFonts w:ascii="Times New Roman" w:hAnsi="Times New Roman" w:cs="Times New Roman"/>
+          <w:b/>
+          <w:bCs/>
+          <w:sz w:val="24"/>
+          <w:szCs w:val="24"/>
+        </w:rPr>
+        <w:t>Sheets</w:t>
+      </w:r>
+      <w:proofErr w:type="spellEnd"/>
+      <w:r>
+        <w:rPr>
+          <w:rFonts w:ascii="Times New Roman" w:hAnsi="Times New Roman" w:cs="Times New Roman"/>
+          <w:sz w:val="24"/>
+          <w:szCs w:val="24"/>
+        </w:rPr>
+        <w:t xml:space="preserve"> o </w:t>
+      </w:r>
+      <w:r>
+        <w:rPr>
+          <w:rFonts w:ascii="Times New Roman" w:hAnsi="Times New Roman" w:cs="Times New Roman"/>
+          <w:b/>
+          <w:bCs/>
+          <w:sz w:val="24"/>
+          <w:szCs w:val="24"/>
+        </w:rPr>
+        <w:t>Google Drive</w:t>
+      </w:r>
+      <w:r>
+        <w:rPr>
+          <w:rFonts w:ascii="Times New Roman" w:hAnsi="Times New Roman" w:cs="Times New Roman"/>
+          <w:sz w:val="24"/>
+          <w:szCs w:val="24"/>
+        </w:rPr>
+        <w:t xml:space="preserve"> y pulsa </w:t>
+      </w:r>
+      <w:r>
+        <w:rPr>
+          <w:rFonts w:ascii="Times New Roman" w:hAnsi="Times New Roman" w:cs="Times New Roman"/>
+          <w:b/>
+          <w:bCs/>
+          <w:sz w:val="24"/>
+          <w:szCs w:val="24"/>
+        </w:rPr>
+        <w:t>«Configurar»</w:t>
+      </w:r>
+      <w:r>
+        <w:rPr>
+          <w:rFonts w:ascii="Times New Roman" w:hAnsi="Times New Roman" w:cs="Times New Roman"/>
+          <w:sz w:val="24"/>
+          <w:szCs w:val="24"/>
+        </w:rPr>
+        <w:t>.</w:t>
+      </w:r>
     </w:p>
     <w:p>
       <w:pPr>
-        <w:rPr>
-          <w:rFonts w:ascii="Times New Roman" w:hAnsi="Times New Roman" w:cs="Times New Roman"/>
-          <w:sz w:val="24"/>
-          <w:szCs w:val="24"/>
-        </w:rPr>
-      </w:pPr>
-      <w:r>
-        <w:rPr>
-          <w:rFonts w:ascii="Times New Roman" w:hAnsi="Times New Roman" w:cs="Times New Roman"/>
-          <w:sz w:val="24"/>
-          <w:szCs w:val="24"/>
-        </w:rPr>
-        <w:lastRenderedPageBreak/>
-        <w:pict w14:anchorId="504B268D">
-          <v:rect id="_x0000_i1278" style="width:6in;height:.75pt" o:hralign="center" o:hrstd="t" o:hr="t" fillcolor="#a0a0a0" stroked="f"/>
-        </w:pict>
+        <w:numPr>
+          <w:ilvl w:val="0"/>
+          <w:numId w:val="27"/>
+        </w:numPr>
+        <w:rPr>
+          <w:rFonts w:ascii="Times New Roman" w:hAnsi="Times New Roman" w:cs="Times New Roman"/>
+          <w:sz w:val="24"/>
+          <w:szCs w:val="24"/>
+        </w:rPr>
+      </w:pPr>
+      <w:r>
+        <w:rPr>
+          <w:rFonts w:ascii="Times New Roman" w:hAnsi="Times New Roman" w:cs="Times New Roman"/>
+          <w:sz w:val="24"/>
+          <w:szCs w:val="24"/>
+        </w:rPr>
+        <w:t xml:space="preserve">Se abrirá la ventana donde podrás ingresar: </w:t>
       </w:r>
     </w:p>
     <w:p>
       <w:pPr>
-        <w:rPr>
-          <w:rFonts w:ascii="Times New Roman" w:hAnsi="Times New Roman" w:cs="Times New Roman"/>
-          <w:b/>
-          <w:bCs/>
+        <w:numPr>
+          <w:ilvl w:val="1"/>
+          <w:numId w:val="27"/>
+        </w:numPr>
+        <w:rPr>
+          <w:rFonts w:ascii="Times New Roman" w:hAnsi="Times New Roman" w:cs="Times New Roman"/>
           <w:sz w:val="24"/>
           <w:szCs w:val="24"/>
         </w:rPr>
@@ -883,24 +1067,32 @@
           <w:sz w:val="24"/>
           <w:szCs w:val="24"/>
         </w:rPr>
-        <w:t>⚙️</w:t>
-      </w:r>
-      <w:r>
-        <w:rPr>
-          <w:rFonts w:ascii="Times New Roman" w:hAnsi="Times New Roman" w:cs="Times New Roman"/>
-          <w:b/>
-          <w:bCs/>
-          <w:sz w:val="24"/>
-          <w:szCs w:val="24"/>
-        </w:rPr>
-        <w:t xml:space="preserve"> 3. Configuración Inicial (Correo Google y WhatsApp)</w:t>
+        <w:t>📧</w:t>
+      </w:r>
+      <w:r>
+        <w:rPr>
+          <w:rFonts w:ascii="Times New Roman" w:hAnsi="Times New Roman" w:cs="Times New Roman"/>
+          <w:b/>
+          <w:bCs/>
+          <w:sz w:val="24"/>
+          <w:szCs w:val="24"/>
+        </w:rPr>
+        <w:t xml:space="preserve"> Correo Gmail:</w:t>
+      </w:r>
+      <w:r>
+        <w:rPr>
+          <w:rFonts w:ascii="Times New Roman" w:hAnsi="Times New Roman" w:cs="Times New Roman"/>
+          <w:sz w:val="24"/>
+          <w:szCs w:val="24"/>
+        </w:rPr>
+        <w:t xml:space="preserve"> Tu cuenta de Google para respaldos en la nube.</w:t>
       </w:r>
     </w:p>
     <w:p>
       <w:pPr>
         <w:numPr>
-          <w:ilvl w:val="0"/>
-          <w:numId w:val="20"/>
+          <w:ilvl w:val="1"/>
+          <w:numId w:val="27"/>
         </w:numPr>
         <w:rPr>
           <w:rFonts w:ascii="Times New Roman" w:hAnsi="Times New Roman" w:cs="Times New Roman"/>
@@ -910,36 +1102,38 @@
       </w:pPr>
       <w:r>
         <w:rPr>
-          <w:rFonts w:ascii="Times New Roman" w:hAnsi="Times New Roman" w:cs="Times New Roman"/>
-          <w:sz w:val="24"/>
-          <w:szCs w:val="24"/>
-        </w:rPr>
-        <w:t xml:space="preserve">En el menú inferior o lateral, entra a </w:t>
-      </w:r>
-      <w:r>
-        <w:rPr>
-          <w:rFonts w:ascii="Times New Roman" w:hAnsi="Times New Roman" w:cs="Times New Roman"/>
-          <w:b/>
-          <w:bCs/>
-          <w:sz w:val="24"/>
-          <w:szCs w:val="24"/>
-        </w:rPr>
-        <w:t>Configuración</w:t>
-      </w:r>
-      <w:r>
-        <w:rPr>
-          <w:rFonts w:ascii="Times New Roman" w:hAnsi="Times New Roman" w:cs="Times New Roman"/>
-          <w:sz w:val="24"/>
-          <w:szCs w:val="24"/>
-        </w:rPr>
-        <w:t xml:space="preserve"> (icono de engranaje).</w:t>
+          <w:rFonts w:ascii="Segoe UI Emoji" w:hAnsi="Segoe UI Emoji" w:cs="Segoe UI Emoji"/>
+          <w:b/>
+          <w:bCs/>
+          <w:sz w:val="24"/>
+          <w:szCs w:val="24"/>
+        </w:rPr>
+        <w:t>📱</w:t>
+      </w:r>
+      <w:r>
+        <w:rPr>
+          <w:rFonts w:ascii="Times New Roman" w:hAnsi="Times New Roman" w:cs="Times New Roman"/>
+          <w:b/>
+          <w:bCs/>
+          <w:sz w:val="24"/>
+          <w:szCs w:val="24"/>
+        </w:rPr>
+        <w:t xml:space="preserve"> Número de WhatsApp:</w:t>
+      </w:r>
+      <w:r>
+        <w:rPr>
+          <w:rFonts w:ascii="Times New Roman" w:hAnsi="Times New Roman" w:cs="Times New Roman"/>
+          <w:sz w:val="24"/>
+          <w:szCs w:val="24"/>
+        </w:rPr>
+        <w:t xml:space="preserve"> Tu número telefónico comercial con código de área (ej. 8095550100).</w:t>
       </w:r>
     </w:p>
     <w:p>
       <w:pPr>
         <w:numPr>
-          <w:ilvl w:val="0"/>
-          <w:numId w:val="20"/>
+          <w:ilvl w:val="1"/>
+          <w:numId w:val="27"/>
         </w:numPr>
         <w:rPr>
           <w:rFonts w:ascii="Times New Roman" w:hAnsi="Times New Roman" w:cs="Times New Roman"/>
@@ -949,39 +1143,23 @@
       </w:pPr>
       <w:r>
         <w:rPr>
-          <w:rFonts w:ascii="Times New Roman" w:hAnsi="Times New Roman" w:cs="Times New Roman"/>
-          <w:sz w:val="24"/>
-          <w:szCs w:val="24"/>
-        </w:rPr>
-        <w:t xml:space="preserve">En la sección </w:t>
-      </w:r>
-      <w:r>
-        <w:rPr>
-          <w:rFonts w:ascii="Times New Roman" w:hAnsi="Times New Roman" w:cs="Times New Roman"/>
-          <w:b/>
-          <w:bCs/>
-          <w:sz w:val="24"/>
-          <w:szCs w:val="24"/>
-        </w:rPr>
-        <w:t>Mi empresa</w:t>
-      </w:r>
-      <w:r>
-        <w:rPr>
-          <w:rFonts w:ascii="Times New Roman" w:hAnsi="Times New Roman" w:cs="Times New Roman"/>
-          <w:sz w:val="24"/>
-          <w:szCs w:val="24"/>
-        </w:rPr>
-        <w:t xml:space="preserve">, busca </w:t>
-      </w:r>
-      <w:r>
-        <w:rPr>
-          <w:rFonts w:ascii="Times New Roman" w:hAnsi="Times New Roman" w:cs="Times New Roman"/>
-          <w:b/>
-          <w:bCs/>
-          <w:sz w:val="24"/>
-          <w:szCs w:val="24"/>
-        </w:rPr>
-        <w:t xml:space="preserve">Google </w:t>
+          <w:rFonts w:ascii="Segoe UI Emoji" w:hAnsi="Segoe UI Emoji" w:cs="Segoe UI Emoji"/>
+          <w:b/>
+          <w:bCs/>
+          <w:sz w:val="24"/>
+          <w:szCs w:val="24"/>
+        </w:rPr>
+        <w:t>📊</w:t>
+      </w:r>
+      <w:r>
+        <w:rPr>
+          <w:rFonts w:ascii="Times New Roman" w:hAnsi="Times New Roman" w:cs="Times New Roman"/>
+          <w:b/>
+          <w:bCs/>
+          <w:sz w:val="24"/>
+          <w:szCs w:val="24"/>
+        </w:rPr>
+        <w:t xml:space="preserve"> Enlace de Google </w:t>
       </w:r>
       <w:proofErr w:type="spellStart"/>
       <w:r>
@@ -998,53 +1176,27 @@
       <w:r>
         <w:rPr>
           <w:rFonts w:ascii="Times New Roman" w:hAnsi="Times New Roman" w:cs="Times New Roman"/>
-          <w:sz w:val="24"/>
-          <w:szCs w:val="24"/>
-        </w:rPr>
-        <w:t xml:space="preserve"> o </w:t>
-      </w:r>
-      <w:r>
-        <w:rPr>
-          <w:rFonts w:ascii="Times New Roman" w:hAnsi="Times New Roman" w:cs="Times New Roman"/>
-          <w:b/>
-          <w:bCs/>
-          <w:sz w:val="24"/>
-          <w:szCs w:val="24"/>
-        </w:rPr>
-        <w:t>Google Drive</w:t>
-      </w:r>
-      <w:r>
-        <w:rPr>
-          <w:rFonts w:ascii="Times New Roman" w:hAnsi="Times New Roman" w:cs="Times New Roman"/>
-          <w:sz w:val="24"/>
-          <w:szCs w:val="24"/>
-        </w:rPr>
-        <w:t xml:space="preserve"> y pulsa </w:t>
-      </w:r>
-      <w:r>
-        <w:rPr>
-          <w:rFonts w:ascii="Times New Roman" w:hAnsi="Times New Roman" w:cs="Times New Roman"/>
-          <w:b/>
-          <w:bCs/>
-          <w:sz w:val="24"/>
-          <w:szCs w:val="24"/>
-        </w:rPr>
-        <w:t>«Configurar»</w:t>
-      </w:r>
-      <w:r>
-        <w:rPr>
-          <w:rFonts w:ascii="Times New Roman" w:hAnsi="Times New Roman" w:cs="Times New Roman"/>
-          <w:sz w:val="24"/>
-          <w:szCs w:val="24"/>
-        </w:rPr>
-        <w:t>.</w:t>
+          <w:b/>
+          <w:bCs/>
+          <w:sz w:val="24"/>
+          <w:szCs w:val="24"/>
+        </w:rPr>
+        <w:t>:</w:t>
+      </w:r>
+      <w:r>
+        <w:rPr>
+          <w:rFonts w:ascii="Times New Roman" w:hAnsi="Times New Roman" w:cs="Times New Roman"/>
+          <w:sz w:val="24"/>
+          <w:szCs w:val="24"/>
+        </w:rPr>
+        <w:t xml:space="preserve"> Hoja de cálculo donde se almacenará la información.</w:t>
       </w:r>
     </w:p>
     <w:p>
       <w:pPr>
         <w:numPr>
-          <w:ilvl w:val="0"/>
-          <w:numId w:val="20"/>
+          <w:ilvl w:val="1"/>
+          <w:numId w:val="27"/>
         </w:numPr>
         <w:rPr>
           <w:rFonts w:ascii="Times New Roman" w:hAnsi="Times New Roman" w:cs="Times New Roman"/>
@@ -1054,18 +1206,38 @@
       </w:pPr>
       <w:r>
         <w:rPr>
-          <w:rFonts w:ascii="Times New Roman" w:hAnsi="Times New Roman" w:cs="Times New Roman"/>
-          <w:sz w:val="24"/>
-          <w:szCs w:val="24"/>
-        </w:rPr>
-        <w:t xml:space="preserve">Se abrirá la ventana donde podrás ingresar: </w:t>
+          <w:rFonts w:ascii="Segoe UI Emoji" w:hAnsi="Segoe UI Emoji" w:cs="Segoe UI Emoji"/>
+          <w:b/>
+          <w:bCs/>
+          <w:sz w:val="24"/>
+          <w:szCs w:val="24"/>
+        </w:rPr>
+        <w:t>📁</w:t>
+      </w:r>
+      <w:r>
+        <w:rPr>
+          <w:rFonts w:ascii="Times New Roman" w:hAnsi="Times New Roman" w:cs="Times New Roman"/>
+          <w:b/>
+          <w:bCs/>
+          <w:sz w:val="24"/>
+          <w:szCs w:val="24"/>
+        </w:rPr>
+        <w:t xml:space="preserve"> Enlace de Google Drive:</w:t>
+      </w:r>
+      <w:r>
+        <w:rPr>
+          <w:rFonts w:ascii="Times New Roman" w:hAnsi="Times New Roman" w:cs="Times New Roman"/>
+          <w:sz w:val="24"/>
+          <w:szCs w:val="24"/>
+        </w:rPr>
+        <w:t xml:space="preserve"> Carpeta donde se archivarán los comprobantes y facturas PDF.</w:t>
       </w:r>
     </w:p>
     <w:p>
       <w:pPr>
         <w:numPr>
-          <w:ilvl w:val="1"/>
-          <w:numId w:val="20"/>
+          <w:ilvl w:val="0"/>
+          <w:numId w:val="27"/>
         </w:numPr>
         <w:rPr>
           <w:rFonts w:ascii="Times New Roman" w:hAnsi="Times New Roman" w:cs="Times New Roman"/>
@@ -1075,38 +1247,419 @@
       </w:pPr>
       <w:r>
         <w:rPr>
+          <w:rFonts w:ascii="Times New Roman" w:hAnsi="Times New Roman" w:cs="Times New Roman"/>
+          <w:sz w:val="24"/>
+          <w:szCs w:val="24"/>
+        </w:rPr>
+        <w:t xml:space="preserve">Presiona </w:t>
+      </w:r>
+      <w:r>
+        <w:rPr>
+          <w:rFonts w:ascii="Times New Roman" w:hAnsi="Times New Roman" w:cs="Times New Roman"/>
+          <w:b/>
+          <w:bCs/>
+          <w:sz w:val="24"/>
+          <w:szCs w:val="24"/>
+        </w:rPr>
+        <w:t>«</w:t>
+      </w:r>
+      <w:r>
+        <w:rPr>
           <w:rFonts w:ascii="Segoe UI Emoji" w:hAnsi="Segoe UI Emoji" w:cs="Segoe UI Emoji"/>
           <w:b/>
           <w:bCs/>
           <w:sz w:val="24"/>
           <w:szCs w:val="24"/>
         </w:rPr>
-        <w:t>📧</w:t>
-      </w:r>
-      <w:r>
-        <w:rPr>
-          <w:rFonts w:ascii="Times New Roman" w:hAnsi="Times New Roman" w:cs="Times New Roman"/>
-          <w:b/>
-          <w:bCs/>
-          <w:sz w:val="24"/>
-          <w:szCs w:val="24"/>
-        </w:rPr>
-        <w:t xml:space="preserve"> Correo Gmail:</w:t>
-      </w:r>
-      <w:r>
-        <w:rPr>
-          <w:rFonts w:ascii="Times New Roman" w:hAnsi="Times New Roman" w:cs="Times New Roman"/>
-          <w:sz w:val="24"/>
-          <w:szCs w:val="24"/>
-        </w:rPr>
-        <w:t xml:space="preserve"> Tu cuenta de Google para respaldos en la nube.</w:t>
+        <w:t>💾</w:t>
+      </w:r>
+      <w:r>
+        <w:rPr>
+          <w:rFonts w:ascii="Times New Roman" w:hAnsi="Times New Roman" w:cs="Times New Roman"/>
+          <w:b/>
+          <w:bCs/>
+          <w:sz w:val="24"/>
+          <w:szCs w:val="24"/>
+        </w:rPr>
+        <w:t xml:space="preserve"> Guardar configuración»</w:t>
+      </w:r>
+      <w:r>
+        <w:rPr>
+          <w:rFonts w:ascii="Times New Roman" w:hAnsi="Times New Roman" w:cs="Times New Roman"/>
+          <w:sz w:val="24"/>
+          <w:szCs w:val="24"/>
+        </w:rPr>
+        <w:t>. Verás los indicadores en verde confirmando la vinculación.</w:t>
       </w:r>
     </w:p>
     <w:p>
       <w:pPr>
+        <w:rPr>
+          <w:rFonts w:ascii="Times New Roman" w:hAnsi="Times New Roman" w:cs="Times New Roman"/>
+          <w:sz w:val="24"/>
+          <w:szCs w:val="24"/>
+        </w:rPr>
+      </w:pPr>
+      <w:r>
+        <w:rPr>
+          <w:rFonts w:ascii="Times New Roman" w:hAnsi="Times New Roman" w:cs="Times New Roman"/>
+          <w:sz w:val="24"/>
+          <w:szCs w:val="24"/>
+        </w:rPr>
+        <w:pict w14:anchorId="5C234BFC">
+          <v:rect id="_x0000_i1342" style="width:6in;height:.75pt" o:hralign="center" o:hrstd="t" o:hr="t" fillcolor="#a0a0a0" stroked="f"/>
+        </w:pict>
+      </w:r>
+    </w:p>
+    <w:p>
+      <w:pPr>
+        <w:rPr>
+          <w:rFonts w:ascii="Times New Roman" w:hAnsi="Times New Roman" w:cs="Times New Roman"/>
+          <w:b/>
+          <w:bCs/>
+          <w:sz w:val="24"/>
+          <w:szCs w:val="24"/>
+        </w:rPr>
+      </w:pPr>
+      <w:r>
+        <w:rPr>
+          <w:rFonts w:ascii="Segoe UI Emoji" w:hAnsi="Segoe UI Emoji" w:cs="Segoe UI Emoji"/>
+          <w:b/>
+          <w:bCs/>
+          <w:sz w:val="24"/>
+          <w:szCs w:val="24"/>
+        </w:rPr>
+        <w:t>🧾</w:t>
+      </w:r>
+      <w:r>
+        <w:rPr>
+          <w:rFonts w:ascii="Times New Roman" w:hAnsi="Times New Roman" w:cs="Times New Roman"/>
+          <w:b/>
+          <w:bCs/>
+          <w:sz w:val="24"/>
+          <w:szCs w:val="24"/>
+        </w:rPr>
+        <w:t xml:space="preserve"> 4. Cómo Generar y Compartir Facturas (en PDF y WhatsApp)</w:t>
+      </w:r>
+    </w:p>
+    <w:p>
+      <w:pPr>
+        <w:rPr>
+          <w:rFonts w:ascii="Times New Roman" w:hAnsi="Times New Roman" w:cs="Times New Roman"/>
+          <w:sz w:val="24"/>
+          <w:szCs w:val="24"/>
+        </w:rPr>
+      </w:pPr>
+      <w:r>
+        <w:rPr>
+          <w:rFonts w:ascii="Times New Roman" w:hAnsi="Times New Roman" w:cs="Times New Roman"/>
+          <w:sz w:val="24"/>
+          <w:szCs w:val="24"/>
+        </w:rPr>
+        <w:t>La app permite emitir comprobantes comerciales limpios y profesionales con el logo oficial:</w:t>
+      </w:r>
+    </w:p>
+    <w:p>
+      <w:pPr>
+        <w:numPr>
+          <w:ilvl w:val="0"/>
+          <w:numId w:val="28"/>
+        </w:numPr>
+        <w:rPr>
+          <w:rFonts w:ascii="Times New Roman" w:hAnsi="Times New Roman" w:cs="Times New Roman"/>
+          <w:sz w:val="24"/>
+          <w:szCs w:val="24"/>
+        </w:rPr>
+      </w:pPr>
+      <w:r>
+        <w:rPr>
+          <w:rFonts w:ascii="Times New Roman" w:hAnsi="Times New Roman" w:cs="Times New Roman"/>
+          <w:sz w:val="24"/>
+          <w:szCs w:val="24"/>
+        </w:rPr>
+        <w:t xml:space="preserve">Ve a la pantalla de </w:t>
+      </w:r>
+      <w:r>
+        <w:rPr>
+          <w:rFonts w:ascii="Times New Roman" w:hAnsi="Times New Roman" w:cs="Times New Roman"/>
+          <w:b/>
+          <w:bCs/>
+          <w:sz w:val="24"/>
+          <w:szCs w:val="24"/>
+        </w:rPr>
+        <w:t>Facturación</w:t>
+      </w:r>
+      <w:r>
+        <w:rPr>
+          <w:rFonts w:ascii="Times New Roman" w:hAnsi="Times New Roman" w:cs="Times New Roman"/>
+          <w:sz w:val="24"/>
+          <w:szCs w:val="24"/>
+        </w:rPr>
+        <w:t xml:space="preserve"> y pulsa el botón </w:t>
+      </w:r>
+      <w:r>
+        <w:rPr>
+          <w:rFonts w:ascii="Times New Roman" w:hAnsi="Times New Roman" w:cs="Times New Roman"/>
+          <w:b/>
+          <w:bCs/>
+          <w:sz w:val="24"/>
+          <w:szCs w:val="24"/>
+        </w:rPr>
+        <w:t>«+ Generar Factura»</w:t>
+      </w:r>
+      <w:r>
+        <w:rPr>
+          <w:rFonts w:ascii="Times New Roman" w:hAnsi="Times New Roman" w:cs="Times New Roman"/>
+          <w:sz w:val="24"/>
+          <w:szCs w:val="24"/>
+        </w:rPr>
+        <w:t xml:space="preserve"> (o desde una orden completada).</w:t>
+      </w:r>
+    </w:p>
+    <w:p>
+      <w:pPr>
+        <w:numPr>
+          <w:ilvl w:val="0"/>
+          <w:numId w:val="28"/>
+        </w:numPr>
+        <w:rPr>
+          <w:rFonts w:ascii="Times New Roman" w:hAnsi="Times New Roman" w:cs="Times New Roman"/>
+          <w:sz w:val="24"/>
+          <w:szCs w:val="24"/>
+        </w:rPr>
+      </w:pPr>
+      <w:r>
+        <w:rPr>
+          <w:rFonts w:ascii="Times New Roman" w:hAnsi="Times New Roman" w:cs="Times New Roman"/>
+          <w:b/>
+          <w:bCs/>
+          <w:sz w:val="24"/>
+          <w:szCs w:val="24"/>
+        </w:rPr>
+        <w:t>Selecciona el cliente:</w:t>
+      </w:r>
+      <w:r>
+        <w:rPr>
+          <w:rFonts w:ascii="Times New Roman" w:hAnsi="Times New Roman" w:cs="Times New Roman"/>
+          <w:sz w:val="24"/>
+          <w:szCs w:val="24"/>
+        </w:rPr>
+        <w:t xml:space="preserve"> Elige el cliente del listado desplegable.</w:t>
+      </w:r>
+    </w:p>
+    <w:p>
+      <w:pPr>
+        <w:numPr>
+          <w:ilvl w:val="0"/>
+          <w:numId w:val="28"/>
+        </w:numPr>
+        <w:rPr>
+          <w:rFonts w:ascii="Times New Roman" w:hAnsi="Times New Roman" w:cs="Times New Roman"/>
+          <w:sz w:val="24"/>
+          <w:szCs w:val="24"/>
+        </w:rPr>
+      </w:pPr>
+      <w:r>
+        <w:rPr>
+          <w:rFonts w:ascii="Times New Roman" w:hAnsi="Times New Roman" w:cs="Times New Roman"/>
+          <w:b/>
+          <w:bCs/>
+          <w:sz w:val="24"/>
+          <w:szCs w:val="24"/>
+        </w:rPr>
+        <w:t>Concepto:</w:t>
+      </w:r>
+      <w:r>
+        <w:rPr>
+          <w:rFonts w:ascii="Times New Roman" w:hAnsi="Times New Roman" w:cs="Times New Roman"/>
+          <w:sz w:val="24"/>
+          <w:szCs w:val="24"/>
+        </w:rPr>
+        <w:t xml:space="preserve"> Escribe el detalle del servicio realizado (ej. </w:t>
+      </w:r>
+      <w:r>
+        <w:rPr>
+          <w:rFonts w:ascii="Times New Roman" w:hAnsi="Times New Roman" w:cs="Times New Roman"/>
+          <w:i/>
+          <w:iCs/>
+          <w:sz w:val="24"/>
+          <w:szCs w:val="24"/>
+        </w:rPr>
+        <w:t xml:space="preserve">Instalación Split </w:t>
+      </w:r>
+      <w:proofErr w:type="spellStart"/>
+      <w:r>
+        <w:rPr>
+          <w:rFonts w:ascii="Times New Roman" w:hAnsi="Times New Roman" w:cs="Times New Roman"/>
+          <w:i/>
+          <w:iCs/>
+          <w:sz w:val="24"/>
+          <w:szCs w:val="24"/>
+        </w:rPr>
+        <w:t>Inverter</w:t>
+      </w:r>
+      <w:proofErr w:type="spellEnd"/>
+      <w:r>
+        <w:rPr>
+          <w:rFonts w:ascii="Times New Roman" w:hAnsi="Times New Roman" w:cs="Times New Roman"/>
+          <w:i/>
+          <w:iCs/>
+          <w:sz w:val="24"/>
+          <w:szCs w:val="24"/>
+        </w:rPr>
+        <w:t xml:space="preserve"> 18,000 BTU, soporte y vacío</w:t>
+      </w:r>
+      <w:r>
+        <w:rPr>
+          <w:rFonts w:ascii="Times New Roman" w:hAnsi="Times New Roman" w:cs="Times New Roman"/>
+          <w:sz w:val="24"/>
+          <w:szCs w:val="24"/>
+        </w:rPr>
+        <w:t>).</w:t>
+      </w:r>
+    </w:p>
+    <w:p>
+      <w:pPr>
+        <w:numPr>
+          <w:ilvl w:val="0"/>
+          <w:numId w:val="28"/>
+        </w:numPr>
+        <w:rPr>
+          <w:rFonts w:ascii="Times New Roman" w:hAnsi="Times New Roman" w:cs="Times New Roman"/>
+          <w:sz w:val="24"/>
+          <w:szCs w:val="24"/>
+        </w:rPr>
+      </w:pPr>
+      <w:r>
+        <w:rPr>
+          <w:rFonts w:ascii="Times New Roman" w:hAnsi="Times New Roman" w:cs="Times New Roman"/>
+          <w:b/>
+          <w:bCs/>
+          <w:sz w:val="24"/>
+          <w:szCs w:val="24"/>
+        </w:rPr>
+        <w:t>Monto Total (RD$):</w:t>
+      </w:r>
+      <w:r>
+        <w:rPr>
+          <w:rFonts w:ascii="Times New Roman" w:hAnsi="Times New Roman" w:cs="Times New Roman"/>
+          <w:sz w:val="24"/>
+          <w:szCs w:val="24"/>
+        </w:rPr>
+        <w:t xml:space="preserve"> Escribe el importe total pactado (puedes ingresar cualquier valor numérico sin restricciones).</w:t>
+      </w:r>
+    </w:p>
+    <w:p>
+      <w:pPr>
+        <w:numPr>
+          <w:ilvl w:val="0"/>
+          <w:numId w:val="28"/>
+        </w:numPr>
+        <w:rPr>
+          <w:rFonts w:ascii="Times New Roman" w:hAnsi="Times New Roman" w:cs="Times New Roman"/>
+          <w:sz w:val="24"/>
+          <w:szCs w:val="24"/>
+        </w:rPr>
+      </w:pPr>
+      <w:r>
+        <w:rPr>
+          <w:rFonts w:ascii="Times New Roman" w:hAnsi="Times New Roman" w:cs="Times New Roman"/>
+          <w:b/>
+          <w:bCs/>
+          <w:sz w:val="24"/>
+          <w:szCs w:val="24"/>
+        </w:rPr>
+        <w:t>Estado de Pago:</w:t>
+      </w:r>
+      <w:r>
+        <w:rPr>
+          <w:rFonts w:ascii="Times New Roman" w:hAnsi="Times New Roman" w:cs="Times New Roman"/>
+          <w:sz w:val="24"/>
+          <w:szCs w:val="24"/>
+        </w:rPr>
+        <w:t xml:space="preserve"> Marca si fue </w:t>
+      </w:r>
+      <w:r>
+        <w:rPr>
+          <w:rFonts w:ascii="Times New Roman" w:hAnsi="Times New Roman" w:cs="Times New Roman"/>
+          <w:i/>
+          <w:iCs/>
+          <w:sz w:val="24"/>
+          <w:szCs w:val="24"/>
+        </w:rPr>
+        <w:t>Pagada</w:t>
+      </w:r>
+      <w:r>
+        <w:rPr>
+          <w:rFonts w:ascii="Times New Roman" w:hAnsi="Times New Roman" w:cs="Times New Roman"/>
+          <w:sz w:val="24"/>
+          <w:szCs w:val="24"/>
+        </w:rPr>
+        <w:t xml:space="preserve"> o está </w:t>
+      </w:r>
+      <w:r>
+        <w:rPr>
+          <w:rFonts w:ascii="Times New Roman" w:hAnsi="Times New Roman" w:cs="Times New Roman"/>
+          <w:i/>
+          <w:iCs/>
+          <w:sz w:val="24"/>
+          <w:szCs w:val="24"/>
+        </w:rPr>
+        <w:t>Pendiente</w:t>
+      </w:r>
+      <w:r>
+        <w:rPr>
+          <w:rFonts w:ascii="Times New Roman" w:hAnsi="Times New Roman" w:cs="Times New Roman"/>
+          <w:sz w:val="24"/>
+          <w:szCs w:val="24"/>
+        </w:rPr>
+        <w:t>.</w:t>
+      </w:r>
+    </w:p>
+    <w:p>
+      <w:pPr>
+        <w:numPr>
+          <w:ilvl w:val="0"/>
+          <w:numId w:val="28"/>
+        </w:numPr>
+        <w:rPr>
+          <w:rFonts w:ascii="Times New Roman" w:hAnsi="Times New Roman" w:cs="Times New Roman"/>
+          <w:sz w:val="24"/>
+          <w:szCs w:val="24"/>
+        </w:rPr>
+      </w:pPr>
+      <w:r>
+        <w:rPr>
+          <w:rFonts w:ascii="Times New Roman" w:hAnsi="Times New Roman" w:cs="Times New Roman"/>
+          <w:sz w:val="24"/>
+          <w:szCs w:val="24"/>
+        </w:rPr>
+        <w:t xml:space="preserve">Pulsa </w:t>
+      </w:r>
+      <w:r>
+        <w:rPr>
+          <w:rFonts w:ascii="Times New Roman" w:hAnsi="Times New Roman" w:cs="Times New Roman"/>
+          <w:b/>
+          <w:bCs/>
+          <w:sz w:val="24"/>
+          <w:szCs w:val="24"/>
+        </w:rPr>
+        <w:t>«Generar y Previsualizar»</w:t>
+      </w:r>
+      <w:r>
+        <w:rPr>
+          <w:rFonts w:ascii="Times New Roman" w:hAnsi="Times New Roman" w:cs="Times New Roman"/>
+          <w:sz w:val="24"/>
+          <w:szCs w:val="24"/>
+        </w:rPr>
+        <w:t xml:space="preserve">: </w:t>
+      </w:r>
+    </w:p>
+    <w:p>
+      <w:pPr>
         <w:numPr>
           <w:ilvl w:val="1"/>
-          <w:numId w:val="20"/>
+          <w:numId w:val="28"/>
         </w:numPr>
         <w:rPr>
           <w:rFonts w:ascii="Times New Roman" w:hAnsi="Times New Roman" w:cs="Times New Roman"/>
@@ -1116,38 +1669,36 @@
       </w:pPr>
       <w:r>
         <w:rPr>
-          <w:rFonts w:ascii="Segoe UI Emoji" w:hAnsi="Segoe UI Emoji" w:cs="Segoe UI Emoji"/>
-          <w:b/>
-          <w:bCs/>
-          <w:sz w:val="24"/>
-          <w:szCs w:val="24"/>
-        </w:rPr>
-        <w:t>📱</w:t>
-      </w:r>
-      <w:r>
-        <w:rPr>
-          <w:rFonts w:ascii="Times New Roman" w:hAnsi="Times New Roman" w:cs="Times New Roman"/>
-          <w:b/>
-          <w:bCs/>
-          <w:sz w:val="24"/>
-          <w:szCs w:val="24"/>
-        </w:rPr>
-        <w:t xml:space="preserve"> Número de WhatsApp:</w:t>
-      </w:r>
-      <w:r>
-        <w:rPr>
-          <w:rFonts w:ascii="Times New Roman" w:hAnsi="Times New Roman" w:cs="Times New Roman"/>
-          <w:sz w:val="24"/>
-          <w:szCs w:val="24"/>
-        </w:rPr>
-        <w:t xml:space="preserve"> Tu número telefónico comercial con código de área (ej. 8095550100).</w:t>
+          <w:rFonts w:ascii="Times New Roman" w:hAnsi="Times New Roman" w:cs="Times New Roman"/>
+          <w:sz w:val="24"/>
+          <w:szCs w:val="24"/>
+        </w:rPr>
+        <w:t xml:space="preserve">Se abrirá la factura con el logo oficial de </w:t>
+      </w:r>
+      <w:r>
+        <w:rPr>
+          <w:rFonts w:ascii="Times New Roman" w:hAnsi="Times New Roman" w:cs="Times New Roman"/>
+          <w:b/>
+          <w:bCs/>
+          <w:sz w:val="24"/>
+          <w:szCs w:val="24"/>
+        </w:rPr>
+        <w:t>PUJOLS Servicios</w:t>
+      </w:r>
+      <w:r>
+        <w:rPr>
+          <w:rFonts w:ascii="Times New Roman" w:hAnsi="Times New Roman" w:cs="Times New Roman"/>
+          <w:sz w:val="24"/>
+          <w:szCs w:val="24"/>
+        </w:rPr>
+        <w:t>, número correlativo y desglose.</w:t>
       </w:r>
     </w:p>
     <w:p>
       <w:pPr>
         <w:numPr>
           <w:ilvl w:val="1"/>
-          <w:numId w:val="20"/>
+          <w:numId w:val="28"/>
         </w:numPr>
         <w:rPr>
           <w:rFonts w:ascii="Times New Roman" w:hAnsi="Times New Roman" w:cs="Times New Roman"/>
@@ -1157,60 +1708,56 @@
       </w:pPr>
       <w:r>
         <w:rPr>
+          <w:rFonts w:ascii="Times New Roman" w:hAnsi="Times New Roman" w:cs="Times New Roman"/>
+          <w:sz w:val="24"/>
+          <w:szCs w:val="24"/>
+        </w:rPr>
+        <w:t xml:space="preserve">Pulsa </w:t>
+      </w:r>
+      <w:r>
+        <w:rPr>
+          <w:rFonts w:ascii="Times New Roman" w:hAnsi="Times New Roman" w:cs="Times New Roman"/>
+          <w:b/>
+          <w:bCs/>
+          <w:sz w:val="24"/>
+          <w:szCs w:val="24"/>
+        </w:rPr>
+        <w:t>«</w:t>
+      </w:r>
+      <w:r>
+        <w:rPr>
           <w:rFonts w:ascii="Segoe UI Emoji" w:hAnsi="Segoe UI Emoji" w:cs="Segoe UI Emoji"/>
           <w:b/>
           <w:bCs/>
           <w:sz w:val="24"/>
           <w:szCs w:val="24"/>
         </w:rPr>
-        <w:t>📊</w:t>
-      </w:r>
-      <w:r>
-        <w:rPr>
-          <w:rFonts w:ascii="Times New Roman" w:hAnsi="Times New Roman" w:cs="Times New Roman"/>
-          <w:b/>
-          <w:bCs/>
-          <w:sz w:val="24"/>
-          <w:szCs w:val="24"/>
-        </w:rPr>
-        <w:t xml:space="preserve"> Enlace de Google </w:t>
-      </w:r>
-      <w:proofErr w:type="spellStart"/>
-      <w:r>
-        <w:rPr>
-          <w:rFonts w:ascii="Times New Roman" w:hAnsi="Times New Roman" w:cs="Times New Roman"/>
-          <w:b/>
-          <w:bCs/>
-          <w:sz w:val="24"/>
-          <w:szCs w:val="24"/>
-        </w:rPr>
-        <w:t>Sheets</w:t>
-      </w:r>
-      <w:proofErr w:type="spellEnd"/>
-      <w:r>
-        <w:rPr>
-          <w:rFonts w:ascii="Times New Roman" w:hAnsi="Times New Roman" w:cs="Times New Roman"/>
-          <w:b/>
-          <w:bCs/>
-          <w:sz w:val="24"/>
-          <w:szCs w:val="24"/>
-        </w:rPr>
-        <w:t>:</w:t>
-      </w:r>
-      <w:r>
-        <w:rPr>
-          <w:rFonts w:ascii="Times New Roman" w:hAnsi="Times New Roman" w:cs="Times New Roman"/>
-          <w:sz w:val="24"/>
-          <w:szCs w:val="24"/>
-        </w:rPr>
-        <w:t xml:space="preserve"> Hoja de cálculo donde se almacenará la información.</w:t>
+        <w:t>🖨️</w:t>
+      </w:r>
+      <w:r>
+        <w:rPr>
+          <w:rFonts w:ascii="Times New Roman" w:hAnsi="Times New Roman" w:cs="Times New Roman"/>
+          <w:b/>
+          <w:bCs/>
+          <w:sz w:val="24"/>
+          <w:szCs w:val="24"/>
+        </w:rPr>
+        <w:t xml:space="preserve"> Imprimir / Guardar en PDF»</w:t>
+      </w:r>
+      <w:r>
+        <w:rPr>
+          <w:rFonts w:ascii="Times New Roman" w:hAnsi="Times New Roman" w:cs="Times New Roman"/>
+          <w:sz w:val="24"/>
+          <w:szCs w:val="24"/>
+        </w:rPr>
+        <w:t xml:space="preserve"> para descargar el PDF o imprimirlo.</w:t>
       </w:r>
     </w:p>
     <w:p>
       <w:pPr>
         <w:numPr>
           <w:ilvl w:val="1"/>
-          <w:numId w:val="20"/>
+          <w:numId w:val="28"/>
         </w:numPr>
         <w:rPr>
           <w:rFonts w:ascii="Times New Roman" w:hAnsi="Times New Roman" w:cs="Times New Roman"/>
@@ -1220,38 +1767,163 @@
       </w:pPr>
       <w:r>
         <w:rPr>
+          <w:rFonts w:ascii="Times New Roman" w:hAnsi="Times New Roman" w:cs="Times New Roman"/>
+          <w:sz w:val="24"/>
+          <w:szCs w:val="24"/>
+        </w:rPr>
+        <w:t xml:space="preserve">Pulsa </w:t>
+      </w:r>
+      <w:r>
+        <w:rPr>
+          <w:rFonts w:ascii="Times New Roman" w:hAnsi="Times New Roman" w:cs="Times New Roman"/>
+          <w:b/>
+          <w:bCs/>
+          <w:sz w:val="24"/>
+          <w:szCs w:val="24"/>
+        </w:rPr>
+        <w:t>«</w:t>
+      </w:r>
+      <w:r>
+        <w:rPr>
           <w:rFonts w:ascii="Segoe UI Emoji" w:hAnsi="Segoe UI Emoji" w:cs="Segoe UI Emoji"/>
           <w:b/>
           <w:bCs/>
           <w:sz w:val="24"/>
           <w:szCs w:val="24"/>
         </w:rPr>
-        <w:t>📁</w:t>
-      </w:r>
-      <w:r>
-        <w:rPr>
-          <w:rFonts w:ascii="Times New Roman" w:hAnsi="Times New Roman" w:cs="Times New Roman"/>
-          <w:b/>
-          <w:bCs/>
-          <w:sz w:val="24"/>
-          <w:szCs w:val="24"/>
-        </w:rPr>
-        <w:t xml:space="preserve"> Enlace de Google Drive:</w:t>
-      </w:r>
-      <w:r>
-        <w:rPr>
-          <w:rFonts w:ascii="Times New Roman" w:hAnsi="Times New Roman" w:cs="Times New Roman"/>
-          <w:sz w:val="24"/>
-          <w:szCs w:val="24"/>
-        </w:rPr>
-        <w:t xml:space="preserve"> Carpeta donde se archivarán los comprobantes y facturas PDF.</w:t>
+        <w:t>📱</w:t>
+      </w:r>
+      <w:r>
+        <w:rPr>
+          <w:rFonts w:ascii="Times New Roman" w:hAnsi="Times New Roman" w:cs="Times New Roman"/>
+          <w:b/>
+          <w:bCs/>
+          <w:sz w:val="24"/>
+          <w:szCs w:val="24"/>
+        </w:rPr>
+        <w:t xml:space="preserve"> Compartir por WhatsApp»</w:t>
+      </w:r>
+      <w:r>
+        <w:rPr>
+          <w:rFonts w:ascii="Times New Roman" w:hAnsi="Times New Roman" w:cs="Times New Roman"/>
+          <w:sz w:val="24"/>
+          <w:szCs w:val="24"/>
+        </w:rPr>
+        <w:t xml:space="preserve"> para enviar el aviso de cobro directo al cliente.</w:t>
       </w:r>
     </w:p>
     <w:p>
       <w:pPr>
+        <w:rPr>
+          <w:rFonts w:ascii="Times New Roman" w:hAnsi="Times New Roman" w:cs="Times New Roman"/>
+          <w:sz w:val="24"/>
+          <w:szCs w:val="24"/>
+        </w:rPr>
+      </w:pPr>
+      <w:r>
+        <w:rPr>
+          <w:rFonts w:ascii="Times New Roman" w:hAnsi="Times New Roman" w:cs="Times New Roman"/>
+          <w:sz w:val="24"/>
+          <w:szCs w:val="24"/>
+        </w:rPr>
+        <w:pict w14:anchorId="5126E3CE">
+          <v:rect id="_x0000_i1343" style="width:396pt;height:.75pt" o:hralign="center" o:hrstd="t" o:hr="t" fillcolor="#a0a0a0" stroked="f"/>
+        </w:pict>
+      </w:r>
+    </w:p>
+    <w:p>
+      <w:pPr>
+        <w:rPr>
+          <w:rFonts w:ascii="Times New Roman" w:hAnsi="Times New Roman" w:cs="Times New Roman"/>
+          <w:b/>
+          <w:bCs/>
+          <w:sz w:val="24"/>
+          <w:szCs w:val="24"/>
+        </w:rPr>
+      </w:pPr>
+      <w:r>
+        <w:rPr>
+          <w:rFonts w:ascii="Segoe UI Emoji" w:hAnsi="Segoe UI Emoji" w:cs="Segoe UI Emoji"/>
+          <w:b/>
+          <w:bCs/>
+          <w:sz w:val="24"/>
+          <w:szCs w:val="24"/>
+        </w:rPr>
+        <w:t>💬</w:t>
+      </w:r>
+      <w:r>
+        <w:rPr>
+          <w:rFonts w:ascii="Times New Roman" w:hAnsi="Times New Roman" w:cs="Times New Roman"/>
+          <w:b/>
+          <w:bCs/>
+          <w:sz w:val="24"/>
+          <w:szCs w:val="24"/>
+        </w:rPr>
+        <w:t xml:space="preserve"> 5. Cómo Hacer la Prueba de Envío de Mensajes por WhatsApp</w:t>
+      </w:r>
+    </w:p>
+    <w:p>
+      <w:pPr>
+        <w:rPr>
+          <w:rFonts w:ascii="Times New Roman" w:hAnsi="Times New Roman" w:cs="Times New Roman"/>
+          <w:sz w:val="24"/>
+          <w:szCs w:val="24"/>
+        </w:rPr>
+      </w:pPr>
+      <w:r>
+        <w:rPr>
+          <w:rFonts w:ascii="Times New Roman" w:hAnsi="Times New Roman" w:cs="Times New Roman"/>
+          <w:sz w:val="24"/>
+          <w:szCs w:val="24"/>
+        </w:rPr>
+        <w:t xml:space="preserve">La aplicación no te cobra mensualidades por </w:t>
+      </w:r>
+      <w:proofErr w:type="spellStart"/>
+      <w:r>
+        <w:rPr>
+          <w:rFonts w:ascii="Times New Roman" w:hAnsi="Times New Roman" w:cs="Times New Roman"/>
+          <w:sz w:val="24"/>
+          <w:szCs w:val="24"/>
+        </w:rPr>
+        <w:t>APIs</w:t>
+      </w:r>
+      <w:proofErr w:type="spellEnd"/>
+      <w:r>
+        <w:rPr>
+          <w:rFonts w:ascii="Times New Roman" w:hAnsi="Times New Roman" w:cs="Times New Roman"/>
+          <w:sz w:val="24"/>
+          <w:szCs w:val="24"/>
+        </w:rPr>
+        <w:t xml:space="preserve"> externas; se conecta directamente con tu aplicación de WhatsApp en el celular o PC con el mensaje redactado:</w:t>
+      </w:r>
+    </w:p>
+    <w:p>
+      <w:pPr>
+        <w:rPr>
+          <w:rFonts w:ascii="Times New Roman" w:hAnsi="Times New Roman" w:cs="Times New Roman"/>
+          <w:b/>
+          <w:bCs/>
+          <w:sz w:val="24"/>
+          <w:szCs w:val="24"/>
+        </w:rPr>
+      </w:pPr>
+      <w:r>
+        <w:rPr>
+          <w:rFonts w:ascii="Times New Roman" w:hAnsi="Times New Roman" w:cs="Times New Roman"/>
+          <w:b/>
+          <w:bCs/>
+          <w:sz w:val="24"/>
+          <w:szCs w:val="24"/>
+        </w:rPr>
+        <w:lastRenderedPageBreak/>
+        <w:t>Pasos para realizar la prueba con tu propio teléfono:</w:t>
+      </w:r>
+    </w:p>
+    <w:p>
+      <w:pPr>
         <w:numPr>
           <w:ilvl w:val="0"/>
-          <w:numId w:val="20"/>
+          <w:numId w:val="29"/>
         </w:numPr>
         <w:rPr>
           <w:rFonts w:ascii="Times New Roman" w:hAnsi="Times New Roman" w:cs="Times New Roman"/>
@@ -1265,119 +1937,211 @@
           <w:sz w:val="24"/>
           <w:szCs w:val="24"/>
         </w:rPr>
-        <w:t xml:space="preserve">Presiona </w:t>
-      </w:r>
-      <w:r>
-        <w:rPr>
-          <w:rFonts w:ascii="Times New Roman" w:hAnsi="Times New Roman" w:cs="Times New Roman"/>
-          <w:b/>
-          <w:bCs/>
-          <w:sz w:val="24"/>
-          <w:szCs w:val="24"/>
-        </w:rPr>
-        <w:t>«</w:t>
-      </w:r>
-      <w:r>
-        <w:rPr>
-          <w:rFonts w:ascii="Segoe UI Emoji" w:hAnsi="Segoe UI Emoji" w:cs="Segoe UI Emoji"/>
-          <w:b/>
-          <w:bCs/>
-          <w:sz w:val="24"/>
-          <w:szCs w:val="24"/>
-        </w:rPr>
-        <w:t>💾</w:t>
-      </w:r>
-      <w:r>
-        <w:rPr>
-          <w:rFonts w:ascii="Times New Roman" w:hAnsi="Times New Roman" w:cs="Times New Roman"/>
-          <w:b/>
-          <w:bCs/>
-          <w:sz w:val="24"/>
-          <w:szCs w:val="24"/>
-        </w:rPr>
-        <w:t xml:space="preserve"> Guardar configuración»</w:t>
-      </w:r>
-      <w:r>
-        <w:rPr>
-          <w:rFonts w:ascii="Times New Roman" w:hAnsi="Times New Roman" w:cs="Times New Roman"/>
-          <w:sz w:val="24"/>
-          <w:szCs w:val="24"/>
-        </w:rPr>
-        <w:t>. Verás los indicadores en verde confirmando la vinculación.</w:t>
+        <w:t xml:space="preserve">Ve a </w:t>
+      </w:r>
+      <w:r>
+        <w:rPr>
+          <w:rFonts w:ascii="Times New Roman" w:hAnsi="Times New Roman" w:cs="Times New Roman"/>
+          <w:b/>
+          <w:bCs/>
+          <w:sz w:val="24"/>
+          <w:szCs w:val="24"/>
+        </w:rPr>
+        <w:t>Clientes</w:t>
+      </w:r>
+      <w:r>
+        <w:rPr>
+          <w:rFonts w:ascii="Times New Roman" w:hAnsi="Times New Roman" w:cs="Times New Roman"/>
+          <w:sz w:val="24"/>
+          <w:szCs w:val="24"/>
+        </w:rPr>
+        <w:t xml:space="preserve"> y pulsa </w:t>
+      </w:r>
+      <w:r>
+        <w:rPr>
+          <w:rFonts w:ascii="Times New Roman" w:hAnsi="Times New Roman" w:cs="Times New Roman"/>
+          <w:b/>
+          <w:bCs/>
+          <w:sz w:val="24"/>
+          <w:szCs w:val="24"/>
+        </w:rPr>
+        <w:t>«+ Nuevo Cliente»</w:t>
+      </w:r>
+      <w:r>
+        <w:rPr>
+          <w:rFonts w:ascii="Times New Roman" w:hAnsi="Times New Roman" w:cs="Times New Roman"/>
+          <w:sz w:val="24"/>
+          <w:szCs w:val="24"/>
+        </w:rPr>
+        <w:t xml:space="preserve"> (o abre uno existente).</w:t>
       </w:r>
     </w:p>
     <w:p>
       <w:pPr>
-        <w:rPr>
-          <w:rFonts w:ascii="Times New Roman" w:hAnsi="Times New Roman" w:cs="Times New Roman"/>
-          <w:sz w:val="24"/>
-          <w:szCs w:val="24"/>
-        </w:rPr>
-      </w:pPr>
-      <w:r>
-        <w:rPr>
-          <w:rFonts w:ascii="Times New Roman" w:hAnsi="Times New Roman" w:cs="Times New Roman"/>
-          <w:sz w:val="24"/>
-          <w:szCs w:val="24"/>
-        </w:rPr>
-        <w:pict w14:anchorId="6E12BC79">
-          <v:rect id="_x0000_i1279" style="width:6in;height:.75pt" o:hralign="center" o:hrstd="t" o:hr="t" fillcolor="#a0a0a0" stroked="f"/>
-        </w:pict>
+        <w:numPr>
+          <w:ilvl w:val="0"/>
+          <w:numId w:val="29"/>
+        </w:numPr>
+        <w:rPr>
+          <w:rFonts w:ascii="Times New Roman" w:hAnsi="Times New Roman" w:cs="Times New Roman"/>
+          <w:sz w:val="24"/>
+          <w:szCs w:val="24"/>
+        </w:rPr>
+      </w:pPr>
+      <w:r>
+        <w:rPr>
+          <w:rFonts w:ascii="Times New Roman" w:hAnsi="Times New Roman" w:cs="Times New Roman"/>
+          <w:sz w:val="24"/>
+          <w:szCs w:val="24"/>
+        </w:rPr>
+        <w:t>Ingresa tu propio número de teléfono real (ej. 8095551234).</w:t>
       </w:r>
     </w:p>
     <w:p>
       <w:pPr>
-        <w:rPr>
-          <w:rFonts w:ascii="Times New Roman" w:hAnsi="Times New Roman" w:cs="Times New Roman"/>
-          <w:b/>
-          <w:bCs/>
-          <w:sz w:val="24"/>
-          <w:szCs w:val="24"/>
-        </w:rPr>
-      </w:pPr>
-      <w:r>
-        <w:rPr>
-          <w:rFonts w:ascii="Segoe UI Emoji" w:hAnsi="Segoe UI Emoji" w:cs="Segoe UI Emoji"/>
-          <w:b/>
-          <w:bCs/>
-          <w:sz w:val="24"/>
-          <w:szCs w:val="24"/>
-        </w:rPr>
-        <w:t>🧾</w:t>
-      </w:r>
-      <w:r>
-        <w:rPr>
-          <w:rFonts w:ascii="Times New Roman" w:hAnsi="Times New Roman" w:cs="Times New Roman"/>
-          <w:b/>
-          <w:bCs/>
-          <w:sz w:val="24"/>
-          <w:szCs w:val="24"/>
-        </w:rPr>
-        <w:t xml:space="preserve"> 4. Cómo Generar y Compartir Facturas (en PDF y WhatsApp)</w:t>
+        <w:numPr>
+          <w:ilvl w:val="0"/>
+          <w:numId w:val="29"/>
+        </w:numPr>
+        <w:rPr>
+          <w:rFonts w:ascii="Times New Roman" w:hAnsi="Times New Roman" w:cs="Times New Roman"/>
+          <w:sz w:val="24"/>
+          <w:szCs w:val="24"/>
+        </w:rPr>
+      </w:pPr>
+      <w:r>
+        <w:rPr>
+          <w:rFonts w:ascii="Times New Roman" w:hAnsi="Times New Roman" w:cs="Times New Roman"/>
+          <w:sz w:val="24"/>
+          <w:szCs w:val="24"/>
+        </w:rPr>
+        <w:t xml:space="preserve">Ahora realiza cualquiera de estas 3 pruebas de envío: </w:t>
       </w:r>
     </w:p>
     <w:p>
       <w:pPr>
-        <w:rPr>
-          <w:rFonts w:ascii="Times New Roman" w:hAnsi="Times New Roman" w:cs="Times New Roman"/>
-          <w:sz w:val="24"/>
-          <w:szCs w:val="24"/>
-        </w:rPr>
-      </w:pPr>
-      <w:r>
-        <w:rPr>
-          <w:rFonts w:ascii="Times New Roman" w:hAnsi="Times New Roman" w:cs="Times New Roman"/>
-          <w:sz w:val="24"/>
-          <w:szCs w:val="24"/>
-        </w:rPr>
-        <w:t>La app permite emitir comprobantes comerciales limpios y profesionales con el logo oficial:</w:t>
+        <w:numPr>
+          <w:ilvl w:val="1"/>
+          <w:numId w:val="29"/>
+        </w:numPr>
+        <w:rPr>
+          <w:rFonts w:ascii="Times New Roman" w:hAnsi="Times New Roman" w:cs="Times New Roman"/>
+          <w:sz w:val="24"/>
+          <w:szCs w:val="24"/>
+        </w:rPr>
+      </w:pPr>
+      <w:r>
+        <w:rPr>
+          <w:rFonts w:ascii="Times New Roman" w:hAnsi="Times New Roman" w:cs="Times New Roman"/>
+          <w:b/>
+          <w:bCs/>
+          <w:sz w:val="24"/>
+          <w:szCs w:val="24"/>
+        </w:rPr>
+        <w:t>Confirmación de Cita:</w:t>
+      </w:r>
+      <w:r>
+        <w:rPr>
+          <w:rFonts w:ascii="Times New Roman" w:hAnsi="Times New Roman" w:cs="Times New Roman"/>
+          <w:sz w:val="24"/>
+          <w:szCs w:val="24"/>
+        </w:rPr>
+        <w:t xml:space="preserve"> Ve a </w:t>
+      </w:r>
+      <w:r>
+        <w:rPr>
+          <w:rFonts w:ascii="Times New Roman" w:hAnsi="Times New Roman" w:cs="Times New Roman"/>
+          <w:b/>
+          <w:bCs/>
+          <w:sz w:val="24"/>
+          <w:szCs w:val="24"/>
+        </w:rPr>
+        <w:t>Servicios</w:t>
+      </w:r>
+      <w:r>
+        <w:rPr>
+          <w:rFonts w:ascii="Times New Roman" w:hAnsi="Times New Roman" w:cs="Times New Roman"/>
+          <w:sz w:val="24"/>
+          <w:szCs w:val="24"/>
+        </w:rPr>
+        <w:t xml:space="preserve"> </w:t>
+      </w:r>
+      <w:r>
+        <w:rPr>
+          <w:rFonts w:ascii="Segoe UI Emoji" w:hAnsi="Segoe UI Emoji" w:cs="Segoe UI Emoji"/>
+          <w:sz w:val="24"/>
+          <w:szCs w:val="24"/>
+        </w:rPr>
+        <w:t>➡️</w:t>
+      </w:r>
+      <w:r>
+        <w:rPr>
+          <w:rFonts w:ascii="Times New Roman" w:hAnsi="Times New Roman" w:cs="Times New Roman"/>
+          <w:sz w:val="24"/>
+          <w:szCs w:val="24"/>
+        </w:rPr>
+        <w:t xml:space="preserve"> Ubica una orden del cliente </w:t>
+      </w:r>
+      <w:r>
+        <w:rPr>
+          <w:rFonts w:ascii="Segoe UI Emoji" w:hAnsi="Segoe UI Emoji" w:cs="Segoe UI Emoji"/>
+          <w:sz w:val="24"/>
+          <w:szCs w:val="24"/>
+        </w:rPr>
+        <w:t>➡️</w:t>
+      </w:r>
+      <w:r>
+        <w:rPr>
+          <w:rFonts w:ascii="Times New Roman" w:hAnsi="Times New Roman" w:cs="Times New Roman"/>
+          <w:sz w:val="24"/>
+          <w:szCs w:val="24"/>
+        </w:rPr>
+        <w:t xml:space="preserve"> Pulsa el botón verde </w:t>
+      </w:r>
+      <w:r>
+        <w:rPr>
+          <w:rFonts w:ascii="Times New Roman" w:hAnsi="Times New Roman" w:cs="Times New Roman"/>
+          <w:b/>
+          <w:bCs/>
+          <w:sz w:val="24"/>
+          <w:szCs w:val="24"/>
+        </w:rPr>
+        <w:t>«</w:t>
+      </w:r>
+      <w:r>
+        <w:rPr>
+          <w:rFonts w:ascii="Segoe UI Emoji" w:hAnsi="Segoe UI Emoji" w:cs="Segoe UI Emoji"/>
+          <w:b/>
+          <w:bCs/>
+          <w:sz w:val="24"/>
+          <w:szCs w:val="24"/>
+        </w:rPr>
+        <w:t>💬</w:t>
+      </w:r>
+      <w:r>
+        <w:rPr>
+          <w:rFonts w:ascii="Times New Roman" w:hAnsi="Times New Roman" w:cs="Times New Roman"/>
+          <w:b/>
+          <w:bCs/>
+          <w:sz w:val="24"/>
+          <w:szCs w:val="24"/>
+        </w:rPr>
+        <w:t xml:space="preserve"> WhatsApp»</w:t>
+      </w:r>
+      <w:r>
+        <w:rPr>
+          <w:rFonts w:ascii="Times New Roman" w:hAnsi="Times New Roman" w:cs="Times New Roman"/>
+          <w:sz w:val="24"/>
+          <w:szCs w:val="24"/>
+        </w:rPr>
+        <w:t>. Se abrirá WhatsApp con el mensaje automático listo indicando fecha, hora, tipo de equipo y técnico.</w:t>
       </w:r>
     </w:p>
     <w:p>
       <w:pPr>
         <w:numPr>
-          <w:ilvl w:val="0"/>
-          <w:numId w:val="21"/>
+          <w:ilvl w:val="1"/>
+          <w:numId w:val="29"/>
         </w:numPr>
         <w:rPr>
           <w:rFonts w:ascii="Times New Roman" w:hAnsi="Times New Roman" w:cs="Times New Roman"/>
@@ -1388,53 +2152,99 @@
       <w:r>
         <w:rPr>
           <w:rFonts w:ascii="Times New Roman" w:hAnsi="Times New Roman" w:cs="Times New Roman"/>
-          <w:sz w:val="24"/>
-          <w:szCs w:val="24"/>
-        </w:rPr>
-        <w:t xml:space="preserve">Ve a la pantalla de </w:t>
-      </w:r>
-      <w:r>
-        <w:rPr>
-          <w:rFonts w:ascii="Times New Roman" w:hAnsi="Times New Roman" w:cs="Times New Roman"/>
-          <w:b/>
-          <w:bCs/>
-          <w:sz w:val="24"/>
-          <w:szCs w:val="24"/>
-        </w:rPr>
-        <w:t>Facturación</w:t>
-      </w:r>
-      <w:r>
-        <w:rPr>
-          <w:rFonts w:ascii="Times New Roman" w:hAnsi="Times New Roman" w:cs="Times New Roman"/>
-          <w:sz w:val="24"/>
-          <w:szCs w:val="24"/>
-        </w:rPr>
-        <w:t xml:space="preserve"> y pulsa el botón </w:t>
-      </w:r>
-      <w:r>
-        <w:rPr>
-          <w:rFonts w:ascii="Times New Roman" w:hAnsi="Times New Roman" w:cs="Times New Roman"/>
-          <w:b/>
-          <w:bCs/>
-          <w:sz w:val="24"/>
-          <w:szCs w:val="24"/>
-        </w:rPr>
-        <w:t>«+ Generar Factura»</w:t>
-      </w:r>
-      <w:r>
-        <w:rPr>
-          <w:rFonts w:ascii="Times New Roman" w:hAnsi="Times New Roman" w:cs="Times New Roman"/>
-          <w:sz w:val="24"/>
-          <w:szCs w:val="24"/>
-        </w:rPr>
-        <w:t xml:space="preserve"> (o desde una orden completada).</w:t>
+          <w:b/>
+          <w:bCs/>
+          <w:sz w:val="24"/>
+          <w:szCs w:val="24"/>
+        </w:rPr>
+        <w:t>Recordatorio de Mantenimiento:</w:t>
+      </w:r>
+      <w:r>
+        <w:rPr>
+          <w:rFonts w:ascii="Times New Roman" w:hAnsi="Times New Roman" w:cs="Times New Roman"/>
+          <w:sz w:val="24"/>
+          <w:szCs w:val="24"/>
+        </w:rPr>
+        <w:t xml:space="preserve"> Ve a </w:t>
+      </w:r>
+      <w:r>
+        <w:rPr>
+          <w:rFonts w:ascii="Times New Roman" w:hAnsi="Times New Roman" w:cs="Times New Roman"/>
+          <w:b/>
+          <w:bCs/>
+          <w:sz w:val="24"/>
+          <w:szCs w:val="24"/>
+        </w:rPr>
+        <w:t>Recordatorios</w:t>
+      </w:r>
+      <w:r>
+        <w:rPr>
+          <w:rFonts w:ascii="Times New Roman" w:hAnsi="Times New Roman" w:cs="Times New Roman"/>
+          <w:sz w:val="24"/>
+          <w:szCs w:val="24"/>
+        </w:rPr>
+        <w:t xml:space="preserve"> </w:t>
+      </w:r>
+      <w:r>
+        <w:rPr>
+          <w:rFonts w:ascii="Segoe UI Emoji" w:hAnsi="Segoe UI Emoji" w:cs="Segoe UI Emoji"/>
+          <w:sz w:val="24"/>
+          <w:szCs w:val="24"/>
+        </w:rPr>
+        <w:t>➡️</w:t>
+      </w:r>
+      <w:r>
+        <w:rPr>
+          <w:rFonts w:ascii="Times New Roman" w:hAnsi="Times New Roman" w:cs="Times New Roman"/>
+          <w:sz w:val="24"/>
+          <w:szCs w:val="24"/>
+        </w:rPr>
+        <w:t xml:space="preserve"> Pulsa </w:t>
+      </w:r>
+      <w:r>
+        <w:rPr>
+          <w:rFonts w:ascii="Times New Roman" w:hAnsi="Times New Roman" w:cs="Times New Roman"/>
+          <w:b/>
+          <w:bCs/>
+          <w:sz w:val="24"/>
+          <w:szCs w:val="24"/>
+        </w:rPr>
+        <w:t>«</w:t>
+      </w:r>
+      <w:r>
+        <w:rPr>
+          <w:rFonts w:ascii="Segoe UI Emoji" w:hAnsi="Segoe UI Emoji" w:cs="Segoe UI Emoji"/>
+          <w:b/>
+          <w:bCs/>
+          <w:sz w:val="24"/>
+          <w:szCs w:val="24"/>
+        </w:rPr>
+        <w:t>📱</w:t>
+      </w:r>
+      <w:r>
+        <w:rPr>
+          <w:rFonts w:ascii="Times New Roman" w:hAnsi="Times New Roman" w:cs="Times New Roman"/>
+          <w:b/>
+          <w:bCs/>
+          <w:sz w:val="24"/>
+          <w:szCs w:val="24"/>
+        </w:rPr>
+        <w:t xml:space="preserve"> WhatsApp»</w:t>
+      </w:r>
+      <w:r>
+        <w:rPr>
+          <w:rFonts w:ascii="Times New Roman" w:hAnsi="Times New Roman" w:cs="Times New Roman"/>
+          <w:sz w:val="24"/>
+          <w:szCs w:val="24"/>
+        </w:rPr>
+        <w:t xml:space="preserve"> en un aire acondicionado para abrir el mensaje de mantenimiento preventivo.</w:t>
       </w:r>
     </w:p>
     <w:p>
       <w:pPr>
         <w:numPr>
-          <w:ilvl w:val="0"/>
-          <w:numId w:val="21"/>
+          <w:ilvl w:val="1"/>
+          <w:numId w:val="29"/>
         </w:numPr>
         <w:rPr>
           <w:rFonts w:ascii="Times New Roman" w:hAnsi="Times New Roman" w:cs="Times New Roman"/>
@@ -1450,22 +2260,90 @@
           <w:sz w:val="24"/>
           <w:szCs w:val="24"/>
         </w:rPr>
-        <w:t>Selecciona el cliente:</w:t>
-      </w:r>
-      <w:r>
-        <w:rPr>
-          <w:rFonts w:ascii="Times New Roman" w:hAnsi="Times New Roman" w:cs="Times New Roman"/>
-          <w:sz w:val="24"/>
-          <w:szCs w:val="24"/>
-        </w:rPr>
-        <w:t xml:space="preserve"> Elige el cliente del listado desplegable.</w:t>
+        <w:t>Envío de Factura:</w:t>
+      </w:r>
+      <w:r>
+        <w:rPr>
+          <w:rFonts w:ascii="Times New Roman" w:hAnsi="Times New Roman" w:cs="Times New Roman"/>
+          <w:sz w:val="24"/>
+          <w:szCs w:val="24"/>
+        </w:rPr>
+        <w:t xml:space="preserve"> Ve a </w:t>
+      </w:r>
+      <w:r>
+        <w:rPr>
+          <w:rFonts w:ascii="Times New Roman" w:hAnsi="Times New Roman" w:cs="Times New Roman"/>
+          <w:b/>
+          <w:bCs/>
+          <w:sz w:val="24"/>
+          <w:szCs w:val="24"/>
+        </w:rPr>
+        <w:t>Facturación</w:t>
+      </w:r>
+      <w:r>
+        <w:rPr>
+          <w:rFonts w:ascii="Times New Roman" w:hAnsi="Times New Roman" w:cs="Times New Roman"/>
+          <w:sz w:val="24"/>
+          <w:szCs w:val="24"/>
+        </w:rPr>
+        <w:t xml:space="preserve"> </w:t>
+      </w:r>
+      <w:r>
+        <w:rPr>
+          <w:rFonts w:ascii="Segoe UI Emoji" w:hAnsi="Segoe UI Emoji" w:cs="Segoe UI Emoji"/>
+          <w:sz w:val="24"/>
+          <w:szCs w:val="24"/>
+        </w:rPr>
+        <w:t>➡️</w:t>
+      </w:r>
+      <w:r>
+        <w:rPr>
+          <w:rFonts w:ascii="Times New Roman" w:hAnsi="Times New Roman" w:cs="Times New Roman"/>
+          <w:sz w:val="24"/>
+          <w:szCs w:val="24"/>
+        </w:rPr>
+        <w:t xml:space="preserve"> Abre la factura </w:t>
+      </w:r>
+      <w:r>
+        <w:rPr>
+          <w:rFonts w:ascii="Segoe UI Emoji" w:hAnsi="Segoe UI Emoji" w:cs="Segoe UI Emoji"/>
+          <w:sz w:val="24"/>
+          <w:szCs w:val="24"/>
+        </w:rPr>
+        <w:t>➡️</w:t>
+      </w:r>
+      <w:r>
+        <w:rPr>
+          <w:rFonts w:ascii="Times New Roman" w:hAnsi="Times New Roman" w:cs="Times New Roman"/>
+          <w:sz w:val="24"/>
+          <w:szCs w:val="24"/>
+        </w:rPr>
+        <w:t xml:space="preserve"> Pulsa </w:t>
+      </w:r>
+      <w:r>
+        <w:rPr>
+          <w:rFonts w:ascii="Times New Roman" w:hAnsi="Times New Roman" w:cs="Times New Roman"/>
+          <w:b/>
+          <w:bCs/>
+          <w:sz w:val="24"/>
+          <w:szCs w:val="24"/>
+        </w:rPr>
+        <w:t>«WhatsApp»</w:t>
+      </w:r>
+      <w:r>
+        <w:rPr>
+          <w:rFonts w:ascii="Times New Roman" w:hAnsi="Times New Roman" w:cs="Times New Roman"/>
+          <w:sz w:val="24"/>
+          <w:szCs w:val="24"/>
+        </w:rPr>
+        <w:t xml:space="preserve"> para compartir el monto y número de factura.</w:t>
       </w:r>
     </w:p>
     <w:p>
       <w:pPr>
         <w:numPr>
           <w:ilvl w:val="0"/>
-          <w:numId w:val="21"/>
+          <w:numId w:val="29"/>
         </w:numPr>
         <w:rPr>
           <w:rFonts w:ascii="Times New Roman" w:hAnsi="Times New Roman" w:cs="Times New Roman"/>
@@ -1476,20 +2354,184 @@
       <w:r>
         <w:rPr>
           <w:rFonts w:ascii="Times New Roman" w:hAnsi="Times New Roman" w:cs="Times New Roman"/>
-          <w:b/>
-          <w:bCs/>
-          <w:sz w:val="24"/>
-          <w:szCs w:val="24"/>
-        </w:rPr>
-        <w:t>Concepto:</w:t>
-      </w:r>
-      <w:r>
-        <w:rPr>
-          <w:rFonts w:ascii="Times New Roman" w:hAnsi="Times New Roman" w:cs="Times New Roman"/>
-          <w:sz w:val="24"/>
-          <w:szCs w:val="24"/>
-        </w:rPr>
-        <w:t xml:space="preserve"> Escribe el detalle del servicio realizado (ej. </w:t>
+          <w:sz w:val="24"/>
+          <w:szCs w:val="24"/>
+        </w:rPr>
+        <w:t>En WhatsApp solo tienes que presionar la flecha de enviar.</w:t>
+      </w:r>
+    </w:p>
+    <w:p>
+      <w:pPr>
+        <w:rPr>
+          <w:rFonts w:ascii="Times New Roman" w:hAnsi="Times New Roman" w:cs="Times New Roman"/>
+          <w:sz w:val="24"/>
+          <w:szCs w:val="24"/>
+        </w:rPr>
+      </w:pPr>
+      <w:r>
+        <w:rPr>
+          <w:rFonts w:ascii="Times New Roman" w:hAnsi="Times New Roman" w:cs="Times New Roman"/>
+          <w:sz w:val="24"/>
+          <w:szCs w:val="24"/>
+        </w:rPr>
+        <w:pict w14:anchorId="5BFE26D5">
+          <v:rect id="_x0000_i1344" style="width:6in;height:.75pt" o:hralign="center" o:hrstd="t" o:hr="t" fillcolor="#a0a0a0" stroked="f"/>
+        </w:pict>
+      </w:r>
+    </w:p>
+    <w:p>
+      <w:pPr>
+        <w:rPr>
+          <w:rFonts w:ascii="Times New Roman" w:hAnsi="Times New Roman" w:cs="Times New Roman"/>
+          <w:b/>
+          <w:bCs/>
+          <w:sz w:val="24"/>
+          <w:szCs w:val="24"/>
+        </w:rPr>
+      </w:pPr>
+      <w:r>
+        <w:rPr>
+          <w:rFonts w:ascii="Segoe UI Emoji" w:hAnsi="Segoe UI Emoji" w:cs="Segoe UI Emoji"/>
+          <w:b/>
+          <w:bCs/>
+          <w:sz w:val="24"/>
+          <w:szCs w:val="24"/>
+        </w:rPr>
+        <w:t>🗑️</w:t>
+      </w:r>
+      <w:r>
+        <w:rPr>
+          <w:rFonts w:ascii="Times New Roman" w:hAnsi="Times New Roman" w:cs="Times New Roman"/>
+          <w:b/>
+          <w:bCs/>
+          <w:sz w:val="24"/>
+          <w:szCs w:val="24"/>
+        </w:rPr>
+        <w:t xml:space="preserve"> 6. Datos de Demostración vs. Datos Reales del Negocio</w:t>
+      </w:r>
+    </w:p>
+    <w:p>
+      <w:pPr>
+        <w:numPr>
+          <w:ilvl w:val="0"/>
+          <w:numId w:val="30"/>
+        </w:numPr>
+        <w:rPr>
+          <w:rFonts w:ascii="Times New Roman" w:hAnsi="Times New Roman" w:cs="Times New Roman"/>
+          <w:sz w:val="24"/>
+          <w:szCs w:val="24"/>
+        </w:rPr>
+      </w:pPr>
+      <w:r>
+        <w:rPr>
+          <w:rFonts w:ascii="Times New Roman" w:hAnsi="Times New Roman" w:cs="Times New Roman"/>
+          <w:b/>
+          <w:bCs/>
+          <w:sz w:val="24"/>
+          <w:szCs w:val="24"/>
+        </w:rPr>
+        <w:t>¿Se borran los datos de prueba al instalar la app?</w:t>
+      </w:r>
+      <w:r>
+        <w:rPr>
+          <w:rFonts w:ascii="Times New Roman" w:hAnsi="Times New Roman" w:cs="Times New Roman"/>
+          <w:sz w:val="24"/>
+          <w:szCs w:val="24"/>
+        </w:rPr>
+        <w:br/>
+        <w:t>No se borran solos. La app incluye datos de ejemplo (gráficos, 6 clientes y servicios) para que puedas explorar todas las funciones antes de usarla en tu día a día.</w:t>
+      </w:r>
+    </w:p>
+    <w:p>
+      <w:pPr>
+        <w:numPr>
+          <w:ilvl w:val="0"/>
+          <w:numId w:val="30"/>
+        </w:numPr>
+        <w:rPr>
+          <w:rFonts w:ascii="Times New Roman" w:hAnsi="Times New Roman" w:cs="Times New Roman"/>
+          <w:sz w:val="24"/>
+          <w:szCs w:val="24"/>
+        </w:rPr>
+      </w:pPr>
+      <w:r>
+        <w:rPr>
+          <w:rFonts w:ascii="Times New Roman" w:hAnsi="Times New Roman" w:cs="Times New Roman"/>
+          <w:b/>
+          <w:bCs/>
+          <w:sz w:val="24"/>
+          <w:szCs w:val="24"/>
+        </w:rPr>
+        <w:t>¿Cómo empezar de cero con tus datos reales?</w:t>
+      </w:r>
+      <w:r>
+        <w:rPr>
+          <w:rFonts w:ascii="Times New Roman" w:hAnsi="Times New Roman" w:cs="Times New Roman"/>
+          <w:sz w:val="24"/>
+          <w:szCs w:val="24"/>
+        </w:rPr>
+        <w:br/>
+        <w:t xml:space="preserve">Cuando estés listo para cargar tus clientes verdaderos: </w:t>
+      </w:r>
+    </w:p>
+    <w:p>
+      <w:pPr>
+        <w:numPr>
+          <w:ilvl w:val="1"/>
+          <w:numId w:val="30"/>
+        </w:numPr>
+        <w:rPr>
+          <w:rFonts w:ascii="Times New Roman" w:hAnsi="Times New Roman" w:cs="Times New Roman"/>
+          <w:sz w:val="24"/>
+          <w:szCs w:val="24"/>
+        </w:rPr>
+      </w:pPr>
+      <w:r>
+        <w:rPr>
+          <w:rFonts w:ascii="Times New Roman" w:hAnsi="Times New Roman" w:cs="Times New Roman"/>
+          <w:sz w:val="24"/>
+          <w:szCs w:val="24"/>
+        </w:rPr>
+        <w:t xml:space="preserve">Ve a </w:t>
+      </w:r>
+      <w:r>
+        <w:rPr>
+          <w:rFonts w:ascii="Times New Roman" w:hAnsi="Times New Roman" w:cs="Times New Roman"/>
+          <w:b/>
+          <w:bCs/>
+          <w:sz w:val="24"/>
+          <w:szCs w:val="24"/>
+        </w:rPr>
+        <w:t>Configuración</w:t>
+      </w:r>
+      <w:r>
+        <w:rPr>
+          <w:rFonts w:ascii="Times New Roman" w:hAnsi="Times New Roman" w:cs="Times New Roman"/>
+          <w:sz w:val="24"/>
+          <w:szCs w:val="24"/>
+        </w:rPr>
+        <w:t xml:space="preserve"> (engranaje).</w:t>
+      </w:r>
+    </w:p>
+    <w:p>
+      <w:pPr>
+        <w:numPr>
+          <w:ilvl w:val="1"/>
+          <w:numId w:val="30"/>
+        </w:numPr>
+        <w:rPr>
+          <w:rFonts w:ascii="Times New Roman" w:hAnsi="Times New Roman" w:cs="Times New Roman"/>
+          <w:sz w:val="24"/>
+          <w:szCs w:val="24"/>
+        </w:rPr>
+      </w:pPr>
+      <w:r>
+        <w:rPr>
+          <w:rFonts w:ascii="Times New Roman" w:hAnsi="Times New Roman" w:cs="Times New Roman"/>
+          <w:sz w:val="24"/>
+          <w:szCs w:val="24"/>
+        </w:rPr>
+        <w:t xml:space="preserve">Al final, en </w:t>
       </w:r>
       <w:r>
         <w:rPr>
@@ -1499,1116 +2541,60 @@
           <w:sz w:val="24"/>
           <w:szCs w:val="24"/>
         </w:rPr>
-        <w:t xml:space="preserve">Instalación Split </w:t>
-      </w:r>
-      <w:proofErr w:type="spellStart"/>
-      <w:r>
-        <w:rPr>
-          <w:rFonts w:ascii="Times New Roman" w:hAnsi="Times New Roman" w:cs="Times New Roman"/>
-          <w:i/>
-          <w:iCs/>
-          <w:sz w:val="24"/>
-          <w:szCs w:val="24"/>
-        </w:rPr>
-        <w:t>Inverter</w:t>
-      </w:r>
-      <w:proofErr w:type="spellEnd"/>
-      <w:r>
-        <w:rPr>
-          <w:rFonts w:ascii="Times New Roman" w:hAnsi="Times New Roman" w:cs="Times New Roman"/>
-          <w:i/>
-          <w:iCs/>
-          <w:sz w:val="24"/>
-          <w:szCs w:val="24"/>
-        </w:rPr>
-        <w:t xml:space="preserve"> 18,000 BTU, soporte y vacío</w:t>
-      </w:r>
-      <w:r>
-        <w:rPr>
-          <w:rFonts w:ascii="Times New Roman" w:hAnsi="Times New Roman" w:cs="Times New Roman"/>
-          <w:sz w:val="24"/>
-          <w:szCs w:val="24"/>
-        </w:rPr>
-        <w:t>).</w:t>
+        <w:t>Mantenimiento de la Aplicación</w:t>
+      </w:r>
+      <w:r>
+        <w:rPr>
+          <w:rFonts w:ascii="Times New Roman" w:hAnsi="Times New Roman" w:cs="Times New Roman"/>
+          <w:sz w:val="24"/>
+          <w:szCs w:val="24"/>
+        </w:rPr>
+        <w:t xml:space="preserve">, pulsa el botón rojo </w:t>
+      </w:r>
+      <w:r>
+        <w:rPr>
+          <w:rFonts w:ascii="Times New Roman" w:hAnsi="Times New Roman" w:cs="Times New Roman"/>
+          <w:b/>
+          <w:bCs/>
+          <w:sz w:val="24"/>
+          <w:szCs w:val="24"/>
+        </w:rPr>
+        <w:t>«</w:t>
+      </w:r>
+      <w:r>
+        <w:rPr>
+          <w:rFonts w:ascii="Segoe UI Emoji" w:hAnsi="Segoe UI Emoji" w:cs="Segoe UI Emoji"/>
+          <w:b/>
+          <w:bCs/>
+          <w:sz w:val="24"/>
+          <w:szCs w:val="24"/>
+        </w:rPr>
+        <w:t>🗑️</w:t>
+      </w:r>
+      <w:r>
+        <w:rPr>
+          <w:rFonts w:ascii="Times New Roman" w:hAnsi="Times New Roman" w:cs="Times New Roman"/>
+          <w:b/>
+          <w:bCs/>
+          <w:sz w:val="24"/>
+          <w:szCs w:val="24"/>
+        </w:rPr>
+        <w:t xml:space="preserve"> Limpiar datos de demostración (Empezar de cero)»</w:t>
+      </w:r>
+      <w:r>
+        <w:rPr>
+          <w:rFonts w:ascii="Times New Roman" w:hAnsi="Times New Roman" w:cs="Times New Roman"/>
+          <w:sz w:val="24"/>
+          <w:szCs w:val="24"/>
+        </w:rPr>
+        <w:t>.</w:t>
       </w:r>
     </w:p>
     <w:p>
       <w:pPr>
         <w:numPr>
-          <w:ilvl w:val="0"/>
-          <w:numId w:val="21"/>
-        </w:numPr>
-        <w:rPr>
-          <w:rFonts w:ascii="Times New Roman" w:hAnsi="Times New Roman" w:cs="Times New Roman"/>
-          <w:sz w:val="24"/>
-          <w:szCs w:val="24"/>
-        </w:rPr>
-      </w:pPr>
-      <w:r>
-        <w:rPr>
-          <w:rFonts w:ascii="Times New Roman" w:hAnsi="Times New Roman" w:cs="Times New Roman"/>
-          <w:b/>
-          <w:bCs/>
-          <w:sz w:val="24"/>
-          <w:szCs w:val="24"/>
-        </w:rPr>
-        <w:t>Monto Total (RD$):</w:t>
-      </w:r>
-      <w:r>
-        <w:rPr>
-          <w:rFonts w:ascii="Times New Roman" w:hAnsi="Times New Roman" w:cs="Times New Roman"/>
-          <w:sz w:val="24"/>
-          <w:szCs w:val="24"/>
-        </w:rPr>
-        <w:t xml:space="preserve"> Escribe el importe total pactado (puedes ingresar cualquier valor numérico sin restricciones).</w:t>
-      </w:r>
-    </w:p>
-    <w:p>
-      <w:pPr>
-        <w:numPr>
-          <w:ilvl w:val="0"/>
-          <w:numId w:val="21"/>
-        </w:numPr>
-        <w:rPr>
-          <w:rFonts w:ascii="Times New Roman" w:hAnsi="Times New Roman" w:cs="Times New Roman"/>
-          <w:sz w:val="24"/>
-          <w:szCs w:val="24"/>
-        </w:rPr>
-      </w:pPr>
-      <w:r>
-        <w:rPr>
-          <w:rFonts w:ascii="Times New Roman" w:hAnsi="Times New Roman" w:cs="Times New Roman"/>
-          <w:b/>
-          <w:bCs/>
-          <w:sz w:val="24"/>
-          <w:szCs w:val="24"/>
-        </w:rPr>
-        <w:t>Estado de Pago:</w:t>
-      </w:r>
-      <w:r>
-        <w:rPr>
-          <w:rFonts w:ascii="Times New Roman" w:hAnsi="Times New Roman" w:cs="Times New Roman"/>
-          <w:sz w:val="24"/>
-          <w:szCs w:val="24"/>
-        </w:rPr>
-        <w:t xml:space="preserve"> Marca si fue </w:t>
-      </w:r>
-      <w:r>
-        <w:rPr>
-          <w:rFonts w:ascii="Times New Roman" w:hAnsi="Times New Roman" w:cs="Times New Roman"/>
-          <w:i/>
-          <w:iCs/>
-          <w:sz w:val="24"/>
-          <w:szCs w:val="24"/>
-        </w:rPr>
-        <w:t>Pagada</w:t>
-      </w:r>
-      <w:r>
-        <w:rPr>
-          <w:rFonts w:ascii="Times New Roman" w:hAnsi="Times New Roman" w:cs="Times New Roman"/>
-          <w:sz w:val="24"/>
-          <w:szCs w:val="24"/>
-        </w:rPr>
-        <w:t xml:space="preserve"> o está </w:t>
-      </w:r>
-      <w:r>
-        <w:rPr>
-          <w:rFonts w:ascii="Times New Roman" w:hAnsi="Times New Roman" w:cs="Times New Roman"/>
-          <w:i/>
-          <w:iCs/>
-          <w:sz w:val="24"/>
-          <w:szCs w:val="24"/>
-        </w:rPr>
-        <w:t>Pendiente</w:t>
-      </w:r>
-      <w:r>
-        <w:rPr>
-          <w:rFonts w:ascii="Times New Roman" w:hAnsi="Times New Roman" w:cs="Times New Roman"/>
-          <w:sz w:val="24"/>
-          <w:szCs w:val="24"/>
-        </w:rPr>
-        <w:t>.</w:t>
-      </w:r>
-    </w:p>
-    <w:p>
-      <w:pPr>
-        <w:numPr>
-          <w:ilvl w:val="0"/>
-          <w:numId w:val="21"/>
-        </w:numPr>
-        <w:rPr>
-          <w:rFonts w:ascii="Times New Roman" w:hAnsi="Times New Roman" w:cs="Times New Roman"/>
-          <w:sz w:val="24"/>
-          <w:szCs w:val="24"/>
-        </w:rPr>
-      </w:pPr>
-      <w:r>
-        <w:rPr>
-          <w:rFonts w:ascii="Times New Roman" w:hAnsi="Times New Roman" w:cs="Times New Roman"/>
-          <w:sz w:val="24"/>
-          <w:szCs w:val="24"/>
-        </w:rPr>
-        <w:t xml:space="preserve">Pulsa </w:t>
-      </w:r>
-      <w:r>
-        <w:rPr>
-          <w:rFonts w:ascii="Times New Roman" w:hAnsi="Times New Roman" w:cs="Times New Roman"/>
-          <w:b/>
-          <w:bCs/>
-          <w:sz w:val="24"/>
-          <w:szCs w:val="24"/>
-        </w:rPr>
-        <w:t>«Generar y Previsualizar»</w:t>
-      </w:r>
-      <w:r>
-        <w:rPr>
-          <w:rFonts w:ascii="Times New Roman" w:hAnsi="Times New Roman" w:cs="Times New Roman"/>
-          <w:sz w:val="24"/>
-          <w:szCs w:val="24"/>
-        </w:rPr>
-        <w:t xml:space="preserve">: </w:t>
-      </w:r>
-    </w:p>
-    <w:p>
-      <w:pPr>
-        <w:numPr>
           <w:ilvl w:val="1"/>
-          <w:numId w:val="21"/>
-        </w:numPr>
-        <w:rPr>
-          <w:rFonts w:ascii="Times New Roman" w:hAnsi="Times New Roman" w:cs="Times New Roman"/>
-          <w:sz w:val="24"/>
-          <w:szCs w:val="24"/>
-        </w:rPr>
-      </w:pPr>
-      <w:r>
-        <w:rPr>
-          <w:rFonts w:ascii="Times New Roman" w:hAnsi="Times New Roman" w:cs="Times New Roman"/>
-          <w:sz w:val="24"/>
-          <w:szCs w:val="24"/>
-        </w:rPr>
-        <w:t xml:space="preserve">Se abrirá la factura con el logo oficial de </w:t>
-      </w:r>
-      <w:r>
-        <w:rPr>
-          <w:rFonts w:ascii="Times New Roman" w:hAnsi="Times New Roman" w:cs="Times New Roman"/>
-          <w:b/>
-          <w:bCs/>
-          <w:sz w:val="24"/>
-          <w:szCs w:val="24"/>
-        </w:rPr>
-        <w:t>PUJOLS Servicios</w:t>
-      </w:r>
-      <w:r>
-        <w:rPr>
-          <w:rFonts w:ascii="Times New Roman" w:hAnsi="Times New Roman" w:cs="Times New Roman"/>
-          <w:sz w:val="24"/>
-          <w:szCs w:val="24"/>
-        </w:rPr>
-        <w:t>, número correlativo y desglose.</w:t>
-      </w:r>
-    </w:p>
-    <w:p>
-      <w:pPr>
-        <w:numPr>
-          <w:ilvl w:val="1"/>
-          <w:numId w:val="21"/>
-        </w:numPr>
-        <w:rPr>
-          <w:rFonts w:ascii="Times New Roman" w:hAnsi="Times New Roman" w:cs="Times New Roman"/>
-          <w:sz w:val="24"/>
-          <w:szCs w:val="24"/>
-        </w:rPr>
-      </w:pPr>
-      <w:r>
-        <w:rPr>
-          <w:rFonts w:ascii="Times New Roman" w:hAnsi="Times New Roman" w:cs="Times New Roman"/>
-          <w:sz w:val="24"/>
-          <w:szCs w:val="24"/>
-        </w:rPr>
-        <w:t xml:space="preserve">Pulsa </w:t>
-      </w:r>
-      <w:r>
-        <w:rPr>
-          <w:rFonts w:ascii="Times New Roman" w:hAnsi="Times New Roman" w:cs="Times New Roman"/>
-          <w:b/>
-          <w:bCs/>
-          <w:sz w:val="24"/>
-          <w:szCs w:val="24"/>
-        </w:rPr>
-        <w:t>«</w:t>
-      </w:r>
-      <w:r>
-        <w:rPr>
-          <w:rFonts w:ascii="Segoe UI Emoji" w:hAnsi="Segoe UI Emoji" w:cs="Segoe UI Emoji"/>
-          <w:b/>
-          <w:bCs/>
-          <w:sz w:val="24"/>
-          <w:szCs w:val="24"/>
-        </w:rPr>
-        <w:t>🖨️</w:t>
-      </w:r>
-      <w:r>
-        <w:rPr>
-          <w:rFonts w:ascii="Times New Roman" w:hAnsi="Times New Roman" w:cs="Times New Roman"/>
-          <w:b/>
-          <w:bCs/>
-          <w:sz w:val="24"/>
-          <w:szCs w:val="24"/>
-        </w:rPr>
-        <w:t xml:space="preserve"> Imprimir / Guardar en PDF»</w:t>
-      </w:r>
-      <w:r>
-        <w:rPr>
-          <w:rFonts w:ascii="Times New Roman" w:hAnsi="Times New Roman" w:cs="Times New Roman"/>
-          <w:sz w:val="24"/>
-          <w:szCs w:val="24"/>
-        </w:rPr>
-        <w:t xml:space="preserve"> para descargar el PDF o imprimirlo.</w:t>
-      </w:r>
-    </w:p>
-    <w:p>
-      <w:pPr>
-        <w:numPr>
-          <w:ilvl w:val="1"/>
-          <w:numId w:val="21"/>
-        </w:numPr>
-        <w:rPr>
-          <w:rFonts w:ascii="Times New Roman" w:hAnsi="Times New Roman" w:cs="Times New Roman"/>
-          <w:sz w:val="24"/>
-          <w:szCs w:val="24"/>
-        </w:rPr>
-      </w:pPr>
-      <w:r>
-        <w:rPr>
-          <w:rFonts w:ascii="Times New Roman" w:hAnsi="Times New Roman" w:cs="Times New Roman"/>
-          <w:sz w:val="24"/>
-          <w:szCs w:val="24"/>
-        </w:rPr>
-        <w:t xml:space="preserve">Pulsa </w:t>
-      </w:r>
-      <w:r>
-        <w:rPr>
-          <w:rFonts w:ascii="Times New Roman" w:hAnsi="Times New Roman" w:cs="Times New Roman"/>
-          <w:b/>
-          <w:bCs/>
-          <w:sz w:val="24"/>
-          <w:szCs w:val="24"/>
-        </w:rPr>
-        <w:t>«</w:t>
-      </w:r>
-      <w:r>
-        <w:rPr>
-          <w:rFonts w:ascii="Segoe UI Emoji" w:hAnsi="Segoe UI Emoji" w:cs="Segoe UI Emoji"/>
-          <w:b/>
-          <w:bCs/>
-          <w:sz w:val="24"/>
-          <w:szCs w:val="24"/>
-        </w:rPr>
-        <w:t>📱</w:t>
-      </w:r>
-      <w:r>
-        <w:rPr>
-          <w:rFonts w:ascii="Times New Roman" w:hAnsi="Times New Roman" w:cs="Times New Roman"/>
-          <w:b/>
-          <w:bCs/>
-          <w:sz w:val="24"/>
-          <w:szCs w:val="24"/>
-        </w:rPr>
-        <w:t xml:space="preserve"> Compartir por WhatsApp»</w:t>
-      </w:r>
-      <w:r>
-        <w:rPr>
-          <w:rFonts w:ascii="Times New Roman" w:hAnsi="Times New Roman" w:cs="Times New Roman"/>
-          <w:sz w:val="24"/>
-          <w:szCs w:val="24"/>
-        </w:rPr>
-        <w:t xml:space="preserve"> para enviar el aviso de cobro directo al cliente.</w:t>
-      </w:r>
-    </w:p>
-    <w:p>
-      <w:pPr>
-        <w:rPr>
-          <w:rFonts w:ascii="Times New Roman" w:hAnsi="Times New Roman" w:cs="Times New Roman"/>
-          <w:sz w:val="24"/>
-          <w:szCs w:val="24"/>
-        </w:rPr>
-      </w:pPr>
-      <w:r>
-        <w:rPr>
-          <w:rFonts w:ascii="Times New Roman" w:hAnsi="Times New Roman" w:cs="Times New Roman"/>
-          <w:sz w:val="24"/>
-          <w:szCs w:val="24"/>
-        </w:rPr>
-        <w:lastRenderedPageBreak/>
-        <w:pict w14:anchorId="5FD55236">
-          <v:rect id="_x0000_i1280" style="width:396pt;height:.75pt" o:hralign="center" o:hrstd="t" o:hr="t" fillcolor="#a0a0a0" stroked="f"/>
-        </w:pict>
-      </w:r>
-    </w:p>
-    <w:p>
-      <w:pPr>
-        <w:rPr>
-          <w:rFonts w:ascii="Times New Roman" w:hAnsi="Times New Roman" w:cs="Times New Roman"/>
-          <w:b/>
-          <w:bCs/>
-          <w:sz w:val="24"/>
-          <w:szCs w:val="24"/>
-        </w:rPr>
-      </w:pPr>
-      <w:r>
-        <w:rPr>
-          <w:rFonts w:ascii="Segoe UI Emoji" w:hAnsi="Segoe UI Emoji" w:cs="Segoe UI Emoji"/>
-          <w:b/>
-          <w:bCs/>
-          <w:sz w:val="24"/>
-          <w:szCs w:val="24"/>
-        </w:rPr>
-        <w:t>💬</w:t>
-      </w:r>
-      <w:r>
-        <w:rPr>
-          <w:rFonts w:ascii="Times New Roman" w:hAnsi="Times New Roman" w:cs="Times New Roman"/>
-          <w:b/>
-          <w:bCs/>
-          <w:sz w:val="24"/>
-          <w:szCs w:val="24"/>
-        </w:rPr>
-        <w:t xml:space="preserve"> 5. Cómo Hacer la Prueba de Envío de Mensajes por WhatsApp</w:t>
-      </w:r>
-    </w:p>
-    <w:p>
-      <w:pPr>
-        <w:rPr>
-          <w:rFonts w:ascii="Times New Roman" w:hAnsi="Times New Roman" w:cs="Times New Roman"/>
-          <w:sz w:val="24"/>
-          <w:szCs w:val="24"/>
-        </w:rPr>
-      </w:pPr>
-      <w:r>
-        <w:rPr>
-          <w:rFonts w:ascii="Times New Roman" w:hAnsi="Times New Roman" w:cs="Times New Roman"/>
-          <w:sz w:val="24"/>
-          <w:szCs w:val="24"/>
-        </w:rPr>
-        <w:t xml:space="preserve">La aplicación no te cobra mensualidades por </w:t>
-      </w:r>
-      <w:proofErr w:type="spellStart"/>
-      <w:r>
-        <w:rPr>
-          <w:rFonts w:ascii="Times New Roman" w:hAnsi="Times New Roman" w:cs="Times New Roman"/>
-          <w:sz w:val="24"/>
-          <w:szCs w:val="24"/>
-        </w:rPr>
-        <w:t>APIs</w:t>
-      </w:r>
-      <w:proofErr w:type="spellEnd"/>
-      <w:r>
-        <w:rPr>
-          <w:rFonts w:ascii="Times New Roman" w:hAnsi="Times New Roman" w:cs="Times New Roman"/>
-          <w:sz w:val="24"/>
-          <w:szCs w:val="24"/>
-        </w:rPr>
-        <w:t xml:space="preserve"> externas; se conecta directamente con tu aplicación de WhatsApp en el celular o PC con el mensaje redactado:</w:t>
-      </w:r>
-    </w:p>
-    <w:p>
-      <w:pPr>
-        <w:rPr>
-          <w:rFonts w:ascii="Times New Roman" w:hAnsi="Times New Roman" w:cs="Times New Roman"/>
-          <w:b/>
-          <w:bCs/>
-          <w:sz w:val="24"/>
-          <w:szCs w:val="24"/>
-        </w:rPr>
-      </w:pPr>
-      <w:r>
-        <w:rPr>
-          <w:rFonts w:ascii="Times New Roman" w:hAnsi="Times New Roman" w:cs="Times New Roman"/>
-          <w:b/>
-          <w:bCs/>
-          <w:sz w:val="24"/>
-          <w:szCs w:val="24"/>
-        </w:rPr>
-        <w:t>Pasos para realizar la prueba con tu propio teléfono:</w:t>
-      </w:r>
-    </w:p>
-    <w:p>
-      <w:pPr>
-        <w:numPr>
-          <w:ilvl w:val="0"/>
-          <w:numId w:val="22"/>
-        </w:numPr>
-        <w:rPr>
-          <w:rFonts w:ascii="Times New Roman" w:hAnsi="Times New Roman" w:cs="Times New Roman"/>
-          <w:sz w:val="24"/>
-          <w:szCs w:val="24"/>
-        </w:rPr>
-      </w:pPr>
-      <w:r>
-        <w:rPr>
-          <w:rFonts w:ascii="Times New Roman" w:hAnsi="Times New Roman" w:cs="Times New Roman"/>
-          <w:sz w:val="24"/>
-          <w:szCs w:val="24"/>
-        </w:rPr>
-        <w:t xml:space="preserve">Ve a </w:t>
-      </w:r>
-      <w:r>
-        <w:rPr>
-          <w:rFonts w:ascii="Times New Roman" w:hAnsi="Times New Roman" w:cs="Times New Roman"/>
-          <w:b/>
-          <w:bCs/>
-          <w:sz w:val="24"/>
-          <w:szCs w:val="24"/>
-        </w:rPr>
-        <w:t>Clientes</w:t>
-      </w:r>
-      <w:r>
-        <w:rPr>
-          <w:rFonts w:ascii="Times New Roman" w:hAnsi="Times New Roman" w:cs="Times New Roman"/>
-          <w:sz w:val="24"/>
-          <w:szCs w:val="24"/>
-        </w:rPr>
-        <w:t xml:space="preserve"> y pulsa </w:t>
-      </w:r>
-      <w:r>
-        <w:rPr>
-          <w:rFonts w:ascii="Times New Roman" w:hAnsi="Times New Roman" w:cs="Times New Roman"/>
-          <w:b/>
-          <w:bCs/>
-          <w:sz w:val="24"/>
-          <w:szCs w:val="24"/>
-        </w:rPr>
-        <w:t>«+ Nuevo Cliente»</w:t>
-      </w:r>
-      <w:r>
-        <w:rPr>
-          <w:rFonts w:ascii="Times New Roman" w:hAnsi="Times New Roman" w:cs="Times New Roman"/>
-          <w:sz w:val="24"/>
-          <w:szCs w:val="24"/>
-        </w:rPr>
-        <w:t xml:space="preserve"> (o abre uno existente).</w:t>
-      </w:r>
-    </w:p>
-    <w:p>
-      <w:pPr>
-        <w:numPr>
-          <w:ilvl w:val="0"/>
-          <w:numId w:val="22"/>
-        </w:numPr>
-        <w:rPr>
-          <w:rFonts w:ascii="Times New Roman" w:hAnsi="Times New Roman" w:cs="Times New Roman"/>
-          <w:sz w:val="24"/>
-          <w:szCs w:val="24"/>
-        </w:rPr>
-      </w:pPr>
-      <w:r>
-        <w:rPr>
-          <w:rFonts w:ascii="Times New Roman" w:hAnsi="Times New Roman" w:cs="Times New Roman"/>
-          <w:sz w:val="24"/>
-          <w:szCs w:val="24"/>
-        </w:rPr>
-        <w:t>Ingresa tu propio número de teléfono real (ej. 8095551234).</w:t>
-      </w:r>
-    </w:p>
-    <w:p>
-      <w:pPr>
-        <w:numPr>
-          <w:ilvl w:val="0"/>
-          <w:numId w:val="22"/>
-        </w:numPr>
-        <w:rPr>
-          <w:rFonts w:ascii="Times New Roman" w:hAnsi="Times New Roman" w:cs="Times New Roman"/>
-          <w:sz w:val="24"/>
-          <w:szCs w:val="24"/>
-        </w:rPr>
-      </w:pPr>
-      <w:r>
-        <w:rPr>
-          <w:rFonts w:ascii="Times New Roman" w:hAnsi="Times New Roman" w:cs="Times New Roman"/>
-          <w:sz w:val="24"/>
-          <w:szCs w:val="24"/>
-        </w:rPr>
-        <w:t xml:space="preserve">Ahora realiza cualquiera de estas 3 pruebas de envío: </w:t>
-      </w:r>
-    </w:p>
-    <w:p>
-      <w:pPr>
-        <w:numPr>
-          <w:ilvl w:val="1"/>
-          <w:numId w:val="22"/>
-        </w:numPr>
-        <w:rPr>
-          <w:rFonts w:ascii="Times New Roman" w:hAnsi="Times New Roman" w:cs="Times New Roman"/>
-          <w:sz w:val="24"/>
-          <w:szCs w:val="24"/>
-        </w:rPr>
-      </w:pPr>
-      <w:r>
-        <w:rPr>
-          <w:rFonts w:ascii="Times New Roman" w:hAnsi="Times New Roman" w:cs="Times New Roman"/>
-          <w:b/>
-          <w:bCs/>
-          <w:sz w:val="24"/>
-          <w:szCs w:val="24"/>
-        </w:rPr>
-        <w:t>Confirmación de Cita:</w:t>
-      </w:r>
-      <w:r>
-        <w:rPr>
-          <w:rFonts w:ascii="Times New Roman" w:hAnsi="Times New Roman" w:cs="Times New Roman"/>
-          <w:sz w:val="24"/>
-          <w:szCs w:val="24"/>
-        </w:rPr>
-        <w:t xml:space="preserve"> Ve a </w:t>
-      </w:r>
-      <w:r>
-        <w:rPr>
-          <w:rFonts w:ascii="Times New Roman" w:hAnsi="Times New Roman" w:cs="Times New Roman"/>
-          <w:b/>
-          <w:bCs/>
-          <w:sz w:val="24"/>
-          <w:szCs w:val="24"/>
-        </w:rPr>
-        <w:t>Servicios</w:t>
-      </w:r>
-      <w:r>
-        <w:rPr>
-          <w:rFonts w:ascii="Times New Roman" w:hAnsi="Times New Roman" w:cs="Times New Roman"/>
-          <w:sz w:val="24"/>
-          <w:szCs w:val="24"/>
-        </w:rPr>
-        <w:t xml:space="preserve"> </w:t>
-      </w:r>
-      <w:r>
-        <w:rPr>
-          <w:rFonts w:ascii="Segoe UI Emoji" w:hAnsi="Segoe UI Emoji" w:cs="Segoe UI Emoji"/>
-          <w:sz w:val="24"/>
-          <w:szCs w:val="24"/>
-        </w:rPr>
-        <w:t>➡️</w:t>
-      </w:r>
-      <w:r>
-        <w:rPr>
-          <w:rFonts w:ascii="Times New Roman" w:hAnsi="Times New Roman" w:cs="Times New Roman"/>
-          <w:sz w:val="24"/>
-          <w:szCs w:val="24"/>
-        </w:rPr>
-        <w:t xml:space="preserve"> Ubica una orden del cliente </w:t>
-      </w:r>
-      <w:r>
-        <w:rPr>
-          <w:rFonts w:ascii="Segoe UI Emoji" w:hAnsi="Segoe UI Emoji" w:cs="Segoe UI Emoji"/>
-          <w:sz w:val="24"/>
-          <w:szCs w:val="24"/>
-        </w:rPr>
-        <w:t>➡️</w:t>
-      </w:r>
-      <w:r>
-        <w:rPr>
-          <w:rFonts w:ascii="Times New Roman" w:hAnsi="Times New Roman" w:cs="Times New Roman"/>
-          <w:sz w:val="24"/>
-          <w:szCs w:val="24"/>
-        </w:rPr>
-        <w:t xml:space="preserve"> Pulsa el botón verde </w:t>
-      </w:r>
-      <w:r>
-        <w:rPr>
-          <w:rFonts w:ascii="Times New Roman" w:hAnsi="Times New Roman" w:cs="Times New Roman"/>
-          <w:b/>
-          <w:bCs/>
-          <w:sz w:val="24"/>
-          <w:szCs w:val="24"/>
-        </w:rPr>
-        <w:t>«</w:t>
-      </w:r>
-      <w:r>
-        <w:rPr>
-          <w:rFonts w:ascii="Segoe UI Emoji" w:hAnsi="Segoe UI Emoji" w:cs="Segoe UI Emoji"/>
-          <w:b/>
-          <w:bCs/>
-          <w:sz w:val="24"/>
-          <w:szCs w:val="24"/>
-        </w:rPr>
-        <w:t>💬</w:t>
-      </w:r>
-      <w:r>
-        <w:rPr>
-          <w:rFonts w:ascii="Times New Roman" w:hAnsi="Times New Roman" w:cs="Times New Roman"/>
-          <w:b/>
-          <w:bCs/>
-          <w:sz w:val="24"/>
-          <w:szCs w:val="24"/>
-        </w:rPr>
-        <w:t xml:space="preserve"> WhatsApp»</w:t>
-      </w:r>
-      <w:r>
-        <w:rPr>
-          <w:rFonts w:ascii="Times New Roman" w:hAnsi="Times New Roman" w:cs="Times New Roman"/>
-          <w:sz w:val="24"/>
-          <w:szCs w:val="24"/>
-        </w:rPr>
-        <w:t>. Se abrirá WhatsApp con el mensaje automático listo indicando fecha, hora, tipo de equipo y técnico.</w:t>
-      </w:r>
-    </w:p>
-    <w:p>
-      <w:pPr>
-        <w:numPr>
-          <w:ilvl w:val="1"/>
-          <w:numId w:val="22"/>
-        </w:numPr>
-        <w:rPr>
-          <w:rFonts w:ascii="Times New Roman" w:hAnsi="Times New Roman" w:cs="Times New Roman"/>
-          <w:sz w:val="24"/>
-          <w:szCs w:val="24"/>
-        </w:rPr>
-      </w:pPr>
-      <w:r>
-        <w:rPr>
-          <w:rFonts w:ascii="Times New Roman" w:hAnsi="Times New Roman" w:cs="Times New Roman"/>
-          <w:b/>
-          <w:bCs/>
-          <w:sz w:val="24"/>
-          <w:szCs w:val="24"/>
-        </w:rPr>
-        <w:t>Recordatorio de Mantenimiento:</w:t>
-      </w:r>
-      <w:r>
-        <w:rPr>
-          <w:rFonts w:ascii="Times New Roman" w:hAnsi="Times New Roman" w:cs="Times New Roman"/>
-          <w:sz w:val="24"/>
-          <w:szCs w:val="24"/>
-        </w:rPr>
-        <w:t xml:space="preserve"> Ve a </w:t>
-      </w:r>
-      <w:r>
-        <w:rPr>
-          <w:rFonts w:ascii="Times New Roman" w:hAnsi="Times New Roman" w:cs="Times New Roman"/>
-          <w:b/>
-          <w:bCs/>
-          <w:sz w:val="24"/>
-          <w:szCs w:val="24"/>
-        </w:rPr>
-        <w:t>Recordatorios</w:t>
-      </w:r>
-      <w:r>
-        <w:rPr>
-          <w:rFonts w:ascii="Times New Roman" w:hAnsi="Times New Roman" w:cs="Times New Roman"/>
-          <w:sz w:val="24"/>
-          <w:szCs w:val="24"/>
-        </w:rPr>
-        <w:t xml:space="preserve"> </w:t>
-      </w:r>
-      <w:r>
-        <w:rPr>
-          <w:rFonts w:ascii="Segoe UI Emoji" w:hAnsi="Segoe UI Emoji" w:cs="Segoe UI Emoji"/>
-          <w:sz w:val="24"/>
-          <w:szCs w:val="24"/>
-        </w:rPr>
-        <w:t>➡️</w:t>
-      </w:r>
-      <w:r>
-        <w:rPr>
-          <w:rFonts w:ascii="Times New Roman" w:hAnsi="Times New Roman" w:cs="Times New Roman"/>
-          <w:sz w:val="24"/>
-          <w:szCs w:val="24"/>
-        </w:rPr>
-        <w:t xml:space="preserve"> Pulsa </w:t>
-      </w:r>
-      <w:r>
-        <w:rPr>
-          <w:rFonts w:ascii="Times New Roman" w:hAnsi="Times New Roman" w:cs="Times New Roman"/>
-          <w:b/>
-          <w:bCs/>
-          <w:sz w:val="24"/>
-          <w:szCs w:val="24"/>
-        </w:rPr>
-        <w:t>«</w:t>
-      </w:r>
-      <w:r>
-        <w:rPr>
-          <w:rFonts w:ascii="Segoe UI Emoji" w:hAnsi="Segoe UI Emoji" w:cs="Segoe UI Emoji"/>
-          <w:b/>
-          <w:bCs/>
-          <w:sz w:val="24"/>
-          <w:szCs w:val="24"/>
-        </w:rPr>
-        <w:t>📱</w:t>
-      </w:r>
-      <w:r>
-        <w:rPr>
-          <w:rFonts w:ascii="Times New Roman" w:hAnsi="Times New Roman" w:cs="Times New Roman"/>
-          <w:b/>
-          <w:bCs/>
-          <w:sz w:val="24"/>
-          <w:szCs w:val="24"/>
-        </w:rPr>
-        <w:t xml:space="preserve"> WhatsApp»</w:t>
-      </w:r>
-      <w:r>
-        <w:rPr>
-          <w:rFonts w:ascii="Times New Roman" w:hAnsi="Times New Roman" w:cs="Times New Roman"/>
-          <w:sz w:val="24"/>
-          <w:szCs w:val="24"/>
-        </w:rPr>
-        <w:t xml:space="preserve"> en un aire acondicionado para abrir el mensaje de mantenimiento preventivo.</w:t>
-      </w:r>
-    </w:p>
-    <w:p>
-      <w:pPr>
-        <w:numPr>
-          <w:ilvl w:val="1"/>
-          <w:numId w:val="22"/>
-        </w:numPr>
-        <w:rPr>
-          <w:rFonts w:ascii="Times New Roman" w:hAnsi="Times New Roman" w:cs="Times New Roman"/>
-          <w:sz w:val="24"/>
-          <w:szCs w:val="24"/>
-        </w:rPr>
-      </w:pPr>
-      <w:r>
-        <w:rPr>
-          <w:rFonts w:ascii="Times New Roman" w:hAnsi="Times New Roman" w:cs="Times New Roman"/>
-          <w:b/>
-          <w:bCs/>
-          <w:sz w:val="24"/>
-          <w:szCs w:val="24"/>
-        </w:rPr>
-        <w:t>Envío de Factura:</w:t>
-      </w:r>
-      <w:r>
-        <w:rPr>
-          <w:rFonts w:ascii="Times New Roman" w:hAnsi="Times New Roman" w:cs="Times New Roman"/>
-          <w:sz w:val="24"/>
-          <w:szCs w:val="24"/>
-        </w:rPr>
-        <w:t xml:space="preserve"> Ve a </w:t>
-      </w:r>
-      <w:r>
-        <w:rPr>
-          <w:rFonts w:ascii="Times New Roman" w:hAnsi="Times New Roman" w:cs="Times New Roman"/>
-          <w:b/>
-          <w:bCs/>
-          <w:sz w:val="24"/>
-          <w:szCs w:val="24"/>
-        </w:rPr>
-        <w:t>Facturación</w:t>
-      </w:r>
-      <w:r>
-        <w:rPr>
-          <w:rFonts w:ascii="Times New Roman" w:hAnsi="Times New Roman" w:cs="Times New Roman"/>
-          <w:sz w:val="24"/>
-          <w:szCs w:val="24"/>
-        </w:rPr>
-        <w:t xml:space="preserve"> </w:t>
-      </w:r>
-      <w:r>
-        <w:rPr>
-          <w:rFonts w:ascii="Segoe UI Emoji" w:hAnsi="Segoe UI Emoji" w:cs="Segoe UI Emoji"/>
-          <w:sz w:val="24"/>
-          <w:szCs w:val="24"/>
-        </w:rPr>
-        <w:t>➡️</w:t>
-      </w:r>
-      <w:r>
-        <w:rPr>
-          <w:rFonts w:ascii="Times New Roman" w:hAnsi="Times New Roman" w:cs="Times New Roman"/>
-          <w:sz w:val="24"/>
-          <w:szCs w:val="24"/>
-        </w:rPr>
-        <w:t xml:space="preserve"> Abre la factura </w:t>
-      </w:r>
-      <w:r>
-        <w:rPr>
-          <w:rFonts w:ascii="Segoe UI Emoji" w:hAnsi="Segoe UI Emoji" w:cs="Segoe UI Emoji"/>
-          <w:sz w:val="24"/>
-          <w:szCs w:val="24"/>
-        </w:rPr>
-        <w:t>➡️</w:t>
-      </w:r>
-      <w:r>
-        <w:rPr>
-          <w:rFonts w:ascii="Times New Roman" w:hAnsi="Times New Roman" w:cs="Times New Roman"/>
-          <w:sz w:val="24"/>
-          <w:szCs w:val="24"/>
-        </w:rPr>
-        <w:t xml:space="preserve"> Pulsa </w:t>
-      </w:r>
-      <w:r>
-        <w:rPr>
-          <w:rFonts w:ascii="Times New Roman" w:hAnsi="Times New Roman" w:cs="Times New Roman"/>
-          <w:b/>
-          <w:bCs/>
-          <w:sz w:val="24"/>
-          <w:szCs w:val="24"/>
-        </w:rPr>
-        <w:t>«WhatsApp»</w:t>
-      </w:r>
-      <w:r>
-        <w:rPr>
-          <w:rFonts w:ascii="Times New Roman" w:hAnsi="Times New Roman" w:cs="Times New Roman"/>
-          <w:sz w:val="24"/>
-          <w:szCs w:val="24"/>
-        </w:rPr>
-        <w:t xml:space="preserve"> para compartir el monto y número de factura.</w:t>
-      </w:r>
-    </w:p>
-    <w:p>
-      <w:pPr>
-        <w:numPr>
-          <w:ilvl w:val="0"/>
-          <w:numId w:val="22"/>
-        </w:numPr>
-        <w:rPr>
-          <w:rFonts w:ascii="Times New Roman" w:hAnsi="Times New Roman" w:cs="Times New Roman"/>
-          <w:sz w:val="24"/>
-          <w:szCs w:val="24"/>
-        </w:rPr>
-      </w:pPr>
-      <w:r>
-        <w:rPr>
-          <w:rFonts w:ascii="Times New Roman" w:hAnsi="Times New Roman" w:cs="Times New Roman"/>
-          <w:sz w:val="24"/>
-          <w:szCs w:val="24"/>
-        </w:rPr>
-        <w:t>En WhatsApp solo tienes que presionar la flecha de enviar.</w:t>
-      </w:r>
-    </w:p>
-    <w:p>
-      <w:pPr>
-        <w:rPr>
-          <w:rFonts w:ascii="Times New Roman" w:hAnsi="Times New Roman" w:cs="Times New Roman"/>
-          <w:sz w:val="24"/>
-          <w:szCs w:val="24"/>
-        </w:rPr>
-      </w:pPr>
-      <w:r>
-        <w:rPr>
-          <w:rFonts w:ascii="Times New Roman" w:hAnsi="Times New Roman" w:cs="Times New Roman"/>
-          <w:sz w:val="24"/>
-          <w:szCs w:val="24"/>
-        </w:rPr>
-        <w:pict w14:anchorId="15BFBCF5">
-          <v:rect id="_x0000_i1281" style="width:6in;height:.75pt" o:hralign="center" o:hrstd="t" o:hr="t" fillcolor="#a0a0a0" stroked="f"/>
-        </w:pict>
-      </w:r>
-    </w:p>
-    <w:p>
-      <w:pPr>
-        <w:rPr>
-          <w:rFonts w:ascii="Times New Roman" w:hAnsi="Times New Roman" w:cs="Times New Roman"/>
-          <w:b/>
-          <w:bCs/>
-          <w:sz w:val="24"/>
-          <w:szCs w:val="24"/>
-        </w:rPr>
-      </w:pPr>
-      <w:r>
-        <w:rPr>
-          <w:rFonts w:ascii="Segoe UI Emoji" w:hAnsi="Segoe UI Emoji" w:cs="Segoe UI Emoji"/>
-          <w:b/>
-          <w:bCs/>
-          <w:sz w:val="24"/>
-          <w:szCs w:val="24"/>
-        </w:rPr>
-        <w:t>🗑️</w:t>
-      </w:r>
-      <w:r>
-        <w:rPr>
-          <w:rFonts w:ascii="Times New Roman" w:hAnsi="Times New Roman" w:cs="Times New Roman"/>
-          <w:b/>
-          <w:bCs/>
-          <w:sz w:val="24"/>
-          <w:szCs w:val="24"/>
-        </w:rPr>
-        <w:t xml:space="preserve"> 6. Datos de Demostración vs. Datos Reales del Negocio</w:t>
-      </w:r>
-    </w:p>
-    <w:p>
-      <w:pPr>
-        <w:numPr>
-          <w:ilvl w:val="0"/>
-          <w:numId w:val="23"/>
-        </w:numPr>
-        <w:rPr>
-          <w:rFonts w:ascii="Times New Roman" w:hAnsi="Times New Roman" w:cs="Times New Roman"/>
-          <w:sz w:val="24"/>
-          <w:szCs w:val="24"/>
-        </w:rPr>
-      </w:pPr>
-      <w:r>
-        <w:rPr>
-          <w:rFonts w:ascii="Times New Roman" w:hAnsi="Times New Roman" w:cs="Times New Roman"/>
-          <w:b/>
-          <w:bCs/>
-          <w:sz w:val="24"/>
-          <w:szCs w:val="24"/>
-        </w:rPr>
-        <w:t>¿Se borran los datos de prueba al instalar la app?</w:t>
-      </w:r>
-      <w:r>
-        <w:rPr>
-          <w:rFonts w:ascii="Times New Roman" w:hAnsi="Times New Roman" w:cs="Times New Roman"/>
-          <w:sz w:val="24"/>
-          <w:szCs w:val="24"/>
-        </w:rPr>
-        <w:br/>
-        <w:t>No se borran solos. La app incluye datos de ejemplo (gráficos, 6 clientes y servicios) para que puedas explorar todas las funciones antes de usarla en tu día a día.</w:t>
-      </w:r>
-    </w:p>
-    <w:p>
-      <w:pPr>
-        <w:numPr>
-          <w:ilvl w:val="0"/>
-          <w:numId w:val="23"/>
-        </w:numPr>
-        <w:rPr>
-          <w:rFonts w:ascii="Times New Roman" w:hAnsi="Times New Roman" w:cs="Times New Roman"/>
-          <w:sz w:val="24"/>
-          <w:szCs w:val="24"/>
-        </w:rPr>
-      </w:pPr>
-      <w:r>
-        <w:rPr>
-          <w:rFonts w:ascii="Times New Roman" w:hAnsi="Times New Roman" w:cs="Times New Roman"/>
-          <w:b/>
-          <w:bCs/>
-          <w:sz w:val="24"/>
-          <w:szCs w:val="24"/>
-        </w:rPr>
-        <w:t>¿Cómo empezar de cero con tus datos reales?</w:t>
-      </w:r>
-      <w:r>
-        <w:rPr>
-          <w:rFonts w:ascii="Times New Roman" w:hAnsi="Times New Roman" w:cs="Times New Roman"/>
-          <w:sz w:val="24"/>
-          <w:szCs w:val="24"/>
-        </w:rPr>
-        <w:br/>
-        <w:t xml:space="preserve">Cuando estés listo para cargar tus clientes verdaderos: </w:t>
-      </w:r>
-    </w:p>
-    <w:p>
-      <w:pPr>
-        <w:numPr>
-          <w:ilvl w:val="1"/>
-          <w:numId w:val="23"/>
-        </w:numPr>
-        <w:rPr>
-          <w:rFonts w:ascii="Times New Roman" w:hAnsi="Times New Roman" w:cs="Times New Roman"/>
-          <w:sz w:val="24"/>
-          <w:szCs w:val="24"/>
-        </w:rPr>
-      </w:pPr>
-      <w:r>
-        <w:rPr>
-          <w:rFonts w:ascii="Times New Roman" w:hAnsi="Times New Roman" w:cs="Times New Roman"/>
-          <w:sz w:val="24"/>
-          <w:szCs w:val="24"/>
-        </w:rPr>
-        <w:t xml:space="preserve">Ve a </w:t>
-      </w:r>
-      <w:r>
-        <w:rPr>
-          <w:rFonts w:ascii="Times New Roman" w:hAnsi="Times New Roman" w:cs="Times New Roman"/>
-          <w:b/>
-          <w:bCs/>
-          <w:sz w:val="24"/>
-          <w:szCs w:val="24"/>
-        </w:rPr>
-        <w:t>Configuración</w:t>
-      </w:r>
-      <w:r>
-        <w:rPr>
-          <w:rFonts w:ascii="Times New Roman" w:hAnsi="Times New Roman" w:cs="Times New Roman"/>
-          <w:sz w:val="24"/>
-          <w:szCs w:val="24"/>
-        </w:rPr>
-        <w:t xml:space="preserve"> (engranaje).</w:t>
-      </w:r>
-    </w:p>
-    <w:p>
-      <w:pPr>
-        <w:numPr>
-          <w:ilvl w:val="1"/>
-          <w:numId w:val="23"/>
-        </w:numPr>
-        <w:rPr>
-          <w:rFonts w:ascii="Times New Roman" w:hAnsi="Times New Roman" w:cs="Times New Roman"/>
-          <w:sz w:val="24"/>
-          <w:szCs w:val="24"/>
-        </w:rPr>
-      </w:pPr>
-      <w:r>
-        <w:rPr>
-          <w:rFonts w:ascii="Times New Roman" w:hAnsi="Times New Roman" w:cs="Times New Roman"/>
-          <w:sz w:val="24"/>
-          <w:szCs w:val="24"/>
-        </w:rPr>
-        <w:t xml:space="preserve">Al final, en </w:t>
-      </w:r>
-      <w:r>
-        <w:rPr>
-          <w:rFonts w:ascii="Times New Roman" w:hAnsi="Times New Roman" w:cs="Times New Roman"/>
-          <w:i/>
-          <w:iCs/>
-          <w:sz w:val="24"/>
-          <w:szCs w:val="24"/>
-        </w:rPr>
-        <w:t>Mantenimiento de la Aplicación</w:t>
-      </w:r>
-      <w:r>
-        <w:rPr>
-          <w:rFonts w:ascii="Times New Roman" w:hAnsi="Times New Roman" w:cs="Times New Roman"/>
-          <w:sz w:val="24"/>
-          <w:szCs w:val="24"/>
-        </w:rPr>
-        <w:t xml:space="preserve">, pulsa el botón rojo </w:t>
-      </w:r>
-      <w:r>
-        <w:rPr>
-          <w:rFonts w:ascii="Times New Roman" w:hAnsi="Times New Roman" w:cs="Times New Roman"/>
-          <w:b/>
-          <w:bCs/>
-          <w:sz w:val="24"/>
-          <w:szCs w:val="24"/>
-        </w:rPr>
-        <w:t>«</w:t>
-      </w:r>
-      <w:r>
-        <w:rPr>
-          <w:rFonts w:ascii="Segoe UI Emoji" w:hAnsi="Segoe UI Emoji" w:cs="Segoe UI Emoji"/>
-          <w:b/>
-          <w:bCs/>
-          <w:sz w:val="24"/>
-          <w:szCs w:val="24"/>
-        </w:rPr>
-        <w:t>🗑️</w:t>
-      </w:r>
-      <w:r>
-        <w:rPr>
-          <w:rFonts w:ascii="Times New Roman" w:hAnsi="Times New Roman" w:cs="Times New Roman"/>
-          <w:b/>
-          <w:bCs/>
-          <w:sz w:val="24"/>
-          <w:szCs w:val="24"/>
-        </w:rPr>
-        <w:t xml:space="preserve"> Limpiar datos de demostración (Empezar de cero)»</w:t>
-      </w:r>
-      <w:r>
-        <w:rPr>
-          <w:rFonts w:ascii="Times New Roman" w:hAnsi="Times New Roman" w:cs="Times New Roman"/>
-          <w:sz w:val="24"/>
-          <w:szCs w:val="24"/>
-        </w:rPr>
-        <w:t>.</w:t>
-      </w:r>
-    </w:p>
-    <w:p>
-      <w:pPr>
-        <w:numPr>
-          <w:ilvl w:val="1"/>
-          <w:numId w:val="23"/>
+          <w:numId w:val="30"/>
         </w:numPr>
         <w:rPr>
           <w:rFonts w:ascii="Times New Roman" w:hAnsi="Times New Roman" w:cs="Times New Roman"/>
@@ -2671,15 +2657,47 @@
           <w:szCs w:val="24"/>
         </w:rPr>
       </w:pPr>
+      <w:r>
+        <w:rPr>
+          <w:rFonts w:ascii="Times New Roman" w:hAnsi="Times New Roman" w:cs="Times New Roman"/>
+          <w:sz w:val="24"/>
+          <w:szCs w:val="24"/>
+        </w:rPr>
+        <w:pict w14:anchorId="4024A0C8">
+          <v:rect id="_x0000_i1345" style="width:396pt;height:.75pt" o:hralign="center" o:hrstd="t" o:hr="t" fillcolor="#a0a0a0" stroked="f"/>
+        </w:pict>
+      </w:r>
     </w:p>
     <w:p>
       <w:pPr>
         <w:rPr>
           <w:rFonts w:ascii="Times New Roman" w:hAnsi="Times New Roman" w:cs="Times New Roman"/>
-          <w:sz w:val="24"/>
-          <w:szCs w:val="24"/>
-        </w:rPr>
-      </w:pPr>
+          <w:b/>
+          <w:bCs/>
+          <w:sz w:val="24"/>
+          <w:szCs w:val="24"/>
+        </w:rPr>
+      </w:pPr>
+      <w:r>
+        <w:rPr>
+          <w:rFonts w:ascii="Segoe UI Emoji" w:hAnsi="Segoe UI Emoji" w:cs="Segoe UI Emoji"/>
+          <w:b/>
+          <w:bCs/>
+          <w:sz w:val="24"/>
+          <w:szCs w:val="24"/>
+        </w:rPr>
+        <w:t>⚡</w:t>
+      </w:r>
+      <w:r>
+        <w:rPr>
+          <w:rFonts w:ascii="Times New Roman" w:hAnsi="Times New Roman" w:cs="Times New Roman"/>
+          <w:b/>
+          <w:bCs/>
+          <w:sz w:val="24"/>
+          <w:szCs w:val="24"/>
+        </w:rPr>
+        <w:t xml:space="preserve"> 7. Registro sin Internet (Modo Offline)</w:t>
+      </w:r>
     </w:p>
     <w:p>
       <w:pPr>
@@ -2689,89 +2707,80 @@
           <w:szCs w:val="24"/>
         </w:rPr>
       </w:pPr>
+      <w:r>
+        <w:rPr>
+          <w:rFonts w:ascii="Times New Roman" w:hAnsi="Times New Roman" w:cs="Times New Roman"/>
+          <w:sz w:val="24"/>
+          <w:szCs w:val="24"/>
+        </w:rPr>
+        <w:t>Si te encuentras en un área sin señal, sótano o sin internet:</w:t>
+      </w:r>
     </w:p>
     <w:p>
       <w:pPr>
-        <w:rPr>
-          <w:rFonts w:ascii="Times New Roman" w:hAnsi="Times New Roman" w:cs="Times New Roman"/>
-          <w:sz w:val="24"/>
-          <w:szCs w:val="24"/>
-        </w:rPr>
-      </w:pPr>
+        <w:numPr>
+          <w:ilvl w:val="0"/>
+          <w:numId w:val="31"/>
+        </w:numPr>
+        <w:rPr>
+          <w:rFonts w:ascii="Times New Roman" w:hAnsi="Times New Roman" w:cs="Times New Roman"/>
+          <w:sz w:val="24"/>
+          <w:szCs w:val="24"/>
+        </w:rPr>
+      </w:pPr>
+      <w:r>
+        <w:rPr>
+          <w:rFonts w:ascii="Times New Roman" w:hAnsi="Times New Roman" w:cs="Times New Roman"/>
+          <w:sz w:val="24"/>
+          <w:szCs w:val="24"/>
+        </w:rPr>
+        <w:t>Puedes seguir abriendo la aplicación, registrando nuevos clientes, tomando coordenadas GPS y creando órdenes de trabajo.</w:t>
+      </w:r>
     </w:p>
     <w:p>
       <w:pPr>
-        <w:rPr>
-          <w:rFonts w:ascii="Times New Roman" w:hAnsi="Times New Roman" w:cs="Times New Roman"/>
-          <w:sz w:val="24"/>
-          <w:szCs w:val="24"/>
-        </w:rPr>
-      </w:pPr>
-      <w:r>
-        <w:rPr>
-          <w:rFonts w:ascii="Times New Roman" w:hAnsi="Times New Roman" w:cs="Times New Roman"/>
-          <w:sz w:val="24"/>
-          <w:szCs w:val="24"/>
-        </w:rPr>
-        <w:lastRenderedPageBreak/>
-        <w:pict w14:anchorId="77C0C696">
-          <v:rect id="_x0000_i1282" style="width:396pt;height:.75pt" o:hralign="center" o:hrstd="t" o:hr="t" fillcolor="#a0a0a0" stroked="f"/>
-        </w:pict>
+        <w:numPr>
+          <w:ilvl w:val="0"/>
+          <w:numId w:val="31"/>
+        </w:numPr>
+        <w:rPr>
+          <w:rFonts w:ascii="Times New Roman" w:hAnsi="Times New Roman" w:cs="Times New Roman"/>
+          <w:sz w:val="24"/>
+          <w:szCs w:val="24"/>
+        </w:rPr>
+      </w:pPr>
+      <w:r>
+        <w:rPr>
+          <w:rFonts w:ascii="Times New Roman" w:hAnsi="Times New Roman" w:cs="Times New Roman"/>
+          <w:sz w:val="24"/>
+          <w:szCs w:val="24"/>
+        </w:rPr>
+        <w:t xml:space="preserve">La aplicación guardará todo en el dispositivo y mostrará un aviso de </w:t>
+      </w:r>
+      <w:r>
+        <w:rPr>
+          <w:rFonts w:ascii="Times New Roman" w:hAnsi="Times New Roman" w:cs="Times New Roman"/>
+          <w:b/>
+          <w:bCs/>
+          <w:sz w:val="24"/>
+          <w:szCs w:val="24"/>
+        </w:rPr>
+        <w:t>"Registros pendientes de sincronización"</w:t>
+      </w:r>
+      <w:r>
+        <w:rPr>
+          <w:rFonts w:ascii="Times New Roman" w:hAnsi="Times New Roman" w:cs="Times New Roman"/>
+          <w:sz w:val="24"/>
+          <w:szCs w:val="24"/>
+        </w:rPr>
+        <w:t>.</w:t>
       </w:r>
     </w:p>
     <w:p>
       <w:pPr>
-        <w:rPr>
-          <w:rFonts w:ascii="Times New Roman" w:hAnsi="Times New Roman" w:cs="Times New Roman"/>
-          <w:b/>
-          <w:bCs/>
-          <w:sz w:val="24"/>
-          <w:szCs w:val="24"/>
-        </w:rPr>
-      </w:pPr>
-      <w:r>
-        <w:rPr>
-          <w:rFonts w:ascii="Segoe UI Emoji" w:hAnsi="Segoe UI Emoji" w:cs="Segoe UI Emoji"/>
-          <w:b/>
-          <w:bCs/>
-          <w:sz w:val="24"/>
-          <w:szCs w:val="24"/>
-        </w:rPr>
-        <w:t>⚡</w:t>
-      </w:r>
-      <w:r>
-        <w:rPr>
-          <w:rFonts w:ascii="Times New Roman" w:hAnsi="Times New Roman" w:cs="Times New Roman"/>
-          <w:b/>
-          <w:bCs/>
-          <w:sz w:val="24"/>
-          <w:szCs w:val="24"/>
-        </w:rPr>
-        <w:t xml:space="preserve"> 7. Registro sin Internet (Modo Offline)</w:t>
-      </w:r>
-    </w:p>
-    <w:p>
-      <w:pPr>
-        <w:rPr>
-          <w:rFonts w:ascii="Times New Roman" w:hAnsi="Times New Roman" w:cs="Times New Roman"/>
-          <w:sz w:val="24"/>
-          <w:szCs w:val="24"/>
-        </w:rPr>
-      </w:pPr>
-      <w:r>
-        <w:rPr>
-          <w:rFonts w:ascii="Times New Roman" w:hAnsi="Times New Roman" w:cs="Times New Roman"/>
-          <w:sz w:val="24"/>
-          <w:szCs w:val="24"/>
-        </w:rPr>
-        <w:t>Si te encuentras en un área sin señal, sótano o sin internet:</w:t>
-      </w:r>
-    </w:p>
-    <w:p>
-      <w:pPr>
         <w:numPr>
           <w:ilvl w:val="0"/>
-          <w:numId w:val="24"/>
+          <w:numId w:val="31"/>
         </w:numPr>
         <w:rPr>
           <w:rFonts w:ascii="Times New Roman" w:hAnsi="Times New Roman" w:cs="Times New Roman"/>
@@ -2785,66 +2794,7 @@
           <w:sz w:val="24"/>
           <w:szCs w:val="24"/>
         </w:rPr>
-        <w:t>Puedes seguir abriendo la aplicación, registrando nuevos clientes, tomando coordenadas GPS y creando órdenes de trabajo.</w:t>
-      </w:r>
-    </w:p>
-    <w:p>
-      <w:pPr>
-        <w:numPr>
-          <w:ilvl w:val="0"/>
-          <w:numId w:val="24"/>
-        </w:numPr>
-        <w:rPr>
-          <w:rFonts w:ascii="Times New Roman" w:hAnsi="Times New Roman" w:cs="Times New Roman"/>
-          <w:sz w:val="24"/>
-          <w:szCs w:val="24"/>
-        </w:rPr>
-      </w:pPr>
-      <w:r>
-        <w:rPr>
-          <w:rFonts w:ascii="Times New Roman" w:hAnsi="Times New Roman" w:cs="Times New Roman"/>
-          <w:sz w:val="24"/>
-          <w:szCs w:val="24"/>
-        </w:rPr>
-        <w:t xml:space="preserve">La aplicación guardará todo en el dispositivo y mostrará un aviso de </w:t>
-      </w:r>
-      <w:r>
-        <w:rPr>
-          <w:rFonts w:ascii="Times New Roman" w:hAnsi="Times New Roman" w:cs="Times New Roman"/>
-          <w:b/>
-          <w:bCs/>
-          <w:sz w:val="24"/>
-          <w:szCs w:val="24"/>
-        </w:rPr>
-        <w:t>"Registros pendientes de sincronización"</w:t>
-      </w:r>
-      <w:r>
-        <w:rPr>
-          <w:rFonts w:ascii="Times New Roman" w:hAnsi="Times New Roman" w:cs="Times New Roman"/>
-          <w:sz w:val="24"/>
-          <w:szCs w:val="24"/>
-        </w:rPr>
-        <w:t>.</w:t>
-      </w:r>
-    </w:p>
-    <w:p>
-      <w:pPr>
-        <w:numPr>
-          <w:ilvl w:val="0"/>
-          <w:numId w:val="24"/>
-        </w:numPr>
-        <w:rPr>
-          <w:rFonts w:ascii="Times New Roman" w:hAnsi="Times New Roman" w:cs="Times New Roman"/>
-          <w:sz w:val="24"/>
-          <w:szCs w:val="24"/>
-        </w:rPr>
-      </w:pPr>
-      <w:r>
-        <w:rPr>
-          <w:rFonts w:ascii="Times New Roman" w:hAnsi="Times New Roman" w:cs="Times New Roman"/>
-          <w:sz w:val="24"/>
-          <w:szCs w:val="24"/>
-        </w:rPr>
+        <w:lastRenderedPageBreak/>
         <w:t xml:space="preserve">Al volver a conectarte a </w:t>
       </w:r>
       <w:proofErr w:type="spellStart"/>
@@ -3263,6 +3213,119 @@
     </w:lvl>
   </w:abstractNum>
   <w:abstractNum w:abstractNumId="3" w15:restartNumberingAfterBreak="0">
+    <w:nsid w:val="0F3461A8"/>
+    <w:multiLevelType w:val="multilevel"/>
+    <w:tmpl w:val="4AA4CF7C"/>
+    <w:lvl w:ilvl="0">
+      <w:start w:val="1"/>
+      <w:numFmt w:val="decimal"/>
+      <w:lvlText w:val="%1."/>
+      <w:lvlJc w:val="left"/>
+      <w:pPr>
+        <w:tabs>
+          <w:tab w:val="num" w:pos="720"/>
+        </w:tabs>
+        <w:ind w:left="720" w:hanging="360"/>
+      </w:pPr>
+    </w:lvl>
+    <w:lvl w:ilvl="1" w:tentative="1">
+      <w:start w:val="1"/>
+      <w:numFmt w:val="decimal"/>
+      <w:lvlText w:val="%2."/>
+      <w:lvlJc w:val="left"/>
+      <w:pPr>
+        <w:tabs>
+          <w:tab w:val="num" w:pos="1440"/>
+        </w:tabs>
+        <w:ind w:left="1440" w:hanging="360"/>
+      </w:pPr>
+    </w:lvl>
+    <w:lvl w:ilvl="2" w:tentative="1">
+      <w:start w:val="1"/>
+      <w:numFmt w:val="decimal"/>
+      <w:lvlText w:val="%3."/>
+      <w:lvlJc w:val="left"/>
+      <w:pPr>
+        <w:tabs>
+          <w:tab w:val="num" w:pos="2160"/>
+        </w:tabs>
+        <w:ind w:left="2160" w:hanging="360"/>
+      </w:pPr>
+    </w:lvl>
+    <w:lvl w:ilvl="3" w:tentative="1">
+      <w:start w:val="1"/>
+      <w:numFmt w:val="decimal"/>
+      <w:lvlText w:val="%4."/>
+      <w:lvlJc w:val="left"/>
+      <w:pPr>
+        <w:tabs>
+          <w:tab w:val="num" w:pos="2880"/>
+        </w:tabs>
+        <w:ind w:left="2880" w:hanging="360"/>
+      </w:pPr>
+    </w:lvl>
+    <w:lvl w:ilvl="4" w:tentative="1">
+      <w:start w:val="1"/>
+      <w:numFmt w:val="decimal"/>
+      <w:lvlText w:val="%5."/>
+      <w:lvlJc w:val="left"/>
+      <w:pPr>
+        <w:tabs>
+          <w:tab w:val="num" w:pos="3600"/>
+        </w:tabs>
+        <w:ind w:left="3600" w:hanging="360"/>
+      </w:pPr>
+    </w:lvl>
+    <w:lvl w:ilvl="5" w:tentative="1">
+      <w:start w:val="1"/>
+      <w:numFmt w:val="decimal"/>
+      <w:lvlText w:val="%6."/>
+      <w:lvlJc w:val="left"/>
+      <w:pPr>
+        <w:tabs>
+          <w:tab w:val="num" w:pos="4320"/>
+        </w:tabs>
+        <w:ind w:left="4320" w:hanging="360"/>
+      </w:pPr>
+    </w:lvl>
+    <w:lvl w:ilvl="6" w:tentative="1">
+      <w:start w:val="1"/>
+      <w:numFmt w:val="decimal"/>
+      <w:lvlText w:val="%7."/>
+      <w:lvlJc w:val="left"/>
+      <w:pPr>
+        <w:tabs>
+          <w:tab w:val="num" w:pos="5040"/>
+        </w:tabs>
+        <w:ind w:left="5040" w:hanging="360"/>
+      </w:pPr>
+    </w:lvl>
+    <w:lvl w:ilvl="7" w:tentative="1">
+      <w:start w:val="1"/>
+      <w:numFmt w:val="decimal"/>
+      <w:lvlText w:val="%8."/>
+      <w:lvlJc w:val="left"/>
+      <w:pPr>
+        <w:tabs>
+          <w:tab w:val="num" w:pos="5760"/>
+        </w:tabs>
+        <w:ind w:left="5760" w:hanging="360"/>
+      </w:pPr>
+    </w:lvl>
+    <w:lvl w:ilvl="8" w:tentative="1">
+      <w:start w:val="1"/>
+      <w:numFmt w:val="decimal"/>
+      <w:lvlText w:val="%9."/>
+      <w:lvlJc w:val="left"/>
+      <w:pPr>
+        <w:tabs>
+          <w:tab w:val="num" w:pos="6480"/>
+        </w:tabs>
+        <w:ind w:left="6480" w:hanging="360"/>
+      </w:pPr>
+    </w:lvl>
+  </w:abstractNum>
+  <w:abstractNum w:abstractNumId="4" w15:restartNumberingAfterBreak="0">
     <w:nsid w:val="1C3E2710"/>
     <w:multiLevelType w:val="multilevel"/>
     <w:tmpl w:val="A1A016BA"/>
@@ -3379,7 +3442,7 @@
       </w:pPr>
     </w:lvl>
   </w:abstractNum>
-  <w:abstractNum w:abstractNumId="4" w15:restartNumberingAfterBreak="0">
+  <w:abstractNum w:abstractNumId="5" w15:restartNumberingAfterBreak="0">
     <w:nsid w:val="1C406EDC"/>
     <w:multiLevelType w:val="multilevel"/>
     <w:tmpl w:val="75C2EFCE"/>
@@ -3524,7 +3587,124 @@
       </w:rPr>
     </w:lvl>
   </w:abstractNum>
-  <w:abstractNum w:abstractNumId="5" w15:restartNumberingAfterBreak="0">
+  <w:abstractNum w:abstractNumId="6" w15:restartNumberingAfterBreak="0">
+    <w:nsid w:val="1ED8002C"/>
+    <w:multiLevelType w:val="multilevel"/>
+    <w:tmpl w:val="7DD4C2BE"/>
+    <w:lvl w:ilvl="0">
+      <w:start w:val="1"/>
+      <w:numFmt w:val="decimal"/>
+      <w:lvlText w:val="%1."/>
+      <w:lvlJc w:val="left"/>
+      <w:pPr>
+        <w:tabs>
+          <w:tab w:val="num" w:pos="720"/>
+        </w:tabs>
+        <w:ind w:left="720" w:hanging="360"/>
+      </w:pPr>
+    </w:lvl>
+    <w:lvl w:ilvl="1">
+      <w:start w:val="1"/>
+      <w:numFmt w:val="bullet"/>
+      <w:lvlText w:val="o"/>
+      <w:lvlJc w:val="left"/>
+      <w:pPr>
+        <w:tabs>
+          <w:tab w:val="num" w:pos="1440"/>
+        </w:tabs>
+        <w:ind w:left="1440" w:hanging="360"/>
+      </w:pPr>
+      <w:rPr>
+        <w:rFonts w:ascii="Courier New" w:hAnsi="Courier New" w:hint="default"/>
+        <w:sz w:val="20"/>
+      </w:rPr>
+    </w:lvl>
+    <w:lvl w:ilvl="2" w:tentative="1">
+      <w:start w:val="1"/>
+      <w:numFmt w:val="decimal"/>
+      <w:lvlText w:val="%3."/>
+      <w:lvlJc w:val="left"/>
+      <w:pPr>
+        <w:tabs>
+          <w:tab w:val="num" w:pos="2160"/>
+        </w:tabs>
+        <w:ind w:left="2160" w:hanging="360"/>
+      </w:pPr>
+    </w:lvl>
+    <w:lvl w:ilvl="3" w:tentative="1">
+      <w:start w:val="1"/>
+      <w:numFmt w:val="decimal"/>
+      <w:lvlText w:val="%4."/>
+      <w:lvlJc w:val="left"/>
+      <w:pPr>
+        <w:tabs>
+          <w:tab w:val="num" w:pos="2880"/>
+        </w:tabs>
+        <w:ind w:left="2880" w:hanging="360"/>
+      </w:pPr>
+    </w:lvl>
+    <w:lvl w:ilvl="4" w:tentative="1">
+      <w:start w:val="1"/>
+      <w:numFmt w:val="decimal"/>
+      <w:lvlText w:val="%5."/>
+      <w:lvlJc w:val="left"/>
+      <w:pPr>
+        <w:tabs>
+          <w:tab w:val="num" w:pos="3600"/>
+        </w:tabs>
+        <w:ind w:left="3600" w:hanging="360"/>
+      </w:pPr>
+    </w:lvl>
+    <w:lvl w:ilvl="5" w:tentative="1">
+      <w:start w:val="1"/>
+      <w:numFmt w:val="decimal"/>
+      <w:lvlText w:val="%6."/>
+      <w:lvlJc w:val="left"/>
+      <w:pPr>
+        <w:tabs>
+          <w:tab w:val="num" w:pos="4320"/>
+        </w:tabs>
+        <w:ind w:left="4320" w:hanging="360"/>
+      </w:pPr>
+    </w:lvl>
+    <w:lvl w:ilvl="6" w:tentative="1">
+      <w:start w:val="1"/>
+      <w:numFmt w:val="decimal"/>
+      <w:lvlText w:val="%7."/>
+      <w:lvlJc w:val="left"/>
+      <w:pPr>
+        <w:tabs>
+          <w:tab w:val="num" w:pos="5040"/>
+        </w:tabs>
+        <w:ind w:left="5040" w:hanging="360"/>
+      </w:pPr>
+    </w:lvl>
+    <w:lvl w:ilvl="7" w:tentative="1">
+      <w:start w:val="1"/>
+      <w:numFmt w:val="decimal"/>
+      <w:lvlText w:val="%8."/>
+      <w:lvlJc w:val="left"/>
+      <w:pPr>
+        <w:tabs>
+          <w:tab w:val="num" w:pos="5760"/>
+        </w:tabs>
+        <w:ind w:left="5760" w:hanging="360"/>
+      </w:pPr>
+    </w:lvl>
+    <w:lvl w:ilvl="8" w:tentative="1">
+      <w:start w:val="1"/>
+      <w:numFmt w:val="decimal"/>
+      <w:lvlText w:val="%9."/>
+      <w:lvlJc w:val="left"/>
+      <w:pPr>
+        <w:tabs>
+          <w:tab w:val="num" w:pos="6480"/>
+        </w:tabs>
+        <w:ind w:left="6480" w:hanging="360"/>
+      </w:pPr>
+    </w:lvl>
+  </w:abstractNum>
+  <w:abstractNum w:abstractNumId="7" w15:restartNumberingAfterBreak="0">
     <w:nsid w:val="1EE57AF9"/>
     <w:multiLevelType w:val="multilevel"/>
     <w:tmpl w:val="FCEA453A"/>
@@ -3641,7 +3821,7 @@
       </w:pPr>
     </w:lvl>
   </w:abstractNum>
-  <w:abstractNum w:abstractNumId="6" w15:restartNumberingAfterBreak="0">
+  <w:abstractNum w:abstractNumId="8" w15:restartNumberingAfterBreak="0">
     <w:nsid w:val="2BD96018"/>
     <w:multiLevelType w:val="multilevel"/>
     <w:tmpl w:val="936864AE"/>
@@ -3754,7 +3934,120 @@
       </w:pPr>
     </w:lvl>
   </w:abstractNum>
-  <w:abstractNum w:abstractNumId="7" w15:restartNumberingAfterBreak="0">
+  <w:abstractNum w:abstractNumId="9" w15:restartNumberingAfterBreak="0">
+    <w:nsid w:val="2FC96324"/>
+    <w:multiLevelType w:val="multilevel"/>
+    <w:tmpl w:val="3C107A40"/>
+    <w:lvl w:ilvl="0">
+      <w:start w:val="1"/>
+      <w:numFmt w:val="decimal"/>
+      <w:lvlText w:val="%1."/>
+      <w:lvlJc w:val="left"/>
+      <w:pPr>
+        <w:tabs>
+          <w:tab w:val="num" w:pos="720"/>
+        </w:tabs>
+        <w:ind w:left="720" w:hanging="360"/>
+      </w:pPr>
+    </w:lvl>
+    <w:lvl w:ilvl="1" w:tentative="1">
+      <w:start w:val="1"/>
+      <w:numFmt w:val="decimal"/>
+      <w:lvlText w:val="%2."/>
+      <w:lvlJc w:val="left"/>
+      <w:pPr>
+        <w:tabs>
+          <w:tab w:val="num" w:pos="1440"/>
+        </w:tabs>
+        <w:ind w:left="1440" w:hanging="360"/>
+      </w:pPr>
+    </w:lvl>
+    <w:lvl w:ilvl="2" w:tentative="1">
+      <w:start w:val="1"/>
+      <w:numFmt w:val="decimal"/>
+      <w:lvlText w:val="%3."/>
+      <w:lvlJc w:val="left"/>
+      <w:pPr>
+        <w:tabs>
+          <w:tab w:val="num" w:pos="2160"/>
+        </w:tabs>
+        <w:ind w:left="2160" w:hanging="360"/>
+      </w:pPr>
+    </w:lvl>
+    <w:lvl w:ilvl="3" w:tentative="1">
+      <w:start w:val="1"/>
+      <w:numFmt w:val="decimal"/>
+      <w:lvlText w:val="%4."/>
+      <w:lvlJc w:val="left"/>
+      <w:pPr>
+        <w:tabs>
+          <w:tab w:val="num" w:pos="2880"/>
+        </w:tabs>
+        <w:ind w:left="2880" w:hanging="360"/>
+      </w:pPr>
+    </w:lvl>
+    <w:lvl w:ilvl="4" w:tentative="1">
+      <w:start w:val="1"/>
+      <w:numFmt w:val="decimal"/>
+      <w:lvlText w:val="%5."/>
+      <w:lvlJc w:val="left"/>
+      <w:pPr>
+        <w:tabs>
+          <w:tab w:val="num" w:pos="3600"/>
+        </w:tabs>
+        <w:ind w:left="3600" w:hanging="360"/>
+      </w:pPr>
+    </w:lvl>
+    <w:lvl w:ilvl="5" w:tentative="1">
+      <w:start w:val="1"/>
+      <w:numFmt w:val="decimal"/>
+      <w:lvlText w:val="%6."/>
+      <w:lvlJc w:val="left"/>
+      <w:pPr>
+        <w:tabs>
+          <w:tab w:val="num" w:pos="4320"/>
+        </w:tabs>
+        <w:ind w:left="4320" w:hanging="360"/>
+      </w:pPr>
+    </w:lvl>
+    <w:lvl w:ilvl="6" w:tentative="1">
+      <w:start w:val="1"/>
+      <w:numFmt w:val="decimal"/>
+      <w:lvlText w:val="%7."/>
+      <w:lvlJc w:val="left"/>
+      <w:pPr>
+        <w:tabs>
+          <w:tab w:val="num" w:pos="5040"/>
+        </w:tabs>
+        <w:ind w:left="5040" w:hanging="360"/>
+      </w:pPr>
+    </w:lvl>
+    <w:lvl w:ilvl="7" w:tentative="1">
+      <w:start w:val="1"/>
+      <w:numFmt w:val="decimal"/>
+      <w:lvlText w:val="%8."/>
+      <w:lvlJc w:val="left"/>
+      <w:pPr>
+        <w:tabs>
+          <w:tab w:val="num" w:pos="5760"/>
+        </w:tabs>
+        <w:ind w:left="5760" w:hanging="360"/>
+      </w:pPr>
+    </w:lvl>
+    <w:lvl w:ilvl="8" w:tentative="1">
+      <w:start w:val="1"/>
+      <w:numFmt w:val="decimal"/>
+      <w:lvlText w:val="%9."/>
+      <w:lvlJc w:val="left"/>
+      <w:pPr>
+        <w:tabs>
+          <w:tab w:val="num" w:pos="6480"/>
+        </w:tabs>
+        <w:ind w:left="6480" w:hanging="360"/>
+      </w:pPr>
+    </w:lvl>
+  </w:abstractNum>
+  <w:abstractNum w:abstractNumId="10" w15:restartNumberingAfterBreak="0">
     <w:nsid w:val="33406546"/>
     <w:multiLevelType w:val="multilevel"/>
     <w:tmpl w:val="07CA3C9A"/>
@@ -3903,7 +4196,124 @@
       </w:rPr>
     </w:lvl>
   </w:abstractNum>
-  <w:abstractNum w:abstractNumId="8" w15:restartNumberingAfterBreak="0">
+  <w:abstractNum w:abstractNumId="11" w15:restartNumberingAfterBreak="0">
+    <w:nsid w:val="33864CB4"/>
+    <w:multiLevelType w:val="multilevel"/>
+    <w:tmpl w:val="9DE8515A"/>
+    <w:lvl w:ilvl="0">
+      <w:start w:val="1"/>
+      <w:numFmt w:val="decimal"/>
+      <w:lvlText w:val="%1."/>
+      <w:lvlJc w:val="left"/>
+      <w:pPr>
+        <w:tabs>
+          <w:tab w:val="num" w:pos="720"/>
+        </w:tabs>
+        <w:ind w:left="720" w:hanging="360"/>
+      </w:pPr>
+    </w:lvl>
+    <w:lvl w:ilvl="1">
+      <w:start w:val="1"/>
+      <w:numFmt w:val="bullet"/>
+      <w:lvlText w:val="o"/>
+      <w:lvlJc w:val="left"/>
+      <w:pPr>
+        <w:tabs>
+          <w:tab w:val="num" w:pos="1440"/>
+        </w:tabs>
+        <w:ind w:left="1440" w:hanging="360"/>
+      </w:pPr>
+      <w:rPr>
+        <w:rFonts w:ascii="Courier New" w:hAnsi="Courier New" w:hint="default"/>
+        <w:sz w:val="20"/>
+      </w:rPr>
+    </w:lvl>
+    <w:lvl w:ilvl="2" w:tentative="1">
+      <w:start w:val="1"/>
+      <w:numFmt w:val="decimal"/>
+      <w:lvlText w:val="%3."/>
+      <w:lvlJc w:val="left"/>
+      <w:pPr>
+        <w:tabs>
+          <w:tab w:val="num" w:pos="2160"/>
+        </w:tabs>
+        <w:ind w:left="2160" w:hanging="360"/>
+      </w:pPr>
+    </w:lvl>
+    <w:lvl w:ilvl="3" w:tentative="1">
+      <w:start w:val="1"/>
+      <w:numFmt w:val="decimal"/>
+      <w:lvlText w:val="%4."/>
+      <w:lvlJc w:val="left"/>
+      <w:pPr>
+        <w:tabs>
+          <w:tab w:val="num" w:pos="2880"/>
+        </w:tabs>
+        <w:ind w:left="2880" w:hanging="360"/>
+      </w:pPr>
+    </w:lvl>
+    <w:lvl w:ilvl="4" w:tentative="1">
+      <w:start w:val="1"/>
+      <w:numFmt w:val="decimal"/>
+      <w:lvlText w:val="%5."/>
+      <w:lvlJc w:val="left"/>
+      <w:pPr>
+        <w:tabs>
+          <w:tab w:val="num" w:pos="3600"/>
+        </w:tabs>
+        <w:ind w:left="3600" w:hanging="360"/>
+      </w:pPr>
+    </w:lvl>
+    <w:lvl w:ilvl="5" w:tentative="1">
+      <w:start w:val="1"/>
+      <w:numFmt w:val="decimal"/>
+      <w:lvlText w:val="%6."/>
+      <w:lvlJc w:val="left"/>
+      <w:pPr>
+        <w:tabs>
+          <w:tab w:val="num" w:pos="4320"/>
+        </w:tabs>
+        <w:ind w:left="4320" w:hanging="360"/>
+      </w:pPr>
+    </w:lvl>
+    <w:lvl w:ilvl="6" w:tentative="1">
+      <w:start w:val="1"/>
+      <w:numFmt w:val="decimal"/>
+      <w:lvlText w:val="%7."/>
+      <w:lvlJc w:val="left"/>
+      <w:pPr>
+        <w:tabs>
+          <w:tab w:val="num" w:pos="5040"/>
+        </w:tabs>
+        <w:ind w:left="5040" w:hanging="360"/>
+      </w:pPr>
+    </w:lvl>
+    <w:lvl w:ilvl="7" w:tentative="1">
+      <w:start w:val="1"/>
+      <w:numFmt w:val="decimal"/>
+      <w:lvlText w:val="%8."/>
+      <w:lvlJc w:val="left"/>
+      <w:pPr>
+        <w:tabs>
+          <w:tab w:val="num" w:pos="5760"/>
+        </w:tabs>
+        <w:ind w:left="5760" w:hanging="360"/>
+      </w:pPr>
+    </w:lvl>
+    <w:lvl w:ilvl="8" w:tentative="1">
+      <w:start w:val="1"/>
+      <w:numFmt w:val="decimal"/>
+      <w:lvlText w:val="%9."/>
+      <w:lvlJc w:val="left"/>
+      <w:pPr>
+        <w:tabs>
+          <w:tab w:val="num" w:pos="6480"/>
+        </w:tabs>
+        <w:ind w:left="6480" w:hanging="360"/>
+      </w:pPr>
+    </w:lvl>
+  </w:abstractNum>
+  <w:abstractNum w:abstractNumId="12" w15:restartNumberingAfterBreak="0">
     <w:nsid w:val="383576D9"/>
     <w:multiLevelType w:val="multilevel"/>
     <w:tmpl w:val="6BBA2808"/>
@@ -4016,7 +4426,7 @@
       </w:pPr>
     </w:lvl>
   </w:abstractNum>
-  <w:abstractNum w:abstractNumId="9" w15:restartNumberingAfterBreak="0">
+  <w:abstractNum w:abstractNumId="13" w15:restartNumberingAfterBreak="0">
     <w:nsid w:val="397A4F63"/>
     <w:multiLevelType w:val="multilevel"/>
     <w:tmpl w:val="A4422A5C"/>
@@ -4161,7 +4571,7 @@
       </w:rPr>
     </w:lvl>
   </w:abstractNum>
-  <w:abstractNum w:abstractNumId="10" w15:restartNumberingAfterBreak="0">
+  <w:abstractNum w:abstractNumId="14" w15:restartNumberingAfterBreak="0">
     <w:nsid w:val="3BF60BD6"/>
     <w:multiLevelType w:val="multilevel"/>
     <w:tmpl w:val="6C4C279C"/>
@@ -4274,7 +4684,156 @@
       </w:pPr>
     </w:lvl>
   </w:abstractNum>
-  <w:abstractNum w:abstractNumId="11" w15:restartNumberingAfterBreak="0">
+  <w:abstractNum w:abstractNumId="15" w15:restartNumberingAfterBreak="0">
+    <w:nsid w:val="43B24C0A"/>
+    <w:multiLevelType w:val="multilevel"/>
+    <w:tmpl w:val="C1185F54"/>
+    <w:lvl w:ilvl="0">
+      <w:start w:val="1"/>
+      <w:numFmt w:val="bullet"/>
+      <w:lvlText w:val=""/>
+      <w:lvlJc w:val="left"/>
+      <w:pPr>
+        <w:tabs>
+          <w:tab w:val="num" w:pos="720"/>
+        </w:tabs>
+        <w:ind w:left="720" w:hanging="360"/>
+      </w:pPr>
+      <w:rPr>
+        <w:rFonts w:ascii="Symbol" w:hAnsi="Symbol" w:hint="default"/>
+        <w:sz w:val="20"/>
+      </w:rPr>
+    </w:lvl>
+    <w:lvl w:ilvl="1" w:tentative="1">
+      <w:start w:val="1"/>
+      <w:numFmt w:val="bullet"/>
+      <w:lvlText w:val="o"/>
+      <w:lvlJc w:val="left"/>
+      <w:pPr>
+        <w:tabs>
+          <w:tab w:val="num" w:pos="1440"/>
+        </w:tabs>
+        <w:ind w:left="1440" w:hanging="360"/>
+      </w:pPr>
+      <w:rPr>
+        <w:rFonts w:ascii="Courier New" w:hAnsi="Courier New" w:hint="default"/>
+        <w:sz w:val="20"/>
+      </w:rPr>
+    </w:lvl>
+    <w:lvl w:ilvl="2" w:tentative="1">
+      <w:start w:val="1"/>
+      <w:numFmt w:val="bullet"/>
+      <w:lvlText w:val=""/>
+      <w:lvlJc w:val="left"/>
+      <w:pPr>
+        <w:tabs>
+          <w:tab w:val="num" w:pos="2160"/>
+        </w:tabs>
+        <w:ind w:left="2160" w:hanging="360"/>
+      </w:pPr>
+      <w:rPr>
+        <w:rFonts w:ascii="Wingdings" w:hAnsi="Wingdings" w:hint="default"/>
+        <w:sz w:val="20"/>
+      </w:rPr>
+    </w:lvl>
+    <w:lvl w:ilvl="3" w:tentative="1">
+      <w:start w:val="1"/>
+      <w:numFmt w:val="bullet"/>
+      <w:lvlText w:val=""/>
+      <w:lvlJc w:val="left"/>
+      <w:pPr>
+        <w:tabs>
+          <w:tab w:val="num" w:pos="2880"/>
+        </w:tabs>
+        <w:ind w:left="2880" w:hanging="360"/>
+      </w:pPr>
+      <w:rPr>
+        <w:rFonts w:ascii="Wingdings" w:hAnsi="Wingdings" w:hint="default"/>
+        <w:sz w:val="20"/>
+      </w:rPr>
+    </w:lvl>
+    <w:lvl w:ilvl="4" w:tentative="1">
+      <w:start w:val="1"/>
+      <w:numFmt w:val="bullet"/>
+      <w:lvlText w:val=""/>
+      <w:lvlJc w:val="left"/>
+      <w:pPr>
+        <w:tabs>
+          <w:tab w:val="num" w:pos="3600"/>
+        </w:tabs>
+        <w:ind w:left="3600" w:hanging="360"/>
+      </w:pPr>
+      <w:rPr>
+        <w:rFonts w:ascii="Wingdings" w:hAnsi="Wingdings" w:hint="default"/>
+        <w:sz w:val="20"/>
+      </w:rPr>
+    </w:lvl>
+    <w:lvl w:ilvl="5" w:tentative="1">
+      <w:start w:val="1"/>
+      <w:numFmt w:val="bullet"/>
+      <w:lvlText w:val=""/>
+      <w:lvlJc w:val="left"/>
+      <w:pPr>
+        <w:tabs>
+          <w:tab w:val="num" w:pos="4320"/>
+        </w:tabs>
+        <w:ind w:left="4320" w:hanging="360"/>
+      </w:pPr>
+      <w:rPr>
+        <w:rFonts w:ascii="Wingdings" w:hAnsi="Wingdings" w:hint="default"/>
+        <w:sz w:val="20"/>
+      </w:rPr>
+    </w:lvl>
+    <w:lvl w:ilvl="6" w:tentative="1">
+      <w:start w:val="1"/>
+      <w:numFmt w:val="bullet"/>
+      <w:lvlText w:val=""/>
+      <w:lvlJc w:val="left"/>
+      <w:pPr>
+        <w:tabs>
+          <w:tab w:val="num" w:pos="5040"/>
+        </w:tabs>
+        <w:ind w:left="5040" w:hanging="360"/>
+      </w:pPr>
+      <w:rPr>
+        <w:rFonts w:ascii="Wingdings" w:hAnsi="Wingdings" w:hint="default"/>
+        <w:sz w:val="20"/>
+      </w:rPr>
+    </w:lvl>
+    <w:lvl w:ilvl="7" w:tentative="1">
+      <w:start w:val="1"/>
+      <w:numFmt w:val="bullet"/>
+      <w:lvlText w:val=""/>
+      <w:lvlJc w:val="left"/>
+      <w:pPr>
+        <w:tabs>
+          <w:tab w:val="num" w:pos="5760"/>
+        </w:tabs>
+        <w:ind w:left="5760" w:hanging="360"/>
+      </w:pPr>
+      <w:rPr>
+        <w:rFonts w:ascii="Wingdings" w:hAnsi="Wingdings" w:hint="default"/>
+        <w:sz w:val="20"/>
+      </w:rPr>
+    </w:lvl>
+    <w:lvl w:ilvl="8" w:tentative="1">
+      <w:start w:val="1"/>
+      <w:numFmt w:val="bullet"/>
+      <w:lvlText w:val=""/>
+      <w:lvlJc w:val="left"/>
+      <w:pPr>
+        <w:tabs>
+          <w:tab w:val="num" w:pos="6480"/>
+        </w:tabs>
+        <w:ind w:left="6480" w:hanging="360"/>
+      </w:pPr>
+      <w:rPr>
+        <w:rFonts w:ascii="Wingdings" w:hAnsi="Wingdings" w:hint="default"/>
+        <w:sz w:val="20"/>
+      </w:rPr>
+    </w:lvl>
+  </w:abstractNum>
+  <w:abstractNum w:abstractNumId="16" w15:restartNumberingAfterBreak="0">
     <w:nsid w:val="449B3CD1"/>
     <w:multiLevelType w:val="multilevel"/>
     <w:tmpl w:val="D26C2E68"/>
@@ -4391,7 +4950,152 @@
       </w:pPr>
     </w:lvl>
   </w:abstractNum>
-  <w:abstractNum w:abstractNumId="12" w15:restartNumberingAfterBreak="0">
+  <w:abstractNum w:abstractNumId="17" w15:restartNumberingAfterBreak="0">
+    <w:nsid w:val="45A46171"/>
+    <w:multiLevelType w:val="multilevel"/>
+    <w:tmpl w:val="C8A62E3A"/>
+    <w:lvl w:ilvl="0">
+      <w:start w:val="1"/>
+      <w:numFmt w:val="bullet"/>
+      <w:lvlText w:val=""/>
+      <w:lvlJc w:val="left"/>
+      <w:pPr>
+        <w:tabs>
+          <w:tab w:val="num" w:pos="720"/>
+        </w:tabs>
+        <w:ind w:left="720" w:hanging="360"/>
+      </w:pPr>
+      <w:rPr>
+        <w:rFonts w:ascii="Symbol" w:hAnsi="Symbol" w:hint="default"/>
+        <w:sz w:val="20"/>
+      </w:rPr>
+    </w:lvl>
+    <w:lvl w:ilvl="1">
+      <w:start w:val="1"/>
+      <w:numFmt w:val="decimal"/>
+      <w:lvlText w:val="%2."/>
+      <w:lvlJc w:val="left"/>
+      <w:pPr>
+        <w:tabs>
+          <w:tab w:val="num" w:pos="1440"/>
+        </w:tabs>
+        <w:ind w:left="1440" w:hanging="360"/>
+      </w:pPr>
+    </w:lvl>
+    <w:lvl w:ilvl="2" w:tentative="1">
+      <w:start w:val="1"/>
+      <w:numFmt w:val="bullet"/>
+      <w:lvlText w:val=""/>
+      <w:lvlJc w:val="left"/>
+      <w:pPr>
+        <w:tabs>
+          <w:tab w:val="num" w:pos="2160"/>
+        </w:tabs>
+        <w:ind w:left="2160" w:hanging="360"/>
+      </w:pPr>
+      <w:rPr>
+        <w:rFonts w:ascii="Wingdings" w:hAnsi="Wingdings" w:hint="default"/>
+        <w:sz w:val="20"/>
+      </w:rPr>
+    </w:lvl>
+    <w:lvl w:ilvl="3" w:tentative="1">
+      <w:start w:val="1"/>
+      <w:numFmt w:val="bullet"/>
+      <w:lvlText w:val=""/>
+      <w:lvlJc w:val="left"/>
+      <w:pPr>
+        <w:tabs>
+          <w:tab w:val="num" w:pos="2880"/>
+        </w:tabs>
+        <w:ind w:left="2880" w:hanging="360"/>
+      </w:pPr>
+      <w:rPr>
+        <w:rFonts w:ascii="Wingdings" w:hAnsi="Wingdings" w:hint="default"/>
+        <w:sz w:val="20"/>
+      </w:rPr>
+    </w:lvl>
+    <w:lvl w:ilvl="4" w:tentative="1">
+      <w:start w:val="1"/>
+      <w:numFmt w:val="bullet"/>
+      <w:lvlText w:val=""/>
+      <w:lvlJc w:val="left"/>
+      <w:pPr>
+        <w:tabs>
+          <w:tab w:val="num" w:pos="3600"/>
+        </w:tabs>
+        <w:ind w:left="3600" w:hanging="360"/>
+      </w:pPr>
+      <w:rPr>
+        <w:rFonts w:ascii="Wingdings" w:hAnsi="Wingdings" w:hint="default"/>
+        <w:sz w:val="20"/>
+      </w:rPr>
+    </w:lvl>
+    <w:lvl w:ilvl="5" w:tentative="1">
+      <w:start w:val="1"/>
+      <w:numFmt w:val="bullet"/>
+      <w:lvlText w:val=""/>
+      <w:lvlJc w:val="left"/>
+      <w:pPr>
+        <w:tabs>
+          <w:tab w:val="num" w:pos="4320"/>
+        </w:tabs>
+        <w:ind w:left="4320" w:hanging="360"/>
+      </w:pPr>
+      <w:rPr>
+        <w:rFonts w:ascii="Wingdings" w:hAnsi="Wingdings" w:hint="default"/>
+        <w:sz w:val="20"/>
+      </w:rPr>
+    </w:lvl>
+    <w:lvl w:ilvl="6" w:tentative="1">
+      <w:start w:val="1"/>
+      <w:numFmt w:val="bullet"/>
+      <w:lvlText w:val=""/>
+      <w:lvlJc w:val="left"/>
+      <w:pPr>
+        <w:tabs>
+          <w:tab w:val="num" w:pos="5040"/>
+        </w:tabs>
+        <w:ind w:left="5040" w:hanging="360"/>
+      </w:pPr>
+      <w:rPr>
+        <w:rFonts w:ascii="Wingdings" w:hAnsi="Wingdings" w:hint="default"/>
+        <w:sz w:val="20"/>
+      </w:rPr>
+    </w:lvl>
+    <w:lvl w:ilvl="7" w:tentative="1">
+      <w:start w:val="1"/>
+      <w:numFmt w:val="bullet"/>
+      <w:lvlText w:val=""/>
+      <w:lvlJc w:val="left"/>
+      <w:pPr>
+        <w:tabs>
+          <w:tab w:val="num" w:pos="5760"/>
+        </w:tabs>
+        <w:ind w:left="5760" w:hanging="360"/>
+      </w:pPr>
+      <w:rPr>
+        <w:rFonts w:ascii="Wingdings" w:hAnsi="Wingdings" w:hint="default"/>
+        <w:sz w:val="20"/>
+      </w:rPr>
+    </w:lvl>
+    <w:lvl w:ilvl="8" w:tentative="1">
+      <w:start w:val="1"/>
+      <w:numFmt w:val="bullet"/>
+      <w:lvlText w:val=""/>
+      <w:lvlJc w:val="left"/>
+      <w:pPr>
+        <w:tabs>
+          <w:tab w:val="num" w:pos="6480"/>
+        </w:tabs>
+        <w:ind w:left="6480" w:hanging="360"/>
+      </w:pPr>
+      <w:rPr>
+        <w:rFonts w:ascii="Wingdings" w:hAnsi="Wingdings" w:hint="default"/>
+        <w:sz w:val="20"/>
+      </w:rPr>
+    </w:lvl>
+  </w:abstractNum>
+  <w:abstractNum w:abstractNumId="18" w15:restartNumberingAfterBreak="0">
     <w:nsid w:val="4B9D1BC7"/>
     <w:multiLevelType w:val="multilevel"/>
     <w:tmpl w:val="9672155E"/>
@@ -4504,7 +5208,7 @@
       </w:pPr>
     </w:lvl>
   </w:abstractNum>
-  <w:abstractNum w:abstractNumId="13" w15:restartNumberingAfterBreak="0">
+  <w:abstractNum w:abstractNumId="19" w15:restartNumberingAfterBreak="0">
     <w:nsid w:val="4CDC50B8"/>
     <w:multiLevelType w:val="multilevel"/>
     <w:tmpl w:val="F1921482"/>
@@ -4621,7 +5325,7 @@
       </w:pPr>
     </w:lvl>
   </w:abstractNum>
-  <w:abstractNum w:abstractNumId="14" w15:restartNumberingAfterBreak="0">
+  <w:abstractNum w:abstractNumId="20" w15:restartNumberingAfterBreak="0">
     <w:nsid w:val="4D382F72"/>
     <w:multiLevelType w:val="multilevel"/>
     <w:tmpl w:val="D4F076CA"/>
@@ -4734,7 +5438,7 @@
       </w:pPr>
     </w:lvl>
   </w:abstractNum>
-  <w:abstractNum w:abstractNumId="15" w15:restartNumberingAfterBreak="0">
+  <w:abstractNum w:abstractNumId="21" w15:restartNumberingAfterBreak="0">
     <w:nsid w:val="4E222B2D"/>
     <w:multiLevelType w:val="multilevel"/>
     <w:tmpl w:val="3F54C400"/>
@@ -4847,7 +5551,124 @@
       </w:pPr>
     </w:lvl>
   </w:abstractNum>
-  <w:abstractNum w:abstractNumId="16" w15:restartNumberingAfterBreak="0">
+  <w:abstractNum w:abstractNumId="22" w15:restartNumberingAfterBreak="0">
+    <w:nsid w:val="4EFD794A"/>
+    <w:multiLevelType w:val="multilevel"/>
+    <w:tmpl w:val="D9EE424A"/>
+    <w:lvl w:ilvl="0">
+      <w:start w:val="1"/>
+      <w:numFmt w:val="decimal"/>
+      <w:lvlText w:val="%1."/>
+      <w:lvlJc w:val="left"/>
+      <w:pPr>
+        <w:tabs>
+          <w:tab w:val="num" w:pos="720"/>
+        </w:tabs>
+        <w:ind w:left="720" w:hanging="360"/>
+      </w:pPr>
+    </w:lvl>
+    <w:lvl w:ilvl="1">
+      <w:start w:val="1"/>
+      <w:numFmt w:val="bullet"/>
+      <w:lvlText w:val="o"/>
+      <w:lvlJc w:val="left"/>
+      <w:pPr>
+        <w:tabs>
+          <w:tab w:val="num" w:pos="1440"/>
+        </w:tabs>
+        <w:ind w:left="1440" w:hanging="360"/>
+      </w:pPr>
+      <w:rPr>
+        <w:rFonts w:ascii="Courier New" w:hAnsi="Courier New" w:hint="default"/>
+        <w:sz w:val="20"/>
+      </w:rPr>
+    </w:lvl>
+    <w:lvl w:ilvl="2" w:tentative="1">
+      <w:start w:val="1"/>
+      <w:numFmt w:val="decimal"/>
+      <w:lvlText w:val="%3."/>
+      <w:lvlJc w:val="left"/>
+      <w:pPr>
+        <w:tabs>
+          <w:tab w:val="num" w:pos="2160"/>
+        </w:tabs>
+        <w:ind w:left="2160" w:hanging="360"/>
+      </w:pPr>
+    </w:lvl>
+    <w:lvl w:ilvl="3" w:tentative="1">
+      <w:start w:val="1"/>
+      <w:numFmt w:val="decimal"/>
+      <w:lvlText w:val="%4."/>
+      <w:lvlJc w:val="left"/>
+      <w:pPr>
+        <w:tabs>
+          <w:tab w:val="num" w:pos="2880"/>
+        </w:tabs>
+        <w:ind w:left="2880" w:hanging="360"/>
+      </w:pPr>
+    </w:lvl>
+    <w:lvl w:ilvl="4" w:tentative="1">
+      <w:start w:val="1"/>
+      <w:numFmt w:val="decimal"/>
+      <w:lvlText w:val="%5."/>
+      <w:lvlJc w:val="left"/>
+      <w:pPr>
+        <w:tabs>
+          <w:tab w:val="num" w:pos="3600"/>
+        </w:tabs>
+        <w:ind w:left="3600" w:hanging="360"/>
+      </w:pPr>
+    </w:lvl>
+    <w:lvl w:ilvl="5" w:tentative="1">
+      <w:start w:val="1"/>
+      <w:numFmt w:val="decimal"/>
+      <w:lvlText w:val="%6."/>
+      <w:lvlJc w:val="left"/>
+      <w:pPr>
+        <w:tabs>
+          <w:tab w:val="num" w:pos="4320"/>
+        </w:tabs>
+        <w:ind w:left="4320" w:hanging="360"/>
+      </w:pPr>
+    </w:lvl>
+    <w:lvl w:ilvl="6" w:tentative="1">
+      <w:start w:val="1"/>
+      <w:numFmt w:val="decimal"/>
+      <w:lvlText w:val="%7."/>
+      <w:lvlJc w:val="left"/>
+      <w:pPr>
+        <w:tabs>
+          <w:tab w:val="num" w:pos="5040"/>
+        </w:tabs>
+        <w:ind w:left="5040" w:hanging="360"/>
+      </w:pPr>
+    </w:lvl>
+    <w:lvl w:ilvl="7" w:tentative="1">
+      <w:start w:val="1"/>
+      <w:numFmt w:val="decimal"/>
+      <w:lvlText w:val="%8."/>
+      <w:lvlJc w:val="left"/>
+      <w:pPr>
+        <w:tabs>
+          <w:tab w:val="num" w:pos="5760"/>
+        </w:tabs>
+        <w:ind w:left="5760" w:hanging="360"/>
+      </w:pPr>
+    </w:lvl>
+    <w:lvl w:ilvl="8" w:tentative="1">
+      <w:start w:val="1"/>
+      <w:numFmt w:val="decimal"/>
+      <w:lvlText w:val="%9."/>
+      <w:lvlJc w:val="left"/>
+      <w:pPr>
+        <w:tabs>
+          <w:tab w:val="num" w:pos="6480"/>
+        </w:tabs>
+        <w:ind w:left="6480" w:hanging="360"/>
+      </w:pPr>
+    </w:lvl>
+  </w:abstractNum>
+  <w:abstractNum w:abstractNumId="23" w15:restartNumberingAfterBreak="0">
     <w:nsid w:val="52BD746D"/>
     <w:multiLevelType w:val="multilevel"/>
     <w:tmpl w:val="8A9604C6"/>
@@ -4964,7 +5785,7 @@
       </w:pPr>
     </w:lvl>
   </w:abstractNum>
-  <w:abstractNum w:abstractNumId="17" w15:restartNumberingAfterBreak="0">
+  <w:abstractNum w:abstractNumId="24" w15:restartNumberingAfterBreak="0">
     <w:nsid w:val="578F50FD"/>
     <w:multiLevelType w:val="multilevel"/>
     <w:tmpl w:val="8A3238C4"/>
@@ -5077,7 +5898,7 @@
       </w:pPr>
     </w:lvl>
   </w:abstractNum>
-  <w:abstractNum w:abstractNumId="18" w15:restartNumberingAfterBreak="0">
+  <w:abstractNum w:abstractNumId="25" w15:restartNumberingAfterBreak="0">
     <w:nsid w:val="579D66DD"/>
     <w:multiLevelType w:val="multilevel"/>
     <w:tmpl w:val="F5C8A4A0"/>
@@ -5226,7 +6047,7 @@
       </w:rPr>
     </w:lvl>
   </w:abstractNum>
-  <w:abstractNum w:abstractNumId="19" w15:restartNumberingAfterBreak="0">
+  <w:abstractNum w:abstractNumId="26" w15:restartNumberingAfterBreak="0">
     <w:nsid w:val="6105505D"/>
     <w:multiLevelType w:val="multilevel"/>
     <w:tmpl w:val="7DF835D6"/>
@@ -5343,7 +6164,7 @@
       </w:pPr>
     </w:lvl>
   </w:abstractNum>
-  <w:abstractNum w:abstractNumId="20" w15:restartNumberingAfterBreak="0">
+  <w:abstractNum w:abstractNumId="27" w15:restartNumberingAfterBreak="0">
     <w:nsid w:val="6AF33D7A"/>
     <w:multiLevelType w:val="multilevel"/>
     <w:tmpl w:val="570CD444"/>
@@ -5492,7 +6313,7 @@
       </w:rPr>
     </w:lvl>
   </w:abstractNum>
-  <w:abstractNum w:abstractNumId="21" w15:restartNumberingAfterBreak="0">
+  <w:abstractNum w:abstractNumId="28" w15:restartNumberingAfterBreak="0">
     <w:nsid w:val="6B707F43"/>
     <w:multiLevelType w:val="multilevel"/>
     <w:tmpl w:val="0B5E7438"/>
@@ -5605,7 +6426,7 @@
       </w:pPr>
     </w:lvl>
   </w:abstractNum>
-  <w:abstractNum w:abstractNumId="22" w15:restartNumberingAfterBreak="0">
+  <w:abstractNum w:abstractNumId="29" w15:restartNumberingAfterBreak="0">
     <w:nsid w:val="748E3ABF"/>
     <w:multiLevelType w:val="multilevel"/>
     <w:tmpl w:val="DBAC0E96"/>
@@ -5722,7 +6543,7 @@
       </w:pPr>
     </w:lvl>
   </w:abstractNum>
-  <w:abstractNum w:abstractNumId="23" w15:restartNumberingAfterBreak="0">
+  <w:abstractNum w:abstractNumId="30" w15:restartNumberingAfterBreak="0">
     <w:nsid w:val="7D336D38"/>
     <w:multiLevelType w:val="multilevel"/>
     <w:tmpl w:val="7FD6CC4E"/>
@@ -5840,13 +6661,13 @@
     </w:lvl>
   </w:abstractNum>
   <w:num w:numId="1" w16cid:durableId="15153810">
+    <w:abstractNumId w:val="12"/>
+  </w:num>
+  <w:num w:numId="2" w16cid:durableId="1754162990">
     <w:abstractNumId w:val="8"/>
   </w:num>
-  <w:num w:numId="2" w16cid:durableId="1754162990">
-    <w:abstractNumId w:val="6"/>
-  </w:num>
   <w:num w:numId="3" w16cid:durableId="357976735">
-    <w:abstractNumId w:val="3"/>
+    <w:abstractNumId w:val="4"/>
   </w:num>
   <w:num w:numId="4" w16cid:durableId="997659785">
     <w:abstractNumId w:val="0"/>
@@ -5855,61 +6676,82 @@
     <w:abstractNumId w:val="1"/>
   </w:num>
   <w:num w:numId="6" w16cid:durableId="1500998344">
-    <w:abstractNumId w:val="15"/>
+    <w:abstractNumId w:val="21"/>
   </w:num>
   <w:num w:numId="7" w16cid:durableId="1465661610">
-    <w:abstractNumId w:val="14"/>
+    <w:abstractNumId w:val="20"/>
   </w:num>
   <w:num w:numId="8" w16cid:durableId="125205197">
-    <w:abstractNumId w:val="5"/>
+    <w:abstractNumId w:val="7"/>
   </w:num>
   <w:num w:numId="9" w16cid:durableId="1743671654">
-    <w:abstractNumId w:val="20"/>
+    <w:abstractNumId w:val="27"/>
   </w:num>
   <w:num w:numId="10" w16cid:durableId="1789204305">
     <w:abstractNumId w:val="2"/>
   </w:num>
   <w:num w:numId="11" w16cid:durableId="2143882779">
-    <w:abstractNumId w:val="21"/>
+    <w:abstractNumId w:val="28"/>
   </w:num>
   <w:num w:numId="12" w16cid:durableId="383524444">
-    <w:abstractNumId w:val="12"/>
+    <w:abstractNumId w:val="18"/>
   </w:num>
   <w:num w:numId="13" w16cid:durableId="101461940">
+    <w:abstractNumId w:val="29"/>
+  </w:num>
+  <w:num w:numId="14" w16cid:durableId="219176230">
+    <w:abstractNumId w:val="19"/>
+  </w:num>
+  <w:num w:numId="15" w16cid:durableId="827600622">
+    <w:abstractNumId w:val="23"/>
+  </w:num>
+  <w:num w:numId="16" w16cid:durableId="562059895">
+    <w:abstractNumId w:val="5"/>
+  </w:num>
+  <w:num w:numId="17" w16cid:durableId="2078898508">
+    <w:abstractNumId w:val="25"/>
+  </w:num>
+  <w:num w:numId="18" w16cid:durableId="619728578">
+    <w:abstractNumId w:val="24"/>
+  </w:num>
+  <w:num w:numId="19" w16cid:durableId="2048211164">
+    <w:abstractNumId w:val="14"/>
+  </w:num>
+  <w:num w:numId="20" w16cid:durableId="857080884">
+    <w:abstractNumId w:val="30"/>
+  </w:num>
+  <w:num w:numId="21" w16cid:durableId="1748458733">
+    <w:abstractNumId w:val="26"/>
+  </w:num>
+  <w:num w:numId="22" w16cid:durableId="1436512544">
+    <w:abstractNumId w:val="16"/>
+  </w:num>
+  <w:num w:numId="23" w16cid:durableId="1236478028">
+    <w:abstractNumId w:val="13"/>
+  </w:num>
+  <w:num w:numId="24" w16cid:durableId="658919874">
+    <w:abstractNumId w:val="10"/>
+  </w:num>
+  <w:num w:numId="25" w16cid:durableId="1138302585">
+    <w:abstractNumId w:val="3"/>
+  </w:num>
+  <w:num w:numId="26" w16cid:durableId="834421044">
+    <w:abstractNumId w:val="9"/>
+  </w:num>
+  <w:num w:numId="27" w16cid:durableId="1061101767">
+    <w:abstractNumId w:val="11"/>
+  </w:num>
+  <w:num w:numId="28" w16cid:durableId="1057629221">
+    <w:abstractNumId w:val="6"/>
+  </w:num>
+  <w:num w:numId="29" w16cid:durableId="871307773">
     <w:abstractNumId w:val="22"/>
   </w:num>
-  <w:num w:numId="14" w16cid:durableId="219176230">
-    <w:abstractNumId w:val="13"/>
-  </w:num>
-  <w:num w:numId="15" w16cid:durableId="827600622">
-    <w:abstractNumId w:val="16"/>
-  </w:num>
-  <w:num w:numId="16" w16cid:durableId="562059895">
-    <w:abstractNumId w:val="4"/>
-  </w:num>
-  <w:num w:numId="17" w16cid:durableId="2078898508">
-    <w:abstractNumId w:val="18"/>
-  </w:num>
-  <w:num w:numId="18" w16cid:durableId="619728578">
+  <w:num w:numId="30" w16cid:durableId="1592884857">
     <w:abstractNumId w:val="17"/>
   </w:num>
-  <w:num w:numId="19" w16cid:durableId="2048211164">
-    <w:abstractNumId w:val="10"/>
-  </w:num>
-  <w:num w:numId="20" w16cid:durableId="857080884">
-    <w:abstractNumId w:val="23"/>
-  </w:num>
-  <w:num w:numId="21" w16cid:durableId="1748458733">
-    <w:abstractNumId w:val="19"/>
-  </w:num>
-  <w:num w:numId="22" w16cid:durableId="1436512544">
-    <w:abstractNumId w:val="11"/>
-  </w:num>
-  <w:num w:numId="23" w16cid:durableId="1236478028">
-    <w:abstractNumId w:val="9"/>
-  </w:num>
-  <w:num w:numId="24" w16cid:durableId="658919874">
-    <w:abstractNumId w:val="7"/>
+  <w:num w:numId="31" w16cid:durableId="1084644876">
+    <w:abstractNumId w:val="15"/>
   </w:num>
 </w:numbering>
 </file>
@@ -6852,6 +7694,18 @@
       <w:shd w:val="clear" w:color="auto" w:fill="E1DFDD"/>
     </w:rPr>
   </w:style>
+  <w:style w:type="character" w:styleId="Hipervnculovisitado">
+    <w:name w:val="FollowedHyperlink"/>
+    <w:basedOn w:val="Fuentedeprrafopredeter"/>
+    <w:uiPriority w:val="99"/>
+    <w:semiHidden/>
+    <w:unhideWhenUsed/>
+    <w:rsid w:val="00230DB6"/>
+    <w:rPr>
+      <w:color w:val="954F72" w:themeColor="followedHyperlink"/>
+      <w:u w:val="single"/>
+    </w:rPr>
+  </w:style>
 </w:styles>
 </file>
 

</xml_diff>